<commit_message>
Redraw the fishbone diagram (Figure 4.2)
The old one had a cause label running into the Technology bone, small
text and a cramped effect box. Same causes, now with larger text and its
title matching the List of Figures. Updates the full paper's list page
numbers that moved by one, and the Chapter 4 copy and PDF.

Co-Authored-By: Claude Opus 5.5 <noreply@anthropic.com>
Claude-Session: https://claude.ai/code/session_01MN4gTfErSULVtFJnUJ6zoR
</commit_message>
<xml_diff>
--- a/docs/paper/Auditrix - Chapter 4.docx
+++ b/docs/paper/Auditrix - Chapter 4.docx
@@ -811,7 +811,7 @@
         </w:rPr>
         <w:drawing>
           <wp:inline distT="0" distB="0" distL="0" distR="0" wp14:anchorId="0B8AADDB" wp14:editId="623C5CC2">
-            <wp:extent cx="5486400" cy="3099816"/>
+            <wp:extent cx="5486400" cy="2962656"/>
             <wp:effectExtent l="0" t="0" r="0" b="0"/>
             <wp:docPr id="101" name="Figure 4.2"/>
             <wp:cNvGraphicFramePr>
@@ -833,7 +833,7 @@
                   <pic:spPr>
                     <a:xfrm>
                       <a:off x="0" y="0"/>
-                      <a:ext cx="5486400" cy="3099816"/>
+                      <a:ext cx="5486400" cy="2962656"/>
                     </a:xfrm>
                     <a:prstGeom prst="rect">
                       <a:avLst/>

</xml_diff>

<commit_message>
Say the ISO/IEC 25010 evaluation uses a paper questionnaire
The group will use a printed questionnaire, not Google Forms: updated in
Chapter 3 (Evaluation Phase, Survey) and Chapter 4 (SOP No. 4). Also fixes
the Figure 4.2 sentence in the group's Chapter 4 copy and carries their
comma edits in the Figure 4.6 paragraph into the full paper.

Co-Authored-By: Claude Opus 5.5 <noreply@anthropic.com>
Claude-Session: https://claude.ai/code/session_01MN4gTfErSULVtFJnUJ6zoR
</commit_message>
<xml_diff>
--- a/docs/paper/Auditrix - Chapter 4.docx
+++ b/docs/paper/Auditrix - Chapter 4.docx
@@ -23,7 +23,6 @@
           <w:sz w:val="24"/>
           <w:szCs w:val="24"/>
         </w:rPr>
-        <w:lastRenderedPageBreak/>
         <w:t>Chapter 4</w:t>
       </w:r>
       <w:r>
@@ -306,6 +305,7 @@
                 <w:sz w:val="24"/>
                 <w:szCs w:val="24"/>
               </w:rPr>
+              <w:lastRenderedPageBreak/>
               <w:t>[INPUT]</w:t>
             </w:r>
           </w:p>
@@ -663,7 +663,6 @@
           <w:sz w:val="24"/>
           <w:szCs w:val="24"/>
         </w:rPr>
-        <w:lastRenderedPageBreak/>
         <w:t>Problems Encountered in the Current System (SOP No. 2)</w:t>
       </w:r>
       <w:r>
@@ -753,7 +752,16 @@
           <w:sz w:val="24"/>
           <w:szCs w:val="24"/>
         </w:rPr>
-        <w:t>While the MIS reliably stores student grades and registration records, it has no built-in logic to cross-reference a student's completed subjects against the official curriculum structure. This places the entire burden of compliance verification on the Chairperson's manual review rather than on the system itself, leaving no automated safeguard between data entry and eligibility determination.</w:t>
+        <w:t xml:space="preserve">While the MIS reliably stores student grades and registration </w:t>
+      </w:r>
+      <w:r>
+        <w:rPr>
+          <w:rFonts w:ascii="Courier New" w:hAnsi="Courier New" w:cs="Courier New"/>
+          <w:sz w:val="24"/>
+          <w:szCs w:val="24"/>
+        </w:rPr>
+        <w:lastRenderedPageBreak/>
+        <w:t>records, it has no built-in logic to cross-reference a student's completed subjects against the official curriculum structure. This places the entire burden of compliance verification on the Chairperson's manual review rather than on the system itself, leaving no automated safeguard between data entry and eligibility determination.</w:t>
       </w:r>
     </w:p>
     <w:p>
@@ -783,16 +791,7 @@
           <w:sz w:val="24"/>
           <w:szCs w:val="24"/>
         </w:rPr>
-        <w:t xml:space="preserve">Although students can view their own academic </w:t>
-      </w:r>
-      <w:r>
-        <w:rPr>
-          <w:rFonts w:ascii="Courier New" w:hAnsi="Courier New" w:cs="Courier New"/>
-          <w:sz w:val="24"/>
-          <w:szCs w:val="24"/>
-        </w:rPr>
-        <w:lastRenderedPageBreak/>
-        <w:t>records through the MIS, the system does not proactively alert them when they are ineligible for a subject. Students may therefore unknowingly attempt to enroll in courses without having completed the necessary prerequisites, adding to the volume of cases the Chairperson must catch downstream.</w:t>
+        <w:t>Although students can view their own academic records through the MIS, the system does not proactively alert them when they are ineligible for a subject. Students may therefore unknowingly attempt to enroll in courses without having completed the necessary prerequisites, adding to the volume of cases the Chairperson must catch downstream.</w:t>
       </w:r>
     </w:p>
     <w:p>
@@ -800,20 +799,18 @@
         <w:spacing w:line="240" w:lineRule="auto"/>
         <w:jc w:val="center"/>
         <w:rPr>
-          <w:rFonts w:ascii="Courier New" w:hAnsi="Courier New" w:cs="Courier New"/>
-          <w:sz w:val="24"/>
-          <w:szCs w:val="24"/>
-        </w:rPr>
-      </w:pPr>
-      <w:r>
-        <w:rPr>
           <w:noProof/>
         </w:rPr>
+      </w:pPr>
+      <w:r>
+        <w:rPr>
+          <w:noProof/>
+        </w:rPr>
         <w:drawing>
-          <wp:inline distT="0" distB="0" distL="0" distR="0" wp14:anchorId="0B8AADDB" wp14:editId="623C5CC2">
-            <wp:extent cx="5486400" cy="2962656"/>
-            <wp:effectExtent l="0" t="0" r="0" b="0"/>
-            <wp:docPr id="101" name="Figure 4.2"/>
+          <wp:inline distT="0" distB="0" distL="0" distR="0" wp14:anchorId="25B864CF" wp14:editId="671E09C0">
+            <wp:extent cx="5487670" cy="2963545"/>
+            <wp:effectExtent l="0" t="0" r="0" b="8255"/>
+            <wp:docPr id="438537032" name="Picture 8"/>
             <wp:cNvGraphicFramePr>
               <a:graphicFrameLocks xmlns:a="http://schemas.openxmlformats.org/drawingml/2006/main" noChangeAspect="1"/>
             </wp:cNvGraphicFramePr>
@@ -821,23 +818,36 @@
               <a:graphicData uri="http://schemas.openxmlformats.org/drawingml/2006/picture">
                 <pic:pic xmlns:pic="http://schemas.openxmlformats.org/drawingml/2006/picture">
                   <pic:nvPicPr>
-                    <pic:cNvPr id="101" name="Figure 4.2"/>
-                    <pic:cNvPicPr/>
+                    <pic:cNvPr id="0" name="Picture 6"/>
+                    <pic:cNvPicPr>
+                      <a:picLocks noChangeAspect="1" noChangeArrowheads="1"/>
+                    </pic:cNvPicPr>
                   </pic:nvPicPr>
                   <pic:blipFill>
-                    <a:blip r:embed="rId20"/>
+                    <a:blip r:embed="rId9" cstate="print">
+                      <a:extLst>
+                        <a:ext uri="{28A0092B-C50C-407E-A947-70E740481C1C}">
+                          <a14:useLocalDpi xmlns:a14="http://schemas.microsoft.com/office/drawing/2010/main" val="0"/>
+                        </a:ext>
+                      </a:extLst>
+                    </a:blip>
+                    <a:srcRect/>
                     <a:stretch>
                       <a:fillRect/>
                     </a:stretch>
                   </pic:blipFill>
-                  <pic:spPr>
+                  <pic:spPr bwMode="auto">
                     <a:xfrm>
                       <a:off x="0" y="0"/>
-                      <a:ext cx="5486400" cy="2962656"/>
+                      <a:ext cx="5487670" cy="2963545"/>
                     </a:xfrm>
                     <a:prstGeom prst="rect">
                       <a:avLst/>
                     </a:prstGeom>
+                    <a:noFill/>
+                    <a:ln>
+                      <a:noFill/>
+                    </a:ln>
                   </pic:spPr>
                 </pic:pic>
               </a:graphicData>
@@ -865,6 +875,7 @@
           <w:sz w:val="24"/>
           <w:szCs w:val="24"/>
         </w:rPr>
+        <w:lastRenderedPageBreak/>
         <w:t xml:space="preserve">Figure 4.2 </w:t>
       </w:r>
       <w:r>
@@ -873,16 +884,7 @@
           <w:sz w:val="24"/>
           <w:szCs w:val="24"/>
         </w:rPr>
-        <w:t xml:space="preserve">traces the three problems above to eight root causes, grouped into four categories: People (Chairperson workload and human error; limited student awareness), Technology (the MIS's lack of automated audit logic; no proactive eligibility alerts), Process (reliance on paper-based/legacy cross-referencing; no structural block at enrollment), and Policy/Environment (verification enforced only at graduation audit; a compressed timeline that limits review depth) — all converging on the </w:t>
-      </w:r>
-      <w:r>
-        <w:rPr>
-          <w:rFonts w:ascii="Courier New" w:hAnsi="Courier New" w:cs="Courier New"/>
-          <w:sz w:val="24"/>
-          <w:szCs w:val="24"/>
-        </w:rPr>
-        <w:lastRenderedPageBreak/>
-        <w:t>same effect: prerequisite violations that go undetected until the final graduation audit.</w:t>
+        <w:t xml:space="preserve">traces the three problems above to eight root causes, grouped into four categories: People (Chairperson workload and human error; limited student awareness), Technology (the MIS's lack of automated audit logic; no proactive eligibility alerts), Process (reliance on paper-based/legacy cross-referencing; no structural block at enrollment), and Policy/Environment (verification enforced only at graduation audit; a compressed timeline that limits review depth) — all converging on the same effect: prerequisite violations that go undetected until the final graduation audit.</w:t>
       </w:r>
       <w:r>
         <w:fldChar w:fldCharType="begin"/>
@@ -944,25 +946,32 @@
           <w:sz w:val="24"/>
           <w:szCs w:val="24"/>
         </w:rPr>
-        <w:t xml:space="preserve">To address the gaps identified above, the researchers designed and developed </w:t>
-      </w:r>
-      <w:r>
-        <w:rPr>
-          <w:rFonts w:ascii="Courier New" w:hAnsi="Courier New" w:cs="Courier New"/>
-          <w:b/>
-          <w:bCs/>
-          <w:sz w:val="24"/>
-          <w:szCs w:val="24"/>
-        </w:rPr>
-        <w:t>Auditrix</w:t>
-      </w:r>
-      <w:r>
-        <w:rPr>
-          <w:rFonts w:ascii="Courier New" w:hAnsi="Courier New" w:cs="Courier New"/>
-          <w:sz w:val="24"/>
-          <w:szCs w:val="24"/>
-        </w:rPr>
-        <w:t>, a web-based curriculum audit system for Kalinga State University that automatically checks every subject a student has taken against the prerequisites, co-requisites and year-standing requirements of the student's curriculum. It was built for any college and program, and was tested with the BSCpE, BSIT and BSCE programs of the CEIT. The system was built using the Iterative and Incremental Development (IID) model, allowing the Audit Engine's logic to be reviewed with the adviser early and refined across three functional increments: (1) curriculum, student and grade records with a basic audit; (2) curriculum versions, imports, student movements and the redesigned interface; and (3) the term-based audit, automatic year levels, and the regular and irregular classification.</w:t>
+        <w:t xml:space="preserve">To address the gaps identified above, the researchers designed and </w:t>
+      </w:r>
+      <w:r>
+        <w:rPr>
+          <w:rFonts w:ascii="Courier New" w:hAnsi="Courier New" w:cs="Courier New"/>
+          <w:sz w:val="24"/>
+          <w:szCs w:val="24"/>
+        </w:rPr>
+        <w:t>developed Auditrix,</w:t>
+      </w:r>
+      <w:r>
+        <w:rPr>
+          <w:rFonts w:ascii="Courier New" w:hAnsi="Courier New" w:cs="Courier New"/>
+          <w:sz w:val="24"/>
+          <w:szCs w:val="24"/>
+        </w:rPr>
+        <w:t xml:space="preserve"> a web-based curriculum audit system for Kalinga State University that automatically checks every subject a student has taken against the prerequisites, co-requisites and year-standing requirements of the student's curriculum. It was built for any college and program, and was tested with the BSCpE, BSIT and BSCE programs of the CEIT. The system was built using the Iterative and Incremental Development (IID) model, allowing the Audit Engine's logic to be reviewed with the adviser early and refined across three functional increments: (1) curriculum, student and grade </w:t>
+      </w:r>
+      <w:r>
+        <w:rPr>
+          <w:rFonts w:ascii="Courier New" w:hAnsi="Courier New" w:cs="Courier New"/>
+          <w:sz w:val="24"/>
+          <w:szCs w:val="24"/>
+        </w:rPr>
+        <w:lastRenderedPageBreak/>
+        <w:t>records with a basic audit; (2) curriculum versions, imports, student movements and the redesigned interface; and (3) the term-based audit, automatic year levels, and the regular and irregular classification.</w:t>
       </w:r>
     </w:p>
     <w:p>
@@ -992,16 +1001,7 @@
           <w:sz w:val="24"/>
           <w:szCs w:val="24"/>
         </w:rPr>
-        <w:t xml:space="preserve"> The system runs on Next.js 16 (App Router and server actions) with React 19 and TypeScript, styled with Tailwind CSS 4 in a KSU green theme designed for responsiveness across desktop, tablet, and mobile. Supabase </w:t>
-      </w:r>
-      <w:r>
-        <w:rPr>
-          <w:rFonts w:ascii="Courier New" w:hAnsi="Courier New" w:cs="Courier New"/>
-          <w:sz w:val="24"/>
-          <w:szCs w:val="24"/>
-        </w:rPr>
-        <w:lastRenderedPageBreak/>
-        <w:t>serves as the backend-as-a-service, hosting the PostgreSQL database, authentication, and Row-Level Security (RLS) policies; the database schema is built step by step by 27 migration scripts. Curricula are exported to PDF with @react-pdf/renderer. Interface flows were prototyped as high-fidelity mockups in Figma prior to implementation.</w:t>
+        <w:t xml:space="preserve"> The system runs on Next.js 16 (App Router and server actions) with React 19 and TypeScript, styled with Tailwind CSS 4 in a KSU green theme designed for responsiveness across desktop, tablet, and mobile. Supabase serves as the backend-as-a-service, hosting the PostgreSQL database, authentication, and Row-Level Security (RLS) policies; the database schema is built step by step by 27 migration scripts. Curricula are exported to PDF with @react-pdf/renderer. Interface flows were prototyped as high-fidelity mockups in Figma prior to implementation.</w:t>
       </w:r>
     </w:p>
     <w:p>
@@ -3641,7 +3641,7 @@
                     <pic:cNvPicPr/>
                   </pic:nvPicPr>
                   <pic:blipFill>
-                    <a:blip r:embed="rId25"/>
+                    <a:blip r:embed="rId14"/>
                     <a:stretch>
                       <a:fillRect/>
                     </a:stretch>
@@ -3725,9 +3725,9 @@
           <w:noProof/>
         </w:rPr>
         <w:drawing>
-          <wp:inline distT="0" distB="0" distL="0" distR="0" wp14:anchorId="053466D8" wp14:editId="465A2FFB">
-            <wp:extent cx="5486400" cy="4937760"/>
-            <wp:effectExtent l="0" t="0" r="0" b="0"/>
+          <wp:inline distT="0" distB="0" distL="0" distR="0" wp14:anchorId="053466D8" wp14:editId="3906EA75">
+            <wp:extent cx="5579533" cy="5155157"/>
+            <wp:effectExtent l="0" t="0" r="2540" b="7620"/>
             <wp:docPr id="7000002" name="Figure 4.5"/>
             <wp:cNvGraphicFramePr>
               <a:graphicFrameLocks xmlns:a="http://schemas.openxmlformats.org/drawingml/2006/main" noChangeAspect="1"/>
@@ -3740,7 +3740,7 @@
                     <pic:cNvPicPr/>
                   </pic:nvPicPr>
                   <pic:blipFill>
-                    <a:blip r:embed="rId26"/>
+                    <a:blip r:embed="rId15"/>
                     <a:stretch>
                       <a:fillRect/>
                     </a:stretch>
@@ -3748,7 +3748,7 @@
                   <pic:spPr>
                     <a:xfrm>
                       <a:off x="0" y="0"/>
-                      <a:ext cx="5486400" cy="4937760"/>
+                      <a:ext cx="5629740" cy="5201545"/>
                     </a:xfrm>
                     <a:prstGeom prst="rect">
                       <a:avLst/>
@@ -3780,6 +3780,7 @@
           <w:sz w:val="24"/>
           <w:szCs w:val="24"/>
         </w:rPr>
+        <w:lastRenderedPageBreak/>
         <w:t>Figure 4.5</w:t>
       </w:r>
       <w:r>
@@ -3788,16 +3789,7 @@
           <w:sz w:val="24"/>
           <w:szCs w:val="24"/>
         </w:rPr>
-        <w:t xml:space="preserve"> traces the audit of a single subject. After the chairperson saves a term's grades, which are first checked </w:t>
-      </w:r>
-      <w:r>
-        <w:rPr>
-          <w:rFonts w:ascii="Courier New" w:hAnsi="Courier New" w:cs="Courier New"/>
-          <w:sz w:val="24"/>
-          <w:szCs w:val="24"/>
-        </w:rPr>
-        <w:lastRenderedPageBreak/>
-        <w:t>for valid KSU grade values and for conflicts with a later recorded term, the audit engine looks at the student's record for each subject. A subject with no record is Available if its requirements have been passed, Pending if it is waiting for a requirement's final grade, and Unavailable otherwise, with the missing requirements listed. A subject that is in progress or INC is Pending. For a graded subject, the engine checks whether every requirement was met before the term it was taken: a prerequisite passed in an earlier term, the co-requisite taken in the same term, and the year standing at that time. If not, the subject is a Violation with the reason given, earns no credit and must be retaken; if the year standing cannot be confirmed from the grades, it is marked "Year standing: please verify". If the requirements were met, a passed subject whose co-requisite was also passed is Completed and counts toward units and year level, while a failed one is Available for retaking. The results then update the student's year level, regular or irregular status, and the dashboard.</w:t>
+        <w:t xml:space="preserve"> traces the audit of a single subject. After the chairperson saves a term's grades, which are first checked for valid KSU grade values and for conflicts with a later recorded term, the audit engine looks at the student's record for each subject. A subject with no record is Available if its requirements have been passed, Pending if it is waiting for a requirement's final grade, and Unavailable otherwise, with the missing requirements listed. A subject that is in progress or INC is Pending. For a graded subject, the engine checks whether every requirement was met before the term it was taken: a prerequisite passed in an earlier term, the co-requisite taken in the same term, and the year standing at that time. If not, the subject is a Violation with the reason given, earns no credit and must be retaken; if the year standing cannot be confirmed from the grades, it is marked "Year standing: please verify". If the requirements were met, a passed subject whose co-requisite was also passed is Completed and counts toward units and year level, while a failed one is Available for retaking. The results then update the student's year level, regular or irregular status, and the dashboard.</w:t>
       </w:r>
       <w:r>
         <w:fldChar w:fldCharType="begin"/>
@@ -3840,7 +3832,7 @@
                     <pic:cNvPicPr/>
                   </pic:nvPicPr>
                   <pic:blipFill>
-                    <a:blip r:embed="rId27"/>
+                    <a:blip r:embed="rId16"/>
                     <a:stretch>
                       <a:fillRect/>
                     </a:stretch>
@@ -3888,7 +3880,55 @@
           <w:sz w:val="24"/>
           <w:szCs w:val="24"/>
         </w:rPr>
-        <w:t xml:space="preserve"> outlines the system's navigation. From Login (and the password change required at a chairperson's first login), users land on the Dashboard. A Program Chairperson's menu leads to Students, Register Student, Shift In a Student, Manage Curriculum and Account Settings; from Students, each student's audit page opens the Edit Student, Grade Logbook, Transfer / Shift and Enter Grades pages. A Dean's menu leads to the Dashboard, where the current semester is set, Create Program, Reassign Chairperson and Account Settings.</w:t>
+        <w:t xml:space="preserve"> outlines the system's navigation. From Login (and the password change required at a chairperson's first login), users land on the Dashboard. A Program Chairperson's menu leads to Students, Register Student, Shift In a Student, Manage Curriculum</w:t>
+      </w:r>
+      <w:r>
+        <w:rPr>
+          <w:rFonts w:ascii="Courier New" w:hAnsi="Courier New" w:cs="Courier New"/>
+          <w:sz w:val="24"/>
+          <w:szCs w:val="24"/>
+        </w:rPr>
+        <w:t>,</w:t>
+      </w:r>
+      <w:r>
+        <w:rPr>
+          <w:rFonts w:ascii="Courier New" w:hAnsi="Courier New" w:cs="Courier New"/>
+          <w:sz w:val="24"/>
+          <w:szCs w:val="24"/>
+        </w:rPr>
+        <w:t xml:space="preserve"> and Account Settings; from Students, each student's audit page opens the Edit Student, Grade Logbook, Transfer / Shift</w:t>
+      </w:r>
+      <w:r>
+        <w:rPr>
+          <w:rFonts w:ascii="Courier New" w:hAnsi="Courier New" w:cs="Courier New"/>
+          <w:sz w:val="24"/>
+          <w:szCs w:val="24"/>
+        </w:rPr>
+        <w:t>,</w:t>
+      </w:r>
+      <w:r>
+        <w:rPr>
+          <w:rFonts w:ascii="Courier New" w:hAnsi="Courier New" w:cs="Courier New"/>
+          <w:sz w:val="24"/>
+          <w:szCs w:val="24"/>
+        </w:rPr>
+        <w:t xml:space="preserve"> and Enter Grades pages. A Dean's menu leads to the Dashboard, where the current semester is set, Create Program, Reassign Chairperson</w:t>
+      </w:r>
+      <w:r>
+        <w:rPr>
+          <w:rFonts w:ascii="Courier New" w:hAnsi="Courier New" w:cs="Courier New"/>
+          <w:sz w:val="24"/>
+          <w:szCs w:val="24"/>
+        </w:rPr>
+        <w:t>,</w:t>
+      </w:r>
+      <w:r>
+        <w:rPr>
+          <w:rFonts w:ascii="Courier New" w:hAnsi="Courier New" w:cs="Courier New"/>
+          <w:sz w:val="24"/>
+          <w:szCs w:val="24"/>
+        </w:rPr>
+        <w:t xml:space="preserve"> and Account Settings.</w:t>
       </w:r>
       <w:r>
         <w:fldChar w:fldCharType="begin"/>
@@ -4019,7 +4059,7 @@
                     <pic:cNvPicPr/>
                   </pic:nvPicPr>
                   <pic:blipFill>
-                    <a:blip r:embed="rId28"/>
+                    <a:blip r:embed="rId17"/>
                     <a:stretch>
                       <a:fillRect/>
                     </a:stretch>
@@ -4104,7 +4144,7 @@
                     <pic:cNvPicPr/>
                   </pic:nvPicPr>
                   <pic:blipFill>
-                    <a:blip r:embed="rId29"/>
+                    <a:blip r:embed="rId18"/>
                     <a:stretch>
                       <a:fillRect/>
                     </a:stretch>
@@ -4188,7 +4228,7 @@
                     <pic:cNvPicPr/>
                   </pic:nvPicPr>
                   <pic:blipFill>
-                    <a:blip r:embed="rId30"/>
+                    <a:blip r:embed="rId19"/>
                     <a:stretch>
                       <a:fillRect/>
                     </a:stretch>
@@ -4273,7 +4313,7 @@
                     <pic:cNvPicPr/>
                   </pic:nvPicPr>
                   <pic:blipFill>
-                    <a:blip r:embed="rId31"/>
+                    <a:blip r:embed="rId20"/>
                     <a:stretch>
                       <a:fillRect/>
                     </a:stretch>
@@ -4357,7 +4397,7 @@
                     <pic:cNvPicPr/>
                   </pic:nvPicPr>
                   <pic:blipFill>
-                    <a:blip r:embed="rId32"/>
+                    <a:blip r:embed="rId21"/>
                     <a:stretch>
                       <a:fillRect/>
                     </a:stretch>
@@ -4442,7 +4482,7 @@
                     <pic:cNvPicPr/>
                   </pic:nvPicPr>
                   <pic:blipFill>
-                    <a:blip r:embed="rId33"/>
+                    <a:blip r:embed="rId22"/>
                     <a:stretch>
                       <a:fillRect/>
                     </a:stretch>
@@ -4526,7 +4566,7 @@
                     <pic:cNvPicPr/>
                   </pic:nvPicPr>
                   <pic:blipFill>
-                    <a:blip r:embed="rId34"/>
+                    <a:blip r:embed="rId23"/>
                     <a:stretch>
                       <a:fillRect/>
                     </a:stretch>
@@ -4611,7 +4651,7 @@
                     <pic:cNvPicPr/>
                   </pic:nvPicPr>
                   <pic:blipFill>
-                    <a:blip r:embed="rId35"/>
+                    <a:blip r:embed="rId24"/>
                     <a:stretch>
                       <a:fillRect/>
                     </a:stretch>
@@ -4695,7 +4735,7 @@
                     <pic:cNvPicPr/>
                   </pic:nvPicPr>
                   <pic:blipFill>
-                    <a:blip r:embed="rId36"/>
+                    <a:blip r:embed="rId25"/>
                     <a:stretch>
                       <a:fillRect/>
                     </a:stretch>
@@ -4780,7 +4820,7 @@
                     <pic:cNvPicPr/>
                   </pic:nvPicPr>
                   <pic:blipFill>
-                    <a:blip r:embed="rId37"/>
+                    <a:blip r:embed="rId26"/>
                     <a:stretch>
                       <a:fillRect/>
                     </a:stretch>
@@ -4814,7 +4854,6 @@
           <w:szCs w:val="24"/>
         </w:rPr>
       </w:pPr>
-      <w:commentRangeStart w:id="1"/>
       <w:r>
         <w:rPr>
           <w:rFonts w:ascii="Courier New" w:hAnsi="Courier New" w:cs="Courier New"/>
@@ -4824,18 +4863,6 @@
           <w:szCs w:val="24"/>
         </w:rPr>
         <w:t>Figure 4.7k. Create Program — new chairperson account with a temporary password</w:t>
-      </w:r>
-      <w:commentRangeEnd w:id="1"/>
-      <w:r>
-        <w:rPr>
-          <w:rStyle w:val="CommentReference"/>
-          <w:rFonts w:ascii="Courier New" w:hAnsi="Courier New" w:cs="Courier New"/>
-          <w:b/>
-          <w:bCs/>
-          <w:sz w:val="24"/>
-          <w:szCs w:val="24"/>
-        </w:rPr>
-        <w:commentReference w:id="1"/>
       </w:r>
       <w:r>
         <w:fldChar w:fldCharType="begin"/>
@@ -4877,7 +4904,7 @@
                     <pic:cNvPicPr/>
                   </pic:nvPicPr>
                   <pic:blipFill>
-                    <a:blip r:embed="rId38"/>
+                    <a:blip r:embed="rId27"/>
                     <a:stretch>
                       <a:fillRect/>
                     </a:stretch>
@@ -4911,7 +4938,6 @@
           <w:szCs w:val="24"/>
         </w:rPr>
       </w:pPr>
-      <w:commentRangeStart w:id="2"/>
       <w:r>
         <w:rPr>
           <w:rFonts w:ascii="Courier New" w:hAnsi="Courier New" w:cs="Courier New"/>
@@ -4922,18 +4948,6 @@
         </w:rPr>
         <w:lastRenderedPageBreak/>
         <w:t>Figure 4.7l. First Log In — password change with the rules checklist</w:t>
-      </w:r>
-      <w:commentRangeEnd w:id="2"/>
-      <w:r>
-        <w:rPr>
-          <w:rStyle w:val="CommentReference"/>
-          <w:rFonts w:ascii="Courier New" w:hAnsi="Courier New" w:cs="Courier New"/>
-          <w:b/>
-          <w:bCs/>
-          <w:sz w:val="24"/>
-          <w:szCs w:val="24"/>
-        </w:rPr>
-        <w:commentReference w:id="2"/>
       </w:r>
       <w:r>
         <w:fldChar w:fldCharType="begin"/>
@@ -4975,7 +4989,7 @@
                     <pic:cNvPicPr/>
                   </pic:nvPicPr>
                   <pic:blipFill>
-                    <a:blip r:embed="rId39"/>
+                    <a:blip r:embed="rId28"/>
                     <a:stretch>
                       <a:fillRect/>
                     </a:stretch>
@@ -5060,7 +5074,7 @@
                     <pic:cNvPicPr/>
                   </pic:nvPicPr>
                   <pic:blipFill>
-                    <a:blip r:embed="rId40"/>
+                    <a:blip r:embed="rId29"/>
                     <a:stretch>
                       <a:fillRect/>
                     </a:stretch>
@@ -5145,7 +5159,7 @@
                     <pic:cNvPicPr/>
                   </pic:nvPicPr>
                   <pic:blipFill>
-                    <a:blip r:embed="rId41"/>
+                    <a:blip r:embed="rId30"/>
                     <a:stretch>
                       <a:fillRect/>
                     </a:stretch>
@@ -5230,7 +5244,7 @@
                     <pic:cNvPicPr/>
                   </pic:nvPicPr>
                   <pic:blipFill>
-                    <a:blip r:embed="rId42"/>
+                    <a:blip r:embed="rId31"/>
                     <a:stretch>
                       <a:fillRect/>
                     </a:stretch>
@@ -5315,7 +5329,7 @@
                     <pic:cNvPicPr/>
                   </pic:nvPicPr>
                   <pic:blipFill>
-                    <a:blip r:embed="rId43"/>
+                    <a:blip r:embed="rId32"/>
                     <a:stretch>
                       <a:fillRect/>
                     </a:stretch>
@@ -5400,7 +5414,7 @@
                     <pic:cNvPicPr/>
                   </pic:nvPicPr>
                   <pic:blipFill>
-                    <a:blip r:embed="rId44"/>
+                    <a:blip r:embed="rId33"/>
                     <a:stretch>
                       <a:fillRect/>
                     </a:stretch>
@@ -6462,7 +6476,7 @@
           <w:sz w:val="24"/>
           <w:szCs w:val="24"/>
         </w:rPr>
-        <w:t xml:space="preserve">Upon completion of the system, Auditrix is to be evaluated by the Program Chairpersons and selected IT experts using a Google Form-based instrument built on the ISO/IEC 25010 software quality model, with each characteristic mapped to a specific part of the system. Responses will be analyzed </w:t>
+        <w:t xml:space="preserve">Upon completion of the system, Auditrix is to be evaluated by the Program Chairpersons and selected IT experts using a printed (paper-based) questionnaire built on the ISO/IEC 25010 software quality model, with each characteristic mapped to a specific part of the system. Responses will be analyzed </w:t>
       </w:r>
       <w:r>
         <w:rPr>
@@ -7552,8 +7566,8 @@
       </w:r>
     </w:p>
     <w:sectPr>
-      <w:headerReference w:type="default" r:id="rId71"/>
-      <w:headerReference w:type="first" r:id="rId72"/>
+      <w:headerReference w:type="default" r:id="rId34"/>
+      <w:headerReference w:type="first" r:id="rId35"/>
       <w:pgSz w:w="12242" w:h="15842"/>
       <w:pgMar w:top="1440" w:right="1440" w:bottom="1440" w:left="2160" w:header="709" w:footer="709" w:gutter="0"/>
       <w:pgNumType w:start="50"/>
@@ -7585,60 +7599,24 @@
       </w:r>
     </w:p>
   </w:comment>
-  <w:comment w:id="1" w:author="Claude" w:date="2026-10-07T13:26:00Z" w:initials="CL">
-    <w:p>
-      <w:r>
-        <w:rPr>
-          <w:rStyle w:val="CommentReference"/>
-        </w:rPr>
-        <w:annotationRef/>
-      </w:r>
-      <w:r>
-        <w:rPr>
-          <w:color w:val="000000"/>
-          <w:sz w:val="20"/>
-          <w:szCs w:val="20"/>
-        </w:rPr>
-        <w:t>Placeholders: capture these screens from the running system (docs/capstone-notes.md, section 8), paste them in, and delete the [Insert screenshot] lines.</w:t>
-      </w:r>
-    </w:p>
-  </w:comment>
-  <w:comment w:id="2" w:author="" w:initials="">
-    <w:p>
-      <w:pPr>
-        <w:pStyle w:val="CommentText"/>
-      </w:pPr>
-      <w:r>
-        <w:rPr>
-          <w:rStyle w:val="CommentReference"/>
-        </w:rPr>
-        <w:annotationRef/>
-      </w:r>
-    </w:p>
-  </w:comment>
 </w:comments>
 </file>
 
 <file path=word/commentsExtended.xml><?xml version="1.0" encoding="utf-8"?>
 <w15:commentsEx xmlns:wpc="http://schemas.microsoft.com/office/word/2010/wordprocessingCanvas" xmlns:cx="http://schemas.microsoft.com/office/drawing/2014/chartex" xmlns:cx1="http://schemas.microsoft.com/office/drawing/2015/9/8/chartex" xmlns:cx2="http://schemas.microsoft.com/office/drawing/2015/10/21/chartex" xmlns:cx3="http://schemas.microsoft.com/office/drawing/2016/5/9/chartex" xmlns:cx4="http://schemas.microsoft.com/office/drawing/2016/5/10/chartex" xmlns:cx5="http://schemas.microsoft.com/office/drawing/2016/5/11/chartex" xmlns:cx6="http://schemas.microsoft.com/office/drawing/2016/5/12/chartex" xmlns:cx7="http://schemas.microsoft.com/office/drawing/2016/5/13/chartex" xmlns:cx8="http://schemas.microsoft.com/office/drawing/2016/5/14/chartex" xmlns:mc="http://schemas.openxmlformats.org/markup-compatibility/2006" xmlns:aink="http://schemas.microsoft.com/office/drawing/2016/ink" xmlns:am3d="http://schemas.microsoft.com/office/drawing/2017/model3d" xmlns:o="urn:schemas-microsoft-com:office:office" xmlns:oel="http://schemas.microsoft.com/office/2019/extlst" xmlns:r="http://schemas.openxmlformats.org/officeDocument/2006/relationships" xmlns:m="http://schemas.openxmlformats.org/officeDocument/2006/math" xmlns:v="urn:schemas-microsoft-com:vml" xmlns:wp14="http://schemas.microsoft.com/office/word/2010/wordprocessingDrawing" xmlns:wp="http://schemas.openxmlformats.org/drawingml/2006/wordprocessingDrawing" xmlns:w10="urn:schemas-microsoft-com:office:word" xmlns:w="http://schemas.openxmlformats.org/wordprocessingml/2006/main" xmlns:w14="http://schemas.microsoft.com/office/word/2010/wordml" xmlns:w15="http://schemas.microsoft.com/office/word/2012/wordml" xmlns:w16cex="http://schemas.microsoft.com/office/word/2018/wordml/cex" xmlns:w16cid="http://schemas.microsoft.com/office/word/2016/wordml/cid" xmlns:w16="http://schemas.microsoft.com/office/word/2018/wordml" xmlns:w16du="http://schemas.microsoft.com/office/word/2023/wordml/word16du" xmlns:w16sdtdh="http://schemas.microsoft.com/office/word/2020/wordml/sdtdatahash" xmlns:w16sdtfl="http://schemas.microsoft.com/office/word/2024/wordml/sdtformatlock" xmlns:w16se="http://schemas.microsoft.com/office/word/2015/wordml/symex" xmlns:wpg="http://schemas.microsoft.com/office/word/2010/wordprocessingGroup" xmlns:wpi="http://schemas.microsoft.com/office/word/2010/wordprocessingInk" xmlns:wne="http://schemas.microsoft.com/office/word/2006/wordml" xmlns:wps="http://schemas.microsoft.com/office/word/2010/wordprocessingShape" mc:Ignorable="w14 w15 w16se w16cid w16 w16cex w16sdtdh w16sdtfl w16du wp14">
   <w15:commentEx w15:paraId="4815F1B7" w15:done="0"/>
-  <w15:commentEx w15:paraId="2A9007E6" w15:done="0"/>
-  <w15:commentEx w15:paraId="20AFEB57" w15:done="0"/>
 </w15:commentsEx>
 </file>
 
 <file path=word/commentsExtensible.xml><?xml version="1.0" encoding="utf-8"?>
 <w16cex:commentsExtensible xmlns:wpc="http://schemas.microsoft.com/office/word/2010/wordprocessingCanvas" xmlns:cx="http://schemas.microsoft.com/office/drawing/2014/chartex" xmlns:cx1="http://schemas.microsoft.com/office/drawing/2015/9/8/chartex" xmlns:cx2="http://schemas.microsoft.com/office/drawing/2015/10/21/chartex" xmlns:cx3="http://schemas.microsoft.com/office/drawing/2016/5/9/chartex" xmlns:cx4="http://schemas.microsoft.com/office/drawing/2016/5/10/chartex" xmlns:cx5="http://schemas.microsoft.com/office/drawing/2016/5/11/chartex" xmlns:cx6="http://schemas.microsoft.com/office/drawing/2016/5/12/chartex" xmlns:cx7="http://schemas.microsoft.com/office/drawing/2016/5/13/chartex" xmlns:cx8="http://schemas.microsoft.com/office/drawing/2016/5/14/chartex" xmlns:cr="http://schemas.microsoft.com/office/comments/2020/reactions" xmlns:mc="http://schemas.openxmlformats.org/markup-compatibility/2006" xmlns:aink="http://schemas.microsoft.com/office/drawing/2016/ink" xmlns:am3d="http://schemas.microsoft.com/office/drawing/2017/model3d" xmlns:o="urn:schemas-microsoft-com:office:office" xmlns:oel="http://schemas.microsoft.com/office/2019/extlst" xmlns:r="http://schemas.openxmlformats.org/officeDocument/2006/relationships" xmlns:m="http://schemas.openxmlformats.org/officeDocument/2006/math" xmlns:v="urn:schemas-microsoft-com:vml" xmlns:wp14="http://schemas.microsoft.com/office/word/2010/wordprocessingDrawing" xmlns:wp="http://schemas.openxmlformats.org/drawingml/2006/wordprocessingDrawing" xmlns:w10="urn:schemas-microsoft-com:office:word" xmlns:w="http://schemas.openxmlformats.org/wordprocessingml/2006/main" xmlns:w14="http://schemas.microsoft.com/office/word/2010/wordml" xmlns:w15="http://schemas.microsoft.com/office/word/2012/wordml" xmlns:w16cex="http://schemas.microsoft.com/office/word/2018/wordml/cex" xmlns:w16cid="http://schemas.microsoft.com/office/word/2016/wordml/cid" xmlns:w16="http://schemas.microsoft.com/office/word/2018/wordml" xmlns:w16du="http://schemas.microsoft.com/office/word/2023/wordml/word16du" xmlns:w16sdtdh="http://schemas.microsoft.com/office/word/2020/wordml/sdtdatahash" xmlns:w16sdtfl="http://schemas.microsoft.com/office/word/2024/wordml/sdtformatlock" xmlns:w16se="http://schemas.microsoft.com/office/word/2015/wordml/symex" xmlns:wpg="http://schemas.microsoft.com/office/word/2010/wordprocessingGroup" xmlns:wpi="http://schemas.microsoft.com/office/word/2010/wordprocessingInk" xmlns:wne="http://schemas.microsoft.com/office/word/2006/wordml" xmlns:wps="http://schemas.microsoft.com/office/word/2010/wordprocessingShape" mc:Ignorable="w14 w15 w16se w16cid w16 w16cex w16sdtdh w16sdtfl cr w16du wp14">
   <w16cex:commentExtensible w16cex:durableId="2B9EF915" w16cex:dateUtc="2026-10-07T13:26:00Z"/>
-  <w16cex:commentExtensible w16cex:durableId="0599AB21" w16cex:dateUtc="2026-10-07T13:26:00Z"/>
 </w16cex:commentsExtensible>
 </file>
 
 <file path=word/commentsIds.xml><?xml version="1.0" encoding="utf-8"?>
 <w16cid:commentsIds xmlns:wpc="http://schemas.microsoft.com/office/word/2010/wordprocessingCanvas" xmlns:cx="http://schemas.microsoft.com/office/drawing/2014/chartex" xmlns:cx1="http://schemas.microsoft.com/office/drawing/2015/9/8/chartex" xmlns:cx2="http://schemas.microsoft.com/office/drawing/2015/10/21/chartex" xmlns:cx3="http://schemas.microsoft.com/office/drawing/2016/5/9/chartex" xmlns:cx4="http://schemas.microsoft.com/office/drawing/2016/5/10/chartex" xmlns:cx5="http://schemas.microsoft.com/office/drawing/2016/5/11/chartex" xmlns:cx6="http://schemas.microsoft.com/office/drawing/2016/5/12/chartex" xmlns:cx7="http://schemas.microsoft.com/office/drawing/2016/5/13/chartex" xmlns:cx8="http://schemas.microsoft.com/office/drawing/2016/5/14/chartex" xmlns:mc="http://schemas.openxmlformats.org/markup-compatibility/2006" xmlns:aink="http://schemas.microsoft.com/office/drawing/2016/ink" xmlns:am3d="http://schemas.microsoft.com/office/drawing/2017/model3d" xmlns:o="urn:schemas-microsoft-com:office:office" xmlns:oel="http://schemas.microsoft.com/office/2019/extlst" xmlns:r="http://schemas.openxmlformats.org/officeDocument/2006/relationships" xmlns:m="http://schemas.openxmlformats.org/officeDocument/2006/math" xmlns:v="urn:schemas-microsoft-com:vml" xmlns:wp14="http://schemas.microsoft.com/office/word/2010/wordprocessingDrawing" xmlns:wp="http://schemas.openxmlformats.org/drawingml/2006/wordprocessingDrawing" xmlns:w10="urn:schemas-microsoft-com:office:word" xmlns:w="http://schemas.openxmlformats.org/wordprocessingml/2006/main" xmlns:w14="http://schemas.microsoft.com/office/word/2010/wordml" xmlns:w15="http://schemas.microsoft.com/office/word/2012/wordml" xmlns:w16cex="http://schemas.microsoft.com/office/word/2018/wordml/cex" xmlns:w16cid="http://schemas.microsoft.com/office/word/2016/wordml/cid" xmlns:w16="http://schemas.microsoft.com/office/word/2018/wordml" xmlns:w16du="http://schemas.microsoft.com/office/word/2023/wordml/word16du" xmlns:w16sdtdh="http://schemas.microsoft.com/office/word/2020/wordml/sdtdatahash" xmlns:w16sdtfl="http://schemas.microsoft.com/office/word/2024/wordml/sdtformatlock" xmlns:w16se="http://schemas.microsoft.com/office/word/2015/wordml/symex" xmlns:wpg="http://schemas.microsoft.com/office/word/2010/wordprocessingGroup" xmlns:wpi="http://schemas.microsoft.com/office/word/2010/wordprocessingInk" xmlns:wne="http://schemas.microsoft.com/office/word/2006/wordml" xmlns:wps="http://schemas.microsoft.com/office/word/2010/wordprocessingShape" mc:Ignorable="w14 w15 w16se w16cid w16 w16cex w16sdtdh w16sdtfl w16du wp14">
   <w16cid:commentId w16cid:paraId="4815F1B7" w16cid:durableId="2B9EF915"/>
-  <w16cid:commentId w16cid:paraId="2A9007E6" w16cid:durableId="0599AB21"/>
-  <w16cid:commentId w16cid:paraId="20AFEB57" w16cid:durableId="20AFEB57"/>
 </w16cid:commentsIds>
 </file>
 
@@ -7667,157 +7645,6 @@
 </w:endnotes>
 </file>
 
-<file path=word/footer1.xml><?xml version="1.0" encoding="utf-8"?>
-<w:ftr xmlns:wpc="http://schemas.microsoft.com/office/word/2010/wordprocessingCanvas" xmlns:cx="http://schemas.microsoft.com/office/drawing/2014/chartex" xmlns:cx1="http://schemas.microsoft.com/office/drawing/2015/9/8/chartex" xmlns:cx2="http://schemas.microsoft.com/office/drawing/2015/10/21/chartex" xmlns:cx3="http://schemas.microsoft.com/office/drawing/2016/5/9/chartex" xmlns:cx4="http://schemas.microsoft.com/office/drawing/2016/5/10/chartex" xmlns:cx5="http://schemas.microsoft.com/office/drawing/2016/5/11/chartex" xmlns:cx6="http://schemas.microsoft.com/office/drawing/2016/5/12/chartex" xmlns:cx7="http://schemas.microsoft.com/office/drawing/2016/5/13/chartex" xmlns:cx8="http://schemas.microsoft.com/office/drawing/2016/5/14/chartex" xmlns:mc="http://schemas.openxmlformats.org/markup-compatibility/2006" xmlns:aink="http://schemas.microsoft.com/office/drawing/2016/ink" xmlns:am3d="http://schemas.microsoft.com/office/drawing/2017/model3d" xmlns:o="urn:schemas-microsoft-com:office:office" xmlns:oel="http://schemas.microsoft.com/office/2019/extlst" xmlns:r="http://schemas.openxmlformats.org/officeDocument/2006/relationships" xmlns:m="http://schemas.openxmlformats.org/officeDocument/2006/math" xmlns:v="urn:schemas-microsoft-com:vml" xmlns:wp14="http://schemas.microsoft.com/office/word/2010/wordprocessingDrawing" xmlns:wp="http://schemas.openxmlformats.org/drawingml/2006/wordprocessingDrawing" xmlns:w10="urn:schemas-microsoft-com:office:word" xmlns:w="http://schemas.openxmlformats.org/wordprocessingml/2006/main" xmlns:w14="http://schemas.microsoft.com/office/word/2010/wordml" xmlns:w15="http://schemas.microsoft.com/office/word/2012/wordml" xmlns:w16cex="http://schemas.microsoft.com/office/word/2018/wordml/cex" xmlns:w16cid="http://schemas.microsoft.com/office/word/2016/wordml/cid" xmlns:w16="http://schemas.microsoft.com/office/word/2018/wordml" xmlns:w16du="http://schemas.microsoft.com/office/word/2023/wordml/word16du" xmlns:w16sdtdh="http://schemas.microsoft.com/office/word/2020/wordml/sdtdatahash" xmlns:w16sdtfl="http://schemas.microsoft.com/office/word/2024/wordml/sdtformatlock" xmlns:w16se="http://schemas.microsoft.com/office/word/2015/wordml/symex" xmlns:wpg="http://schemas.microsoft.com/office/word/2010/wordprocessingGroup" xmlns:wpi="http://schemas.microsoft.com/office/word/2010/wordprocessingInk" xmlns:wne="http://schemas.microsoft.com/office/word/2006/wordml" xmlns:wps="http://schemas.microsoft.com/office/word/2010/wordprocessingShape" mc:Ignorable="w14 w15 w16se w16cid w16 w16cex w16sdtdh w16sdtfl w16du wp14">
-  <w:sdt>
-    <w:sdtPr>
-      <w:id w:val="-346180850"/>
-    </w:sdtPr>
-    <w:sdtContent>
-      <w:p>
-        <w:pPr>
-          <w:pStyle w:val="Footer"/>
-          <w:jc w:val="center"/>
-        </w:pPr>
-        <w:r>
-          <w:rPr>
-            <w:rFonts w:ascii="Courier New" w:hAnsi="Courier New" w:cs="Courier New"/>
-            <w:noProof/>
-            <w:lang w:eastAsia="en-PH"/>
-          </w:rPr>
-          <mc:AlternateContent>
-            <mc:Choice Requires="wps">
-              <w:drawing>
-                <wp:anchor distT="0" distB="0" distL="114300" distR="114300" simplePos="0" relativeHeight="251664384" behindDoc="0" locked="0" layoutInCell="1" allowOverlap="1" wp14:anchorId="597055CA" wp14:editId="492FEC36">
-                  <wp:simplePos x="0" y="0"/>
-                  <wp:positionH relativeFrom="page">
-                    <wp:align>left</wp:align>
-                  </wp:positionH>
-                  <wp:positionV relativeFrom="paragraph">
-                    <wp:posOffset>-112395</wp:posOffset>
-                  </wp:positionV>
-                  <wp:extent cx="7772400" cy="0"/>
-                  <wp:effectExtent l="0" t="19050" r="19050" b="19050"/>
-                  <wp:wrapNone/>
-                  <wp:docPr id="431550391" name="Straight Connector 431550391"/>
-                  <wp:cNvGraphicFramePr/>
-                  <a:graphic xmlns:a="http://schemas.openxmlformats.org/drawingml/2006/main">
-                    <a:graphicData uri="http://schemas.microsoft.com/office/word/2010/wordprocessingShape">
-                      <wps:wsp>
-                        <wps:cNvCnPr/>
-                        <wps:spPr>
-                          <a:xfrm>
-                            <a:off x="0" y="0"/>
-                            <a:ext cx="7772400" cy="0"/>
-                          </a:xfrm>
-                          <a:prstGeom prst="line">
-                            <a:avLst/>
-                          </a:prstGeom>
-                          <a:ln w="38100"/>
-                        </wps:spPr>
-                        <wps:style>
-                          <a:lnRef idx="1">
-                            <a:schemeClr val="dk1"/>
-                          </a:lnRef>
-                          <a:fillRef idx="0">
-                            <a:schemeClr val="dk1"/>
-                          </a:fillRef>
-                          <a:effectRef idx="0">
-                            <a:schemeClr val="dk1"/>
-                          </a:effectRef>
-                          <a:fontRef idx="minor">
-                            <a:schemeClr val="tx1"/>
-                          </a:fontRef>
-                        </wps:style>
-                        <wps:bodyPr/>
-                      </wps:wsp>
-                    </a:graphicData>
-                  </a:graphic>
-                </wp:anchor>
-              </w:drawing>
-            </mc:Choice>
-            <mc:Fallback>
-              <w:pict>
-                <v:line w14:anchorId="7E22F063" id="Straight Connector 431550391" o:spid="_x0000_s1026" style="position:absolute;z-index:251664384;visibility:visible;mso-wrap-style:square;mso-wrap-distance-left:9pt;mso-wrap-distance-top:0;mso-wrap-distance-right:9pt;mso-wrap-distance-bottom:0;mso-position-horizontal:left;mso-position-horizontal-relative:page;mso-position-vertical:absolute;mso-position-vertical-relative:text" from="0,-8.85pt" to="612pt,-8.85pt" o:gfxdata="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" strokecolor="black [3200]" strokeweight="3pt">
-                  <v:stroke joinstyle="miter"/>
-                  <w10:wrap anchorx="page"/>
-                </v:line>
-              </w:pict>
-            </mc:Fallback>
-          </mc:AlternateContent>
-        </w:r>
-      </w:p>
-    </w:sdtContent>
-  </w:sdt>
-  <w:p>
-    <w:pPr>
-      <w:pStyle w:val="Footer"/>
-    </w:pPr>
-  </w:p>
-</w:ftr>
-</file>
-
-<file path=word/footer11.xml><?xml version="1.0" encoding="utf-8"?>
-<w:ftr xmlns:w="http://schemas.openxmlformats.org/wordprocessingml/2006/main">
-  <w:p>
-    <w:pPr>
-      <w:jc w:val="center"/>
-    </w:pPr>
-    <w:r>
-      <w:rPr>
-        <w:rFonts w:ascii="Courier New" w:hAnsi="Courier New" w:cs="Courier New"/>
-        <w:sz w:val="24"/>
-        <w:szCs w:val="24"/>
-      </w:rPr>
-      <w:fldChar w:fldCharType="begin"/>
-    </w:r>
-    <w:r>
-      <w:rPr>
-        <w:rFonts w:ascii="Courier New" w:hAnsi="Courier New" w:cs="Courier New"/>
-        <w:sz w:val="24"/>
-        <w:szCs w:val="24"/>
-      </w:rPr>
-      <w:instrText xml:space="preserve"> PAGE </w:instrText>
-    </w:r>
-    <w:r>
-      <w:rPr>
-        <w:rFonts w:ascii="Courier New" w:hAnsi="Courier New" w:cs="Courier New"/>
-        <w:sz w:val="24"/>
-        <w:szCs w:val="24"/>
-      </w:rPr>
-      <w:fldChar w:fldCharType="separate"/>
-    </w:r>
-    <w:r>
-      <w:rPr>
-        <w:rFonts w:ascii="Courier New" w:hAnsi="Courier New" w:cs="Courier New"/>
-        <w:sz w:val="24"/>
-        <w:szCs w:val="24"/>
-      </w:rPr>
-      <w:t>ii</w:t>
-    </w:r>
-    <w:r>
-      <w:rPr>
-        <w:rFonts w:ascii="Courier New" w:hAnsi="Courier New" w:cs="Courier New"/>
-        <w:sz w:val="24"/>
-        <w:szCs w:val="24"/>
-      </w:rPr>
-      <w:fldChar w:fldCharType="end"/>
-    </w:r>
-  </w:p>
-</w:ftr>
-</file>
-
-<file path=word/footer2.xml><?xml version="1.0" encoding="utf-8"?>
-<w:ftr xmlns:wpc="http://schemas.microsoft.com/office/word/2010/wordprocessingCanvas" xmlns:cx="http://schemas.microsoft.com/office/drawing/2014/chartex" xmlns:cx1="http://schemas.microsoft.com/office/drawing/2015/9/8/chartex" xmlns:cx2="http://schemas.microsoft.com/office/drawing/2015/10/21/chartex" xmlns:cx3="http://schemas.microsoft.com/office/drawing/2016/5/9/chartex" xmlns:cx4="http://schemas.microsoft.com/office/drawing/2016/5/10/chartex" xmlns:cx5="http://schemas.microsoft.com/office/drawing/2016/5/11/chartex" xmlns:cx6="http://schemas.microsoft.com/office/drawing/2016/5/12/chartex" xmlns:cx7="http://schemas.microsoft.com/office/drawing/2016/5/13/chartex" xmlns:cx8="http://schemas.microsoft.com/office/drawing/2016/5/14/chartex" xmlns:mc="http://schemas.openxmlformats.org/markup-compatibility/2006" xmlns:aink="http://schemas.microsoft.com/office/drawing/2016/ink" xmlns:am3d="http://schemas.microsoft.com/office/drawing/2017/model3d" xmlns:o="urn:schemas-microsoft-com:office:office" xmlns:oel="http://schemas.microsoft.com/office/2019/extlst" xmlns:r="http://schemas.openxmlformats.org/officeDocument/2006/relationships" xmlns:m="http://schemas.openxmlformats.org/officeDocument/2006/math" xmlns:v="urn:schemas-microsoft-com:vml" xmlns:wp14="http://schemas.microsoft.com/office/word/2010/wordprocessingDrawing" xmlns:wp="http://schemas.openxmlformats.org/drawingml/2006/wordprocessingDrawing" xmlns:w10="urn:schemas-microsoft-com:office:word" xmlns:w="http://schemas.openxmlformats.org/wordprocessingml/2006/main" xmlns:w14="http://schemas.microsoft.com/office/word/2010/wordml" xmlns:w15="http://schemas.microsoft.com/office/word/2012/wordml" xmlns:w16cex="http://schemas.microsoft.com/office/word/2018/wordml/cex" xmlns:w16cid="http://schemas.microsoft.com/office/word/2016/wordml/cid" xmlns:w16="http://schemas.microsoft.com/office/word/2018/wordml" xmlns:w16du="http://schemas.microsoft.com/office/word/2023/wordml/word16du" xmlns:w16sdtdh="http://schemas.microsoft.com/office/word/2020/wordml/sdtdatahash" xmlns:w16sdtfl="http://schemas.microsoft.com/office/word/2024/wordml/sdtformatlock" xmlns:w16se="http://schemas.microsoft.com/office/word/2015/wordml/symex" xmlns:wpg="http://schemas.microsoft.com/office/word/2010/wordprocessingGroup" xmlns:wpi="http://schemas.microsoft.com/office/word/2010/wordprocessingInk" xmlns:wne="http://schemas.microsoft.com/office/word/2006/wordml" xmlns:wps="http://schemas.microsoft.com/office/word/2010/wordprocessingShape" mc:Ignorable="w14 w15 w16se w16cid w16 w16cex w16sdtdh w16sdtfl w16du wp14">
-  <w:p>
-    <w:pPr>
-      <w:pStyle w:val="Footer"/>
-      <w:jc w:val="center"/>
-    </w:pPr>
-  </w:p>
-</w:ftr>
-</file>
-
 <file path=word/footnotes.xml><?xml version="1.0" encoding="utf-8"?>
 <w:footnotes xmlns:wpc="http://schemas.microsoft.com/office/word/2010/wordprocessingCanvas" xmlns:cx="http://schemas.microsoft.com/office/drawing/2014/chartex" xmlns:cx1="http://schemas.microsoft.com/office/drawing/2015/9/8/chartex" xmlns:cx2="http://schemas.microsoft.com/office/drawing/2015/10/21/chartex" xmlns:cx3="http://schemas.microsoft.com/office/drawing/2016/5/9/chartex" xmlns:cx4="http://schemas.microsoft.com/office/drawing/2016/5/10/chartex" xmlns:cx5="http://schemas.microsoft.com/office/drawing/2016/5/11/chartex" xmlns:cx6="http://schemas.microsoft.com/office/drawing/2016/5/12/chartex" xmlns:cx7="http://schemas.microsoft.com/office/drawing/2016/5/13/chartex" xmlns:cx8="http://schemas.microsoft.com/office/drawing/2016/5/14/chartex" xmlns:mc="http://schemas.openxmlformats.org/markup-compatibility/2006" xmlns:aink="http://schemas.microsoft.com/office/drawing/2016/ink" xmlns:am3d="http://schemas.microsoft.com/office/drawing/2017/model3d" xmlns:o="urn:schemas-microsoft-com:office:office" xmlns:oel="http://schemas.microsoft.com/office/2019/extlst" xmlns:r="http://schemas.openxmlformats.org/officeDocument/2006/relationships" xmlns:m="http://schemas.openxmlformats.org/officeDocument/2006/math" xmlns:v="urn:schemas-microsoft-com:vml" xmlns:wp14="http://schemas.microsoft.com/office/word/2010/wordprocessingDrawing" xmlns:wp="http://schemas.openxmlformats.org/drawingml/2006/wordprocessingDrawing" xmlns:w10="urn:schemas-microsoft-com:office:word" xmlns:w="http://schemas.openxmlformats.org/wordprocessingml/2006/main" xmlns:w14="http://schemas.microsoft.com/office/word/2010/wordml" xmlns:w15="http://schemas.microsoft.com/office/word/2012/wordml" xmlns:w16cex="http://schemas.microsoft.com/office/word/2018/wordml/cex" xmlns:w16cid="http://schemas.microsoft.com/office/word/2016/wordml/cid" xmlns:w16="http://schemas.microsoft.com/office/word/2018/wordml" xmlns:w16du="http://schemas.microsoft.com/office/word/2023/wordml/word16du" xmlns:w16sdtdh="http://schemas.microsoft.com/office/word/2020/wordml/sdtdatahash" xmlns:w16sdtfl="http://schemas.microsoft.com/office/word/2024/wordml/sdtformatlock" xmlns:w16se="http://schemas.microsoft.com/office/word/2015/wordml/symex" xmlns:wpg="http://schemas.microsoft.com/office/word/2010/wordprocessingGroup" xmlns:wpi="http://schemas.microsoft.com/office/word/2010/wordprocessingInk" xmlns:wne="http://schemas.microsoft.com/office/word/2006/wordml" xmlns:wps="http://schemas.microsoft.com/office/word/2010/wordprocessingShape" mc:Ignorable="w14 w15 w16se w16cid w16 w16cex w16sdtdh w16sdtfl w16du wp14">
   <w:footnote w:type="separator" w:id="-1">
@@ -7844,3388 +7671,6 @@
 </file>
 
 <file path=word/header1.xml><?xml version="1.0" encoding="utf-8"?>
-<w:hdr xmlns:wpc="http://schemas.microsoft.com/office/word/2010/wordprocessingCanvas" xmlns:cx="http://schemas.microsoft.com/office/drawing/2014/chartex" xmlns:cx1="http://schemas.microsoft.com/office/drawing/2015/9/8/chartex" xmlns:cx2="http://schemas.microsoft.com/office/drawing/2015/10/21/chartex" xmlns:cx3="http://schemas.microsoft.com/office/drawing/2016/5/9/chartex" xmlns:cx4="http://schemas.microsoft.com/office/drawing/2016/5/10/chartex" xmlns:cx5="http://schemas.microsoft.com/office/drawing/2016/5/11/chartex" xmlns:cx6="http://schemas.microsoft.com/office/drawing/2016/5/12/chartex" xmlns:cx7="http://schemas.microsoft.com/office/drawing/2016/5/13/chartex" xmlns:cx8="http://schemas.microsoft.com/office/drawing/2016/5/14/chartex" xmlns:mc="http://schemas.openxmlformats.org/markup-compatibility/2006" xmlns:aink="http://schemas.microsoft.com/office/drawing/2016/ink" xmlns:am3d="http://schemas.microsoft.com/office/drawing/2017/model3d" xmlns:o="urn:schemas-microsoft-com:office:office" xmlns:oel="http://schemas.microsoft.com/office/2019/extlst" xmlns:r="http://schemas.openxmlformats.org/officeDocument/2006/relationships" xmlns:m="http://schemas.openxmlformats.org/officeDocument/2006/math" xmlns:v="urn:schemas-microsoft-com:vml" xmlns:wp14="http://schemas.microsoft.com/office/word/2010/wordprocessingDrawing" xmlns:wp="http://schemas.openxmlformats.org/drawingml/2006/wordprocessingDrawing" xmlns:w10="urn:schemas-microsoft-com:office:word" xmlns:w="http://schemas.openxmlformats.org/wordprocessingml/2006/main" xmlns:w14="http://schemas.microsoft.com/office/word/2010/wordml" xmlns:w15="http://schemas.microsoft.com/office/word/2012/wordml" xmlns:w16cex="http://schemas.microsoft.com/office/word/2018/wordml/cex" xmlns:w16cid="http://schemas.microsoft.com/office/word/2016/wordml/cid" xmlns:w16="http://schemas.microsoft.com/office/word/2018/wordml" xmlns:w16du="http://schemas.microsoft.com/office/word/2023/wordml/word16du" xmlns:w16sdtdh="http://schemas.microsoft.com/office/word/2020/wordml/sdtdatahash" xmlns:w16sdtfl="http://schemas.microsoft.com/office/word/2024/wordml/sdtformatlock" xmlns:w16se="http://schemas.microsoft.com/office/word/2015/wordml/symex" xmlns:wpg="http://schemas.microsoft.com/office/word/2010/wordprocessingGroup" xmlns:wpi="http://schemas.microsoft.com/office/word/2010/wordprocessingInk" xmlns:wne="http://schemas.microsoft.com/office/word/2006/wordml" xmlns:wps="http://schemas.microsoft.com/office/word/2010/wordprocessingShape" mc:Ignorable="w14 w15 w16se w16cid w16 w16cex w16sdtdh w16sdtfl w16du wp14">
-  <w:sdt>
-    <w:sdtPr>
-      <w:id w:val="487138519"/>
-    </w:sdtPr>
-    <w:sdtEndPr>
-      <w:rPr>
-        <w:rFonts w:ascii="Courier New" w:hAnsi="Courier New" w:cs="Courier New"/>
-      </w:rPr>
-    </w:sdtEndPr>
-    <w:sdtContent>
-      <w:p>
-        <w:pPr>
-          <w:pStyle w:val="Header"/>
-          <w:jc w:val="center"/>
-          <w:rPr>
-            <w:rFonts w:ascii="Courier New" w:hAnsi="Courier New" w:cs="Courier New"/>
-            <w:b/>
-            <w:sz w:val="32"/>
-          </w:rPr>
-        </w:pPr>
-        <w:r>
-          <w:rPr>
-            <w:rFonts w:ascii="Courier New" w:hAnsi="Courier New" w:cs="Courier New"/>
-            <w:b/>
-            <w:noProof/>
-            <w:sz w:val="36"/>
-            <w:lang w:eastAsia="en-PH"/>
-          </w:rPr>
-          <w:drawing>
-            <wp:anchor distT="0" distB="0" distL="114300" distR="114300" simplePos="0" relativeHeight="251659264" behindDoc="0" locked="0" layoutInCell="1" allowOverlap="1" wp14:anchorId="07AE5F3A" wp14:editId="4787DA95">
-              <wp:simplePos x="0" y="0"/>
-              <wp:positionH relativeFrom="column">
-                <wp:posOffset>-246380</wp:posOffset>
-              </wp:positionH>
-              <wp:positionV relativeFrom="paragraph">
-                <wp:posOffset>-198120</wp:posOffset>
-              </wp:positionV>
-              <wp:extent cx="823595" cy="724535"/>
-              <wp:effectExtent l="0" t="0" r="14605" b="18415"/>
-              <wp:wrapNone/>
-              <wp:docPr id="1344769163" name="Picture 1344769163"/>
-              <wp:cNvGraphicFramePr>
-                <a:graphicFrameLocks xmlns:a="http://schemas.openxmlformats.org/drawingml/2006/main" noChangeAspect="1"/>
-              </wp:cNvGraphicFramePr>
-              <a:graphic xmlns:a="http://schemas.openxmlformats.org/drawingml/2006/main">
-                <a:graphicData uri="http://schemas.openxmlformats.org/drawingml/2006/picture">
-                  <pic:pic xmlns:pic="http://schemas.openxmlformats.org/drawingml/2006/picture">
-                    <pic:nvPicPr>
-                      <pic:cNvPr id="700363394" name="Picture 700363394"/>
-                      <pic:cNvPicPr>
-                        <a:picLocks noChangeAspect="1"/>
-                      </pic:cNvPicPr>
-                    </pic:nvPicPr>
-                    <pic:blipFill>
-                      <a:blip r:embed="rId1">
-                        <a:extLst>
-                          <a:ext uri="{28A0092B-C50C-407E-A947-70E740481C1C}">
-                            <a14:useLocalDpi xmlns:a14="http://schemas.microsoft.com/office/drawing/2010/main" val="0"/>
-                          </a:ext>
-                        </a:extLst>
-                      </a:blip>
-                      <a:stretch>
-                        <a:fillRect/>
-                      </a:stretch>
-                    </pic:blipFill>
-                    <pic:spPr>
-                      <a:xfrm>
-                        <a:off x="0" y="0"/>
-                        <a:ext cx="823578" cy="724710"/>
-                      </a:xfrm>
-                      <a:prstGeom prst="rect">
-                        <a:avLst/>
-                      </a:prstGeom>
-                    </pic:spPr>
-                  </pic:pic>
-                </a:graphicData>
-              </a:graphic>
-            </wp:anchor>
-          </w:drawing>
-        </w:r>
-        <w:r>
-          <w:rPr>
-            <w:rFonts w:ascii="Courier New" w:hAnsi="Courier New" w:cs="Courier New"/>
-            <w:b/>
-            <w:noProof/>
-            <w:sz w:val="32"/>
-            <w:lang w:eastAsia="en-PH"/>
-          </w:rPr>
-          <mc:AlternateContent>
-            <mc:Choice Requires="wps">
-              <w:drawing>
-                <wp:anchor distT="0" distB="0" distL="114300" distR="114300" simplePos="0" relativeHeight="251662336" behindDoc="0" locked="0" layoutInCell="1" allowOverlap="1" wp14:anchorId="41D96DE8" wp14:editId="4D5A26B6">
-                  <wp:simplePos x="0" y="0"/>
-                  <wp:positionH relativeFrom="column">
-                    <wp:posOffset>-1371600</wp:posOffset>
-                  </wp:positionH>
-                  <wp:positionV relativeFrom="paragraph">
-                    <wp:posOffset>-287020</wp:posOffset>
-                  </wp:positionV>
-                  <wp:extent cx="7772400" cy="0"/>
-                  <wp:effectExtent l="0" t="19050" r="0" b="19050"/>
-                  <wp:wrapNone/>
-                  <wp:docPr id="26" name="Straight Connector 26"/>
-                  <wp:cNvGraphicFramePr/>
-                  <a:graphic xmlns:a="http://schemas.openxmlformats.org/drawingml/2006/main">
-                    <a:graphicData uri="http://schemas.microsoft.com/office/word/2010/wordprocessingShape">
-                      <wps:wsp>
-                        <wps:cNvCnPr/>
-                        <wps:spPr>
-                          <a:xfrm>
-                            <a:off x="0" y="0"/>
-                            <a:ext cx="7772400" cy="0"/>
-                          </a:xfrm>
-                          <a:prstGeom prst="line">
-                            <a:avLst/>
-                          </a:prstGeom>
-                          <a:ln w="38100"/>
-                        </wps:spPr>
-                        <wps:style>
-                          <a:lnRef idx="1">
-                            <a:schemeClr val="dk1"/>
-                          </a:lnRef>
-                          <a:fillRef idx="0">
-                            <a:schemeClr val="dk1"/>
-                          </a:fillRef>
-                          <a:effectRef idx="0">
-                            <a:schemeClr val="dk1"/>
-                          </a:effectRef>
-                          <a:fontRef idx="minor">
-                            <a:schemeClr val="tx1"/>
-                          </a:fontRef>
-                        </wps:style>
-                        <wps:bodyPr/>
-                      </wps:wsp>
-                    </a:graphicData>
-                  </a:graphic>
-                </wp:anchor>
-              </w:drawing>
-            </mc:Choice>
-            <mc:Fallback xmlns:wpsCustomData="http://www.wps.cn/officeDocument/2013/wpsCustomData">
-              <w:pict>
-                <v:line id="_x0000_s1026" o:spid="_x0000_s1026" o:spt="20" style="position:absolute;left:0pt;margin-left:-108pt;margin-top:-22.6pt;height:0pt;width:612pt;z-index:251662336;mso-width-relative:page;mso-height-relative:page;" filled="f" stroked="t" coordsize="21600,21600" o:gfxdata="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">
-                  <v:fill on="f" focussize="0,0"/>
-                  <v:stroke weight="3pt" color="#000000 [3200]" miterlimit="8" joinstyle="miter"/>
-                  <v:imagedata o:title=""/>
-                  <o:lock v:ext="edit" aspectratio="f"/>
-                </v:line>
-              </w:pict>
-            </mc:Fallback>
-          </mc:AlternateContent>
-        </w:r>
-        <w:r>
-          <w:rPr>
-            <w:rFonts w:ascii="Courier New" w:hAnsi="Courier New" w:cs="Courier New"/>
-            <w:b/>
-            <w:noProof/>
-            <w:sz w:val="36"/>
-            <w:lang w:eastAsia="en-PH"/>
-          </w:rPr>
-          <mc:AlternateContent>
-            <mc:Choice Requires="wps">
-              <w:drawing>
-                <wp:anchor distT="0" distB="0" distL="114300" distR="114300" simplePos="0" relativeHeight="251660288" behindDoc="0" locked="0" layoutInCell="1" allowOverlap="1" wp14:anchorId="168BEE42" wp14:editId="11402129">
-                  <wp:simplePos x="0" y="0"/>
-                  <wp:positionH relativeFrom="column">
-                    <wp:posOffset>-228600</wp:posOffset>
-                  </wp:positionH>
-                  <wp:positionV relativeFrom="paragraph">
-                    <wp:posOffset>-572770</wp:posOffset>
-                  </wp:positionV>
-                  <wp:extent cx="0" cy="10191750"/>
-                  <wp:effectExtent l="19050" t="0" r="19050" b="0"/>
-                  <wp:wrapNone/>
-                  <wp:docPr id="27" name="Straight Connector 27"/>
-                  <wp:cNvGraphicFramePr/>
-                  <a:graphic xmlns:a="http://schemas.openxmlformats.org/drawingml/2006/main">
-                    <a:graphicData uri="http://schemas.microsoft.com/office/word/2010/wordprocessingShape">
-                      <wps:wsp>
-                        <wps:cNvCnPr/>
-                        <wps:spPr>
-                          <a:xfrm>
-                            <a:off x="0" y="0"/>
-                            <a:ext cx="0" cy="10191896"/>
-                          </a:xfrm>
-                          <a:prstGeom prst="line">
-                            <a:avLst/>
-                          </a:prstGeom>
-                          <a:ln w="38100"/>
-                        </wps:spPr>
-                        <wps:style>
-                          <a:lnRef idx="1">
-                            <a:schemeClr val="dk1"/>
-                          </a:lnRef>
-                          <a:fillRef idx="0">
-                            <a:schemeClr val="dk1"/>
-                          </a:fillRef>
-                          <a:effectRef idx="0">
-                            <a:schemeClr val="dk1"/>
-                          </a:effectRef>
-                          <a:fontRef idx="minor">
-                            <a:schemeClr val="tx1"/>
-                          </a:fontRef>
-                        </wps:style>
-                        <wps:bodyPr/>
-                      </wps:wsp>
-                    </a:graphicData>
-                  </a:graphic>
-                </wp:anchor>
-              </w:drawing>
-            </mc:Choice>
-            <mc:Fallback xmlns:wpsCustomData="http://www.wps.cn/officeDocument/2013/wpsCustomData">
-              <w:pict>
-                <v:line id="_x0000_s1026" o:spid="_x0000_s1026" o:spt="20" style="position:absolute;left:0pt;margin-left:-18pt;margin-top:-45.1pt;height:802.5pt;width:0pt;z-index:251660288;mso-width-relative:page;mso-height-relative:page;" filled="f" stroked="t" coordsize="21600,21600" o:gfxdata="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">
-                  <v:fill on="f" focussize="0,0"/>
-                  <v:stroke weight="3pt" color="#000000 [3200]" miterlimit="8" joinstyle="miter"/>
-                  <v:imagedata o:title=""/>
-                  <o:lock v:ext="edit" aspectratio="f"/>
-                </v:line>
-              </w:pict>
-            </mc:Fallback>
-          </mc:AlternateContent>
-        </w:r>
-        <w:r>
-          <w:rPr>
-            <w:rFonts w:ascii="Courier New" w:hAnsi="Courier New" w:cs="Courier New"/>
-            <w:b/>
-            <w:noProof/>
-            <w:sz w:val="36"/>
-            <w:lang w:eastAsia="en-PH"/>
-          </w:rPr>
-          <mc:AlternateContent>
-            <mc:Choice Requires="wps">
-              <w:drawing>
-                <wp:anchor distT="0" distB="0" distL="114300" distR="114300" simplePos="0" relativeHeight="251661312" behindDoc="0" locked="0" layoutInCell="1" allowOverlap="1" wp14:anchorId="6444EACC" wp14:editId="42F08A32">
-                  <wp:simplePos x="0" y="0"/>
-                  <wp:positionH relativeFrom="column">
-                    <wp:posOffset>5715000</wp:posOffset>
-                  </wp:positionH>
-                  <wp:positionV relativeFrom="paragraph">
-                    <wp:posOffset>-419735</wp:posOffset>
-                  </wp:positionV>
-                  <wp:extent cx="0" cy="10033635"/>
-                  <wp:effectExtent l="19050" t="0" r="19050" b="5715"/>
-                  <wp:wrapNone/>
-                  <wp:docPr id="28" name="Straight Connector 28"/>
-                  <wp:cNvGraphicFramePr/>
-                  <a:graphic xmlns:a="http://schemas.openxmlformats.org/drawingml/2006/main">
-                    <a:graphicData uri="http://schemas.microsoft.com/office/word/2010/wordprocessingShape">
-                      <wps:wsp>
-                        <wps:cNvCnPr/>
-                        <wps:spPr>
-                          <a:xfrm>
-                            <a:off x="0" y="0"/>
-                            <a:ext cx="0" cy="10033762"/>
-                          </a:xfrm>
-                          <a:prstGeom prst="line">
-                            <a:avLst/>
-                          </a:prstGeom>
-                          <a:ln w="38100"/>
-                        </wps:spPr>
-                        <wps:style>
-                          <a:lnRef idx="1">
-                            <a:schemeClr val="dk1"/>
-                          </a:lnRef>
-                          <a:fillRef idx="0">
-                            <a:schemeClr val="dk1"/>
-                          </a:fillRef>
-                          <a:effectRef idx="0">
-                            <a:schemeClr val="dk1"/>
-                          </a:effectRef>
-                          <a:fontRef idx="minor">
-                            <a:schemeClr val="tx1"/>
-                          </a:fontRef>
-                        </wps:style>
-                        <wps:bodyPr/>
-                      </wps:wsp>
-                    </a:graphicData>
-                  </a:graphic>
-                </wp:anchor>
-              </w:drawing>
-            </mc:Choice>
-            <mc:Fallback xmlns:wpsCustomData="http://www.wps.cn/officeDocument/2013/wpsCustomData">
-              <w:pict>
-                <v:line id="_x0000_s1026" o:spid="_x0000_s1026" o:spt="20" style="position:absolute;left:0pt;margin-left:450pt;margin-top:-33.05pt;height:790.05pt;width:0pt;z-index:251661312;mso-width-relative:page;mso-height-relative:page;" filled="f" stroked="t" coordsize="21600,21600" o:gfxdata="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">
-                  <v:fill on="f" focussize="0,0"/>
-                  <v:stroke weight="3pt" color="#000000 [3200]" miterlimit="8" joinstyle="miter"/>
-                  <v:imagedata o:title=""/>
-                  <o:lock v:ext="edit" aspectratio="f"/>
-                </v:line>
-              </w:pict>
-            </mc:Fallback>
-          </mc:AlternateContent>
-        </w:r>
-        <w:r>
-          <w:rPr>
-            <w:rFonts w:ascii="Courier New" w:hAnsi="Courier New" w:cs="Courier New"/>
-            <w:b/>
-            <w:sz w:val="36"/>
-          </w:rPr>
-          <w:t>Kalinga State University</w:t>
-        </w:r>
-      </w:p>
-      <w:p>
-        <w:pPr>
-          <w:pStyle w:val="Header"/>
-          <w:tabs>
-            <w:tab w:val="left" w:pos="2256"/>
-            <w:tab w:val="center" w:pos="4320"/>
-            <w:tab w:val="left" w:pos="6845"/>
-          </w:tabs>
-          <w:rPr>
-            <w:rFonts w:ascii="Courier New" w:hAnsi="Courier New" w:cs="Courier New"/>
-            <w:sz w:val="24"/>
-          </w:rPr>
-        </w:pPr>
-        <w:r>
-          <w:rPr>
-            <w:rFonts w:ascii="Courier New" w:hAnsi="Courier New" w:cs="Courier New"/>
-            <w:sz w:val="24"/>
-          </w:rPr>
-          <w:tab/>
-        </w:r>
-        <w:r>
-          <w:rPr>
-            <w:rFonts w:ascii="Courier New" w:hAnsi="Courier New" w:cs="Courier New"/>
-            <w:sz w:val="24"/>
-          </w:rPr>
-          <w:tab/>
-          <w:t>Bulanao, Tabuk City, Kalinga</w:t>
-        </w:r>
-      </w:p>
-      <w:p>
-        <w:pPr>
-          <w:pStyle w:val="Header"/>
-          <w:tabs>
-            <w:tab w:val="left" w:pos="2256"/>
-            <w:tab w:val="left" w:pos="2696"/>
-            <w:tab w:val="center" w:pos="4320"/>
-            <w:tab w:val="left" w:pos="8370"/>
-          </w:tabs>
-          <w:wordWrap w:val="0"/>
-          <w:jc w:val="center"/>
-          <w:rPr>
-            <w:rFonts w:ascii="Courier New" w:hAnsi="Courier New" w:cs="Courier New"/>
-            <w:sz w:val="20"/>
-            <w:szCs w:val="20"/>
-            <w:lang w:val="en-US"/>
-          </w:rPr>
-        </w:pPr>
-        <w:r>
-          <w:rPr>
-            <w:rFonts w:ascii="Courier New" w:hAnsi="Courier New" w:cs="Courier New"/>
-            <w:noProof/>
-            <w:lang w:eastAsia="en-PH"/>
-          </w:rPr>
-          <mc:AlternateContent>
-            <mc:Choice Requires="wps">
-              <w:drawing>
-                <wp:anchor distT="0" distB="0" distL="114300" distR="114300" simplePos="0" relativeHeight="251663360" behindDoc="0" locked="0" layoutInCell="1" allowOverlap="1" wp14:anchorId="20F28432" wp14:editId="12C63873">
-                  <wp:simplePos x="0" y="0"/>
-                  <wp:positionH relativeFrom="page">
-                    <wp:align>right</wp:align>
-                  </wp:positionH>
-                  <wp:positionV relativeFrom="paragraph">
-                    <wp:posOffset>204470</wp:posOffset>
-                  </wp:positionV>
-                  <wp:extent cx="7772400" cy="0"/>
-                  <wp:effectExtent l="0" t="19050" r="19050" b="19050"/>
-                  <wp:wrapNone/>
-                  <wp:docPr id="29" name="Straight Connector 29"/>
-                  <wp:cNvGraphicFramePr/>
-                  <a:graphic xmlns:a="http://schemas.openxmlformats.org/drawingml/2006/main">
-                    <a:graphicData uri="http://schemas.microsoft.com/office/word/2010/wordprocessingShape">
-                      <wps:wsp>
-                        <wps:cNvCnPr/>
-                        <wps:spPr>
-                          <a:xfrm>
-                            <a:off x="0" y="0"/>
-                            <a:ext cx="7772400" cy="0"/>
-                          </a:xfrm>
-                          <a:prstGeom prst="line">
-                            <a:avLst/>
-                          </a:prstGeom>
-                          <a:ln w="38100"/>
-                        </wps:spPr>
-                        <wps:style>
-                          <a:lnRef idx="1">
-                            <a:schemeClr val="dk1"/>
-                          </a:lnRef>
-                          <a:fillRef idx="0">
-                            <a:schemeClr val="dk1"/>
-                          </a:fillRef>
-                          <a:effectRef idx="0">
-                            <a:schemeClr val="dk1"/>
-                          </a:effectRef>
-                          <a:fontRef idx="minor">
-                            <a:schemeClr val="tx1"/>
-                          </a:fontRef>
-                        </wps:style>
-                        <wps:bodyPr/>
-                      </wps:wsp>
-                    </a:graphicData>
-                  </a:graphic>
-                </wp:anchor>
-              </w:drawing>
-            </mc:Choice>
-            <mc:Fallback xmlns:wpsCustomData="http://www.wps.cn/officeDocument/2013/wpsCustomData">
-              <w:pict>
-                <v:line id="_x0000_s1026" o:spid="_x0000_s1026" o:spt="20" style="position:absolute;left:0pt;margin-top:16.1pt;height:0pt;width:612pt;mso-position-horizontal:right;mso-position-horizontal-relative:page;z-index:251663360;mso-width-relative:page;mso-height-relative:page;" filled="f" stroked="t" coordsize="21600,21600" o:gfxdata="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">
-                  <v:fill on="f" focussize="0,0"/>
-                  <v:stroke weight="3pt" color="#000000 [3200]" miterlimit="8" joinstyle="miter"/>
-                  <v:imagedata o:title=""/>
-                  <o:lock v:ext="edit" aspectratio="f"/>
-                </v:line>
-              </w:pict>
-            </mc:Fallback>
-          </mc:AlternateContent>
-        </w:r>
-        <w:r>
-          <w:rPr>
-            <w:rFonts w:ascii="Courier New" w:hAnsi="Courier New" w:cs="Courier New"/>
-            <w:sz w:val="24"/>
-            <w:szCs w:val="24"/>
-            <w:lang w:val="en-US"/>
-          </w:rPr>
-          <w:t>College of Engineering and Information Technol</w:t>
-        </w:r>
-        <w:r>
-          <w:rPr>
-            <w:rFonts w:ascii="Courier New" w:hAnsi="Courier New" w:cs="Courier New"/>
-            <w:sz w:val="24"/>
-            <w:szCs w:val="24"/>
-            <w:lang w:val="en-US"/>
-          </w:rPr>
-          <w:t>og</w:t>
-        </w:r>
-      </w:p>
-      <w:p>
-        <w:pPr>
-          <w:pStyle w:val="Header"/>
-          <w:jc w:val="right"/>
-          <w:rPr>
-            <w:rFonts w:ascii="Courier New" w:hAnsi="Courier New" w:cs="Courier New"/>
-          </w:rPr>
-        </w:pPr>
-      </w:p>
-    </w:sdtContent>
-  </w:sdt>
-  <w:p>
-    <w:pPr>
-      <w:pStyle w:val="Header"/>
-      <w:rPr>
-        <w:rFonts w:ascii="Courier New" w:hAnsi="Courier New" w:cs="Courier New"/>
-      </w:rPr>
-    </w:pPr>
-  </w:p>
-</w:hdr>
-</file>
-
-<file path=word/header10.xml><?xml version="1.0" encoding="utf-8"?>
-<w:hdr xmlns:wpc="http://schemas.microsoft.com/office/word/2010/wordprocessingCanvas" xmlns:cx="http://schemas.microsoft.com/office/drawing/2014/chartex" xmlns:cx1="http://schemas.microsoft.com/office/drawing/2015/9/8/chartex" xmlns:cx2="http://schemas.microsoft.com/office/drawing/2015/10/21/chartex" xmlns:cx3="http://schemas.microsoft.com/office/drawing/2016/5/9/chartex" xmlns:cx4="http://schemas.microsoft.com/office/drawing/2016/5/10/chartex" xmlns:cx5="http://schemas.microsoft.com/office/drawing/2016/5/11/chartex" xmlns:cx6="http://schemas.microsoft.com/office/drawing/2016/5/12/chartex" xmlns:cx7="http://schemas.microsoft.com/office/drawing/2016/5/13/chartex" xmlns:cx8="http://schemas.microsoft.com/office/drawing/2016/5/14/chartex" xmlns:mc="http://schemas.openxmlformats.org/markup-compatibility/2006" xmlns:aink="http://schemas.microsoft.com/office/drawing/2016/ink" xmlns:am3d="http://schemas.microsoft.com/office/drawing/2017/model3d" xmlns:o="urn:schemas-microsoft-com:office:office" xmlns:oel="http://schemas.microsoft.com/office/2019/extlst" xmlns:r="http://schemas.openxmlformats.org/officeDocument/2006/relationships" xmlns:m="http://schemas.openxmlformats.org/officeDocument/2006/math" xmlns:v="urn:schemas-microsoft-com:vml" xmlns:wp14="http://schemas.microsoft.com/office/word/2010/wordprocessingDrawing" xmlns:wp="http://schemas.openxmlformats.org/drawingml/2006/wordprocessingDrawing" xmlns:w10="urn:schemas-microsoft-com:office:word" xmlns:w="http://schemas.openxmlformats.org/wordprocessingml/2006/main" xmlns:w14="http://schemas.microsoft.com/office/word/2010/wordml" xmlns:w15="http://schemas.microsoft.com/office/word/2012/wordml" xmlns:w16cex="http://schemas.microsoft.com/office/word/2018/wordml/cex" xmlns:w16cid="http://schemas.microsoft.com/office/word/2016/wordml/cid" xmlns:w16="http://schemas.microsoft.com/office/word/2018/wordml" xmlns:w16du="http://schemas.microsoft.com/office/word/2023/wordml/word16du" xmlns:w16sdtdh="http://schemas.microsoft.com/office/word/2020/wordml/sdtdatahash" xmlns:w16sdtfl="http://schemas.microsoft.com/office/word/2024/wordml/sdtformatlock" xmlns:w16se="http://schemas.microsoft.com/office/word/2015/wordml/symex" xmlns:wpg="http://schemas.microsoft.com/office/word/2010/wordprocessingGroup" xmlns:wpi="http://schemas.microsoft.com/office/word/2010/wordprocessingInk" xmlns:wne="http://schemas.microsoft.com/office/word/2006/wordml" xmlns:wps="http://schemas.microsoft.com/office/word/2010/wordprocessingShape" mc:Ignorable="w14 w15 w16se w16cid w16 w16cex w16sdtdh w16sdtfl w16du wp14">
-  <w:sdt>
-    <w:sdtPr>
-      <w:id w:val="1831483142"/>
-    </w:sdtPr>
-    <w:sdtEndPr>
-      <w:rPr>
-        <w:rFonts w:ascii="Courier New" w:hAnsi="Courier New" w:cs="Courier New"/>
-        <w:sz w:val="20"/>
-        <w:szCs w:val="20"/>
-      </w:rPr>
-    </w:sdtEndPr>
-    <w:sdtContent>
-      <w:p>
-        <w:pPr>
-          <w:pStyle w:val="Header"/>
-          <w:tabs>
-            <w:tab w:val="center" w:pos="4321"/>
-            <w:tab w:val="right" w:pos="8642"/>
-          </w:tabs>
-          <w:rPr>
-            <w:rFonts w:ascii="Courier New" w:hAnsi="Courier New" w:cs="Courier New"/>
-            <w:b/>
-            <w:sz w:val="32"/>
-          </w:rPr>
-        </w:pPr>
-        <w:r>
-          <w:tab/>
-        </w:r>
-        <w:r>
-          <w:rPr>
-            <w:rFonts w:ascii="Courier New" w:hAnsi="Courier New" w:cs="Courier New"/>
-            <w:b/>
-            <w:noProof/>
-            <w:sz w:val="36"/>
-            <w:lang w:eastAsia="en-PH"/>
-          </w:rPr>
-          <w:drawing>
-            <wp:anchor distT="0" distB="0" distL="114300" distR="114300" simplePos="0" relativeHeight="251720704" behindDoc="0" locked="0" layoutInCell="1" allowOverlap="1" wp14:anchorId="2D4E91FD" wp14:editId="3A435028">
-              <wp:simplePos x="0" y="0"/>
-              <wp:positionH relativeFrom="column">
-                <wp:posOffset>-246380</wp:posOffset>
-              </wp:positionH>
-              <wp:positionV relativeFrom="paragraph">
-                <wp:posOffset>-198120</wp:posOffset>
-              </wp:positionV>
-              <wp:extent cx="823595" cy="724535"/>
-              <wp:effectExtent l="0" t="0" r="14605" b="18415"/>
-              <wp:wrapNone/>
-              <wp:docPr id="2026318676" name="Picture 2026318676"/>
-              <wp:cNvGraphicFramePr>
-                <a:graphicFrameLocks xmlns:a="http://schemas.openxmlformats.org/drawingml/2006/main" noChangeAspect="1"/>
-              </wp:cNvGraphicFramePr>
-              <a:graphic xmlns:a="http://schemas.openxmlformats.org/drawingml/2006/main">
-                <a:graphicData uri="http://schemas.openxmlformats.org/drawingml/2006/picture">
-                  <pic:pic xmlns:pic="http://schemas.openxmlformats.org/drawingml/2006/picture">
-                    <pic:nvPicPr>
-                      <pic:cNvPr id="700363394" name="Picture 700363394"/>
-                      <pic:cNvPicPr>
-                        <a:picLocks noChangeAspect="1"/>
-                      </pic:cNvPicPr>
-                    </pic:nvPicPr>
-                    <pic:blipFill>
-                      <a:blip r:embed="rId1">
-                        <a:extLst>
-                          <a:ext uri="{28A0092B-C50C-407E-A947-70E740481C1C}">
-                            <a14:useLocalDpi xmlns:a14="http://schemas.microsoft.com/office/drawing/2010/main" val="0"/>
-                          </a:ext>
-                        </a:extLst>
-                      </a:blip>
-                      <a:stretch>
-                        <a:fillRect/>
-                      </a:stretch>
-                    </pic:blipFill>
-                    <pic:spPr>
-                      <a:xfrm>
-                        <a:off x="0" y="0"/>
-                        <a:ext cx="823578" cy="724710"/>
-                      </a:xfrm>
-                      <a:prstGeom prst="rect">
-                        <a:avLst/>
-                      </a:prstGeom>
-                    </pic:spPr>
-                  </pic:pic>
-                </a:graphicData>
-              </a:graphic>
-            </wp:anchor>
-          </w:drawing>
-        </w:r>
-        <w:r>
-          <w:rPr>
-            <w:rFonts w:ascii="Courier New" w:hAnsi="Courier New" w:cs="Courier New"/>
-            <w:b/>
-            <w:noProof/>
-            <w:sz w:val="32"/>
-            <w:lang w:eastAsia="en-PH"/>
-          </w:rPr>
-          <mc:AlternateContent>
-            <mc:Choice Requires="wps">
-              <w:drawing>
-                <wp:anchor distT="0" distB="0" distL="114300" distR="114300" simplePos="0" relativeHeight="251723776" behindDoc="0" locked="0" layoutInCell="1" allowOverlap="1" wp14:anchorId="4366DFAE" wp14:editId="5C9FE52F">
-                  <wp:simplePos x="0" y="0"/>
-                  <wp:positionH relativeFrom="column">
-                    <wp:posOffset>-1371600</wp:posOffset>
-                  </wp:positionH>
-                  <wp:positionV relativeFrom="paragraph">
-                    <wp:posOffset>-287020</wp:posOffset>
-                  </wp:positionV>
-                  <wp:extent cx="7772400" cy="0"/>
-                  <wp:effectExtent l="0" t="19050" r="0" b="19050"/>
-                  <wp:wrapNone/>
-                  <wp:docPr id="2030725421" name="Straight Connector 2030725421"/>
-                  <wp:cNvGraphicFramePr/>
-                  <a:graphic xmlns:a="http://schemas.openxmlformats.org/drawingml/2006/main">
-                    <a:graphicData uri="http://schemas.microsoft.com/office/word/2010/wordprocessingShape">
-                      <wps:wsp>
-                        <wps:cNvCnPr/>
-                        <wps:spPr>
-                          <a:xfrm>
-                            <a:off x="0" y="0"/>
-                            <a:ext cx="7772400" cy="0"/>
-                          </a:xfrm>
-                          <a:prstGeom prst="line">
-                            <a:avLst/>
-                          </a:prstGeom>
-                          <a:ln w="38100"/>
-                        </wps:spPr>
-                        <wps:style>
-                          <a:lnRef idx="1">
-                            <a:schemeClr val="dk1"/>
-                          </a:lnRef>
-                          <a:fillRef idx="0">
-                            <a:schemeClr val="dk1"/>
-                          </a:fillRef>
-                          <a:effectRef idx="0">
-                            <a:schemeClr val="dk1"/>
-                          </a:effectRef>
-                          <a:fontRef idx="minor">
-                            <a:schemeClr val="tx1"/>
-                          </a:fontRef>
-                        </wps:style>
-                        <wps:bodyPr/>
-                      </wps:wsp>
-                    </a:graphicData>
-                  </a:graphic>
-                </wp:anchor>
-              </w:drawing>
-            </mc:Choice>
-            <mc:Fallback>
-              <w:pict>
-                <v:line w14:anchorId="464CD259" id="Straight Connector 2030725421" o:spid="_x0000_s1026" style="position:absolute;z-index:251723776;visibility:visible;mso-wrap-style:square;mso-wrap-distance-left:9pt;mso-wrap-distance-top:0;mso-wrap-distance-right:9pt;mso-wrap-distance-bottom:0;mso-position-horizontal:absolute;mso-position-horizontal-relative:text;mso-position-vertical:absolute;mso-position-vertical-relative:text" from="-108pt,-22.6pt" to="7in,-22.6pt" o:gfxdata="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" strokecolor="black [3200]" strokeweight="3pt">
-                  <v:stroke joinstyle="miter"/>
-                </v:line>
-              </w:pict>
-            </mc:Fallback>
-          </mc:AlternateContent>
-        </w:r>
-        <w:r>
-          <w:rPr>
-            <w:rFonts w:ascii="Courier New" w:hAnsi="Courier New" w:cs="Courier New"/>
-            <w:b/>
-            <w:noProof/>
-            <w:sz w:val="36"/>
-            <w:lang w:eastAsia="en-PH"/>
-          </w:rPr>
-          <mc:AlternateContent>
-            <mc:Choice Requires="wps">
-              <w:drawing>
-                <wp:anchor distT="0" distB="0" distL="114300" distR="114300" simplePos="0" relativeHeight="251721728" behindDoc="0" locked="0" layoutInCell="1" allowOverlap="1" wp14:anchorId="7D282725" wp14:editId="0872A5F0">
-                  <wp:simplePos x="0" y="0"/>
-                  <wp:positionH relativeFrom="column">
-                    <wp:posOffset>-228600</wp:posOffset>
-                  </wp:positionH>
-                  <wp:positionV relativeFrom="paragraph">
-                    <wp:posOffset>-572770</wp:posOffset>
-                  </wp:positionV>
-                  <wp:extent cx="0" cy="10191750"/>
-                  <wp:effectExtent l="19050" t="0" r="19050" b="0"/>
-                  <wp:wrapNone/>
-                  <wp:docPr id="904603731" name="Straight Connector 904603731"/>
-                  <wp:cNvGraphicFramePr/>
-                  <a:graphic xmlns:a="http://schemas.openxmlformats.org/drawingml/2006/main">
-                    <a:graphicData uri="http://schemas.microsoft.com/office/word/2010/wordprocessingShape">
-                      <wps:wsp>
-                        <wps:cNvCnPr/>
-                        <wps:spPr>
-                          <a:xfrm>
-                            <a:off x="0" y="0"/>
-                            <a:ext cx="0" cy="10191896"/>
-                          </a:xfrm>
-                          <a:prstGeom prst="line">
-                            <a:avLst/>
-                          </a:prstGeom>
-                          <a:ln w="38100"/>
-                        </wps:spPr>
-                        <wps:style>
-                          <a:lnRef idx="1">
-                            <a:schemeClr val="dk1"/>
-                          </a:lnRef>
-                          <a:fillRef idx="0">
-                            <a:schemeClr val="dk1"/>
-                          </a:fillRef>
-                          <a:effectRef idx="0">
-                            <a:schemeClr val="dk1"/>
-                          </a:effectRef>
-                          <a:fontRef idx="minor">
-                            <a:schemeClr val="tx1"/>
-                          </a:fontRef>
-                        </wps:style>
-                        <wps:bodyPr/>
-                      </wps:wsp>
-                    </a:graphicData>
-                  </a:graphic>
-                </wp:anchor>
-              </w:drawing>
-            </mc:Choice>
-            <mc:Fallback>
-              <w:pict>
-                <v:line w14:anchorId="41B0706A" id="Straight Connector 904603731" o:spid="_x0000_s1026" style="position:absolute;z-index:251721728;visibility:visible;mso-wrap-style:square;mso-wrap-distance-left:9pt;mso-wrap-distance-top:0;mso-wrap-distance-right:9pt;mso-wrap-distance-bottom:0;mso-position-horizontal:absolute;mso-position-horizontal-relative:text;mso-position-vertical:absolute;mso-position-vertical-relative:text" from="-18pt,-45.1pt" to="-18pt,757.4pt" o:gfxdata="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" strokecolor="black [3200]" strokeweight="3pt">
-                  <v:stroke joinstyle="miter"/>
-                </v:line>
-              </w:pict>
-            </mc:Fallback>
-          </mc:AlternateContent>
-        </w:r>
-        <w:r>
-          <w:rPr>
-            <w:rFonts w:ascii="Courier New" w:hAnsi="Courier New" w:cs="Courier New"/>
-            <w:b/>
-            <w:noProof/>
-            <w:sz w:val="36"/>
-            <w:lang w:eastAsia="en-PH"/>
-          </w:rPr>
-          <mc:AlternateContent>
-            <mc:Choice Requires="wps">
-              <w:drawing>
-                <wp:anchor distT="0" distB="0" distL="114300" distR="114300" simplePos="0" relativeHeight="251722752" behindDoc="0" locked="0" layoutInCell="1" allowOverlap="1" wp14:anchorId="3154A674" wp14:editId="178287CF">
-                  <wp:simplePos x="0" y="0"/>
-                  <wp:positionH relativeFrom="column">
-                    <wp:posOffset>5715000</wp:posOffset>
-                  </wp:positionH>
-                  <wp:positionV relativeFrom="paragraph">
-                    <wp:posOffset>-419735</wp:posOffset>
-                  </wp:positionV>
-                  <wp:extent cx="0" cy="10033635"/>
-                  <wp:effectExtent l="19050" t="0" r="19050" b="5715"/>
-                  <wp:wrapNone/>
-                  <wp:docPr id="1590466236" name="Straight Connector 1590466236"/>
-                  <wp:cNvGraphicFramePr/>
-                  <a:graphic xmlns:a="http://schemas.openxmlformats.org/drawingml/2006/main">
-                    <a:graphicData uri="http://schemas.microsoft.com/office/word/2010/wordprocessingShape">
-                      <wps:wsp>
-                        <wps:cNvCnPr/>
-                        <wps:spPr>
-                          <a:xfrm>
-                            <a:off x="0" y="0"/>
-                            <a:ext cx="0" cy="10033762"/>
-                          </a:xfrm>
-                          <a:prstGeom prst="line">
-                            <a:avLst/>
-                          </a:prstGeom>
-                          <a:ln w="38100"/>
-                        </wps:spPr>
-                        <wps:style>
-                          <a:lnRef idx="1">
-                            <a:schemeClr val="dk1"/>
-                          </a:lnRef>
-                          <a:fillRef idx="0">
-                            <a:schemeClr val="dk1"/>
-                          </a:fillRef>
-                          <a:effectRef idx="0">
-                            <a:schemeClr val="dk1"/>
-                          </a:effectRef>
-                          <a:fontRef idx="minor">
-                            <a:schemeClr val="tx1"/>
-                          </a:fontRef>
-                        </wps:style>
-                        <wps:bodyPr/>
-                      </wps:wsp>
-                    </a:graphicData>
-                  </a:graphic>
-                </wp:anchor>
-              </w:drawing>
-            </mc:Choice>
-            <mc:Fallback>
-              <w:pict>
-                <v:line w14:anchorId="188C4CA3" id="Straight Connector 1590466236" o:spid="_x0000_s1026" style="position:absolute;z-index:251722752;visibility:visible;mso-wrap-style:square;mso-wrap-distance-left:9pt;mso-wrap-distance-top:0;mso-wrap-distance-right:9pt;mso-wrap-distance-bottom:0;mso-position-horizontal:absolute;mso-position-horizontal-relative:text;mso-position-vertical:absolute;mso-position-vertical-relative:text" from="450pt,-33.05pt" to="450pt,757pt" o:gfxdata="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" strokecolor="black [3200]" strokeweight="3pt">
-                  <v:stroke joinstyle="miter"/>
-                </v:line>
-              </w:pict>
-            </mc:Fallback>
-          </mc:AlternateContent>
-        </w:r>
-        <w:r>
-          <w:rPr>
-            <w:rFonts w:ascii="Courier New" w:hAnsi="Courier New" w:cs="Courier New"/>
-            <w:b/>
-            <w:sz w:val="36"/>
-          </w:rPr>
-          <w:t>Kalinga State University</w:t>
-        </w:r>
-        <w:r>
-          <w:rPr>
-            <w:rFonts w:ascii="Courier New" w:hAnsi="Courier New" w:cs="Courier New"/>
-            <w:b/>
-            <w:sz w:val="36"/>
-          </w:rPr>
-          <w:tab/>
-        </w:r>
-      </w:p>
-      <w:p>
-        <w:pPr>
-          <w:pStyle w:val="Header"/>
-          <w:tabs>
-            <w:tab w:val="clear" w:pos="9360"/>
-            <w:tab w:val="left" w:pos="2256"/>
-            <w:tab w:val="center" w:pos="4320"/>
-            <w:tab w:val="right" w:pos="8642"/>
-          </w:tabs>
-          <w:rPr>
-            <w:rFonts w:ascii="Courier New" w:hAnsi="Courier New" w:cs="Courier New"/>
-            <w:sz w:val="24"/>
-          </w:rPr>
-        </w:pPr>
-        <w:r>
-          <w:rPr>
-            <w:rFonts w:ascii="Courier New" w:hAnsi="Courier New" w:cs="Courier New"/>
-            <w:sz w:val="24"/>
-          </w:rPr>
-          <w:tab/>
-        </w:r>
-        <w:r>
-          <w:rPr>
-            <w:rFonts w:ascii="Courier New" w:hAnsi="Courier New" w:cs="Courier New"/>
-            <w:sz w:val="24"/>
-          </w:rPr>
-          <w:tab/>
-          <w:t>Bulanao, Tabuk City, Kalinga</w:t>
-        </w:r>
-      </w:p>
-      <w:p>
-        <w:pPr>
-          <w:pStyle w:val="Header"/>
-          <w:tabs>
-            <w:tab w:val="clear" w:pos="9360"/>
-            <w:tab w:val="left" w:pos="2256"/>
-            <w:tab w:val="center" w:pos="4320"/>
-            <w:tab w:val="right" w:pos="8642"/>
-          </w:tabs>
-          <w:rPr>
-            <w:rFonts w:ascii="Courier New" w:hAnsi="Courier New" w:cs="Courier New"/>
-            <w:sz w:val="24"/>
-          </w:rPr>
-        </w:pPr>
-        <w:r>
-          <w:rPr>
-            <w:rFonts w:ascii="Courier New" w:hAnsi="Courier New" w:cs="Courier New"/>
-            <w:sz w:val="24"/>
-          </w:rPr>
-          <w:tab/>
-        </w:r>
-      </w:p>
-      <w:p>
-        <w:pPr>
-          <w:pStyle w:val="Header"/>
-          <w:jc w:val="right"/>
-          <w:rPr>
-            <w:rFonts w:ascii="Courier New" w:hAnsi="Courier New" w:cs="Courier New"/>
-            <w:sz w:val="20"/>
-            <w:szCs w:val="20"/>
-          </w:rPr>
-        </w:pPr>
-      </w:p>
-    </w:sdtContent>
-  </w:sdt>
-  <w:p>
-    <w:pPr>
-      <w:pStyle w:val="Header"/>
-      <w:rPr>
-        <w:rFonts w:ascii="Courier New" w:hAnsi="Courier New" w:cs="Courier New"/>
-      </w:rPr>
-    </w:pPr>
-  </w:p>
-</w:hdr>
-</file>
-
-<file path=word/header2.xml><?xml version="1.0" encoding="utf-8"?>
-<w:hdr xmlns:wpc="http://schemas.microsoft.com/office/word/2010/wordprocessingCanvas" xmlns:cx="http://schemas.microsoft.com/office/drawing/2014/chartex" xmlns:cx1="http://schemas.microsoft.com/office/drawing/2015/9/8/chartex" xmlns:cx2="http://schemas.microsoft.com/office/drawing/2015/10/21/chartex" xmlns:cx3="http://schemas.microsoft.com/office/drawing/2016/5/9/chartex" xmlns:cx4="http://schemas.microsoft.com/office/drawing/2016/5/10/chartex" xmlns:cx5="http://schemas.microsoft.com/office/drawing/2016/5/11/chartex" xmlns:cx6="http://schemas.microsoft.com/office/drawing/2016/5/12/chartex" xmlns:cx7="http://schemas.microsoft.com/office/drawing/2016/5/13/chartex" xmlns:cx8="http://schemas.microsoft.com/office/drawing/2016/5/14/chartex" xmlns:mc="http://schemas.openxmlformats.org/markup-compatibility/2006" xmlns:aink="http://schemas.microsoft.com/office/drawing/2016/ink" xmlns:am3d="http://schemas.microsoft.com/office/drawing/2017/model3d" xmlns:o="urn:schemas-microsoft-com:office:office" xmlns:oel="http://schemas.microsoft.com/office/2019/extlst" xmlns:r="http://schemas.openxmlformats.org/officeDocument/2006/relationships" xmlns:m="http://schemas.openxmlformats.org/officeDocument/2006/math" xmlns:v="urn:schemas-microsoft-com:vml" xmlns:wp14="http://schemas.microsoft.com/office/word/2010/wordprocessingDrawing" xmlns:wp="http://schemas.openxmlformats.org/drawingml/2006/wordprocessingDrawing" xmlns:w10="urn:schemas-microsoft-com:office:word" xmlns:w="http://schemas.openxmlformats.org/wordprocessingml/2006/main" xmlns:w14="http://schemas.microsoft.com/office/word/2010/wordml" xmlns:w15="http://schemas.microsoft.com/office/word/2012/wordml" xmlns:w16cex="http://schemas.microsoft.com/office/word/2018/wordml/cex" xmlns:w16cid="http://schemas.microsoft.com/office/word/2016/wordml/cid" xmlns:w16="http://schemas.microsoft.com/office/word/2018/wordml" xmlns:w16du="http://schemas.microsoft.com/office/word/2023/wordml/word16du" xmlns:w16sdtdh="http://schemas.microsoft.com/office/word/2020/wordml/sdtdatahash" xmlns:w16sdtfl="http://schemas.microsoft.com/office/word/2024/wordml/sdtformatlock" xmlns:w16se="http://schemas.microsoft.com/office/word/2015/wordml/symex" xmlns:wpg="http://schemas.microsoft.com/office/word/2010/wordprocessingGroup" xmlns:wpi="http://schemas.microsoft.com/office/word/2010/wordprocessingInk" xmlns:wne="http://schemas.microsoft.com/office/word/2006/wordml" xmlns:wps="http://schemas.microsoft.com/office/word/2010/wordprocessingShape" mc:Ignorable="w14 w15 w16se w16cid w16 w16cex w16sdtdh w16sdtfl w16du wp14">
-  <w:sdt>
-    <w:sdtPr>
-      <w:id w:val="-1703087207"/>
-    </w:sdtPr>
-    <w:sdtEndPr>
-      <w:rPr>
-        <w:rFonts w:ascii="Courier New" w:hAnsi="Courier New" w:cs="Courier New"/>
-      </w:rPr>
-    </w:sdtEndPr>
-    <w:sdtContent>
-      <w:p>
-        <w:pPr>
-          <w:pStyle w:val="Header"/>
-          <w:rPr>
-            <w:rFonts w:ascii="Courier New" w:hAnsi="Courier New" w:cs="Courier New"/>
-            <w:sz w:val="20"/>
-            <w:szCs w:val="20"/>
-          </w:rPr>
-        </w:pPr>
-      </w:p>
-      <w:p>
-        <w:pPr>
-          <w:pStyle w:val="Header"/>
-          <w:jc w:val="right"/>
-          <w:rPr>
-            <w:rFonts w:ascii="Courier New" w:hAnsi="Courier New" w:cs="Courier New"/>
-          </w:rPr>
-        </w:pPr>
-      </w:p>
-    </w:sdtContent>
-  </w:sdt>
-  <w:p>
-    <w:pPr>
-      <w:pStyle w:val="Header"/>
-    </w:pPr>
-  </w:p>
-</w:hdr>
-</file>
-
-<file path=word/header3.xml><?xml version="1.0" encoding="utf-8"?>
-<w:hdr xmlns:wpc="http://schemas.microsoft.com/office/word/2010/wordprocessingCanvas" xmlns:cx="http://schemas.microsoft.com/office/drawing/2014/chartex" xmlns:cx1="http://schemas.microsoft.com/office/drawing/2015/9/8/chartex" xmlns:cx2="http://schemas.microsoft.com/office/drawing/2015/10/21/chartex" xmlns:cx3="http://schemas.microsoft.com/office/drawing/2016/5/9/chartex" xmlns:cx4="http://schemas.microsoft.com/office/drawing/2016/5/10/chartex" xmlns:cx5="http://schemas.microsoft.com/office/drawing/2016/5/11/chartex" xmlns:cx6="http://schemas.microsoft.com/office/drawing/2016/5/12/chartex" xmlns:cx7="http://schemas.microsoft.com/office/drawing/2016/5/13/chartex" xmlns:cx8="http://schemas.microsoft.com/office/drawing/2016/5/14/chartex" xmlns:mc="http://schemas.openxmlformats.org/markup-compatibility/2006" xmlns:aink="http://schemas.microsoft.com/office/drawing/2016/ink" xmlns:am3d="http://schemas.microsoft.com/office/drawing/2017/model3d" xmlns:o="urn:schemas-microsoft-com:office:office" xmlns:oel="http://schemas.microsoft.com/office/2019/extlst" xmlns:r="http://schemas.openxmlformats.org/officeDocument/2006/relationships" xmlns:m="http://schemas.openxmlformats.org/officeDocument/2006/math" xmlns:v="urn:schemas-microsoft-com:vml" xmlns:wp14="http://schemas.microsoft.com/office/word/2010/wordprocessingDrawing" xmlns:wp="http://schemas.openxmlformats.org/drawingml/2006/wordprocessingDrawing" xmlns:w10="urn:schemas-microsoft-com:office:word" xmlns:w="http://schemas.openxmlformats.org/wordprocessingml/2006/main" xmlns:w14="http://schemas.microsoft.com/office/word/2010/wordml" xmlns:w15="http://schemas.microsoft.com/office/word/2012/wordml" xmlns:w16cex="http://schemas.microsoft.com/office/word/2018/wordml/cex" xmlns:w16cid="http://schemas.microsoft.com/office/word/2016/wordml/cid" xmlns:w16="http://schemas.microsoft.com/office/word/2018/wordml" xmlns:w16du="http://schemas.microsoft.com/office/word/2023/wordml/word16du" xmlns:w16sdtdh="http://schemas.microsoft.com/office/word/2020/wordml/sdtdatahash" xmlns:w16sdtfl="http://schemas.microsoft.com/office/word/2024/wordml/sdtformatlock" xmlns:w16se="http://schemas.microsoft.com/office/word/2015/wordml/symex" xmlns:wpg="http://schemas.microsoft.com/office/word/2010/wordprocessingGroup" xmlns:wpi="http://schemas.microsoft.com/office/word/2010/wordprocessingInk" xmlns:wne="http://schemas.microsoft.com/office/word/2006/wordml" xmlns:wps="http://schemas.microsoft.com/office/word/2010/wordprocessingShape" mc:Ignorable="w14 w15 w16se w16cid w16 w16cex w16sdtdh w16sdtfl w16du wp14">
-  <w:sdt>
-    <w:sdtPr>
-      <w:id w:val="-2043657299"/>
-    </w:sdtPr>
-    <w:sdtEndPr>
-      <w:rPr>
-        <w:rFonts w:ascii="Courier New" w:hAnsi="Courier New" w:cs="Courier New"/>
-        <w:sz w:val="20"/>
-        <w:szCs w:val="20"/>
-      </w:rPr>
-    </w:sdtEndPr>
-    <w:sdtContent>
-      <w:p>
-        <w:pPr>
-          <w:pStyle w:val="Header"/>
-          <w:tabs>
-            <w:tab w:val="center" w:pos="4321"/>
-            <w:tab w:val="right" w:pos="8642"/>
-          </w:tabs>
-          <w:rPr>
-            <w:rFonts w:ascii="Courier New" w:hAnsi="Courier New" w:cs="Courier New"/>
-            <w:b/>
-            <w:sz w:val="32"/>
-          </w:rPr>
-        </w:pPr>
-        <w:r>
-          <w:tab/>
-        </w:r>
-        <w:r>
-          <w:rPr>
-            <w:rFonts w:ascii="Courier New" w:hAnsi="Courier New" w:cs="Courier New"/>
-            <w:b/>
-            <w:noProof/>
-            <w:sz w:val="36"/>
-            <w:lang w:eastAsia="en-PH"/>
-          </w:rPr>
-          <w:drawing>
-            <wp:anchor distT="0" distB="0" distL="114300" distR="114300" simplePos="0" relativeHeight="251689984" behindDoc="0" locked="0" layoutInCell="1" allowOverlap="1" wp14:anchorId="00447CAF" wp14:editId="5E6FF2AE">
-              <wp:simplePos x="0" y="0"/>
-              <wp:positionH relativeFrom="column">
-                <wp:posOffset>-246380</wp:posOffset>
-              </wp:positionH>
-              <wp:positionV relativeFrom="paragraph">
-                <wp:posOffset>-198120</wp:posOffset>
-              </wp:positionV>
-              <wp:extent cx="823595" cy="724535"/>
-              <wp:effectExtent l="0" t="0" r="14605" b="18415"/>
-              <wp:wrapNone/>
-              <wp:docPr id="677353772" name="Picture 677353772"/>
-              <wp:cNvGraphicFramePr>
-                <a:graphicFrameLocks xmlns:a="http://schemas.openxmlformats.org/drawingml/2006/main" noChangeAspect="1"/>
-              </wp:cNvGraphicFramePr>
-              <a:graphic xmlns:a="http://schemas.openxmlformats.org/drawingml/2006/main">
-                <a:graphicData uri="http://schemas.openxmlformats.org/drawingml/2006/picture">
-                  <pic:pic xmlns:pic="http://schemas.openxmlformats.org/drawingml/2006/picture">
-                    <pic:nvPicPr>
-                      <pic:cNvPr id="700363394" name="Picture 700363394"/>
-                      <pic:cNvPicPr>
-                        <a:picLocks noChangeAspect="1"/>
-                      </pic:cNvPicPr>
-                    </pic:nvPicPr>
-                    <pic:blipFill>
-                      <a:blip r:embed="rId1">
-                        <a:extLst>
-                          <a:ext uri="{28A0092B-C50C-407E-A947-70E740481C1C}">
-                            <a14:useLocalDpi xmlns:a14="http://schemas.microsoft.com/office/drawing/2010/main" val="0"/>
-                          </a:ext>
-                        </a:extLst>
-                      </a:blip>
-                      <a:stretch>
-                        <a:fillRect/>
-                      </a:stretch>
-                    </pic:blipFill>
-                    <pic:spPr>
-                      <a:xfrm>
-                        <a:off x="0" y="0"/>
-                        <a:ext cx="823578" cy="724710"/>
-                      </a:xfrm>
-                      <a:prstGeom prst="rect">
-                        <a:avLst/>
-                      </a:prstGeom>
-                    </pic:spPr>
-                  </pic:pic>
-                </a:graphicData>
-              </a:graphic>
-            </wp:anchor>
-          </w:drawing>
-        </w:r>
-        <w:r>
-          <w:rPr>
-            <w:rFonts w:ascii="Courier New" w:hAnsi="Courier New" w:cs="Courier New"/>
-            <w:b/>
-            <w:noProof/>
-            <w:sz w:val="32"/>
-            <w:lang w:eastAsia="en-PH"/>
-          </w:rPr>
-          <mc:AlternateContent>
-            <mc:Choice Requires="wps">
-              <w:drawing>
-                <wp:anchor distT="0" distB="0" distL="114300" distR="114300" simplePos="0" relativeHeight="251693056" behindDoc="0" locked="0" layoutInCell="1" allowOverlap="1" wp14:anchorId="07BDE464" wp14:editId="1AEF96C3">
-                  <wp:simplePos x="0" y="0"/>
-                  <wp:positionH relativeFrom="column">
-                    <wp:posOffset>-1371600</wp:posOffset>
-                  </wp:positionH>
-                  <wp:positionV relativeFrom="paragraph">
-                    <wp:posOffset>-287020</wp:posOffset>
-                  </wp:positionV>
-                  <wp:extent cx="7772400" cy="0"/>
-                  <wp:effectExtent l="0" t="19050" r="0" b="19050"/>
-                  <wp:wrapNone/>
-                  <wp:docPr id="1610957626" name="Straight Connector 1610957626"/>
-                  <wp:cNvGraphicFramePr/>
-                  <a:graphic xmlns:a="http://schemas.openxmlformats.org/drawingml/2006/main">
-                    <a:graphicData uri="http://schemas.microsoft.com/office/word/2010/wordprocessingShape">
-                      <wps:wsp>
-                        <wps:cNvCnPr/>
-                        <wps:spPr>
-                          <a:xfrm>
-                            <a:off x="0" y="0"/>
-                            <a:ext cx="7772400" cy="0"/>
-                          </a:xfrm>
-                          <a:prstGeom prst="line">
-                            <a:avLst/>
-                          </a:prstGeom>
-                          <a:ln w="38100"/>
-                        </wps:spPr>
-                        <wps:style>
-                          <a:lnRef idx="1">
-                            <a:schemeClr val="dk1"/>
-                          </a:lnRef>
-                          <a:fillRef idx="0">
-                            <a:schemeClr val="dk1"/>
-                          </a:fillRef>
-                          <a:effectRef idx="0">
-                            <a:schemeClr val="dk1"/>
-                          </a:effectRef>
-                          <a:fontRef idx="minor">
-                            <a:schemeClr val="tx1"/>
-                          </a:fontRef>
-                        </wps:style>
-                        <wps:bodyPr/>
-                      </wps:wsp>
-                    </a:graphicData>
-                  </a:graphic>
-                </wp:anchor>
-              </w:drawing>
-            </mc:Choice>
-            <mc:Fallback>
-              <w:pict>
-                <v:line w14:anchorId="521049B0" id="Straight Connector 1610957626" o:spid="_x0000_s1026" style="position:absolute;z-index:251693056;visibility:visible;mso-wrap-style:square;mso-wrap-distance-left:9pt;mso-wrap-distance-top:0;mso-wrap-distance-right:9pt;mso-wrap-distance-bottom:0;mso-position-horizontal:absolute;mso-position-horizontal-relative:text;mso-position-vertical:absolute;mso-position-vertical-relative:text" from="-108pt,-22.6pt" to="7in,-22.6pt" o:gfxdata="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" strokecolor="black [3200]" strokeweight="3pt">
-                  <v:stroke joinstyle="miter"/>
-                </v:line>
-              </w:pict>
-            </mc:Fallback>
-          </mc:AlternateContent>
-        </w:r>
-        <w:r>
-          <w:rPr>
-            <w:rFonts w:ascii="Courier New" w:hAnsi="Courier New" w:cs="Courier New"/>
-            <w:b/>
-            <w:noProof/>
-            <w:sz w:val="36"/>
-            <w:lang w:eastAsia="en-PH"/>
-          </w:rPr>
-          <mc:AlternateContent>
-            <mc:Choice Requires="wps">
-              <w:drawing>
-                <wp:anchor distT="0" distB="0" distL="114300" distR="114300" simplePos="0" relativeHeight="251691008" behindDoc="0" locked="0" layoutInCell="1" allowOverlap="1" wp14:anchorId="747786C9" wp14:editId="287AC5F5">
-                  <wp:simplePos x="0" y="0"/>
-                  <wp:positionH relativeFrom="column">
-                    <wp:posOffset>-228600</wp:posOffset>
-                  </wp:positionH>
-                  <wp:positionV relativeFrom="paragraph">
-                    <wp:posOffset>-572770</wp:posOffset>
-                  </wp:positionV>
-                  <wp:extent cx="0" cy="10191750"/>
-                  <wp:effectExtent l="19050" t="0" r="19050" b="0"/>
-                  <wp:wrapNone/>
-                  <wp:docPr id="399371092" name="Straight Connector 399371092"/>
-                  <wp:cNvGraphicFramePr/>
-                  <a:graphic xmlns:a="http://schemas.openxmlformats.org/drawingml/2006/main">
-                    <a:graphicData uri="http://schemas.microsoft.com/office/word/2010/wordprocessingShape">
-                      <wps:wsp>
-                        <wps:cNvCnPr/>
-                        <wps:spPr>
-                          <a:xfrm>
-                            <a:off x="0" y="0"/>
-                            <a:ext cx="0" cy="10191896"/>
-                          </a:xfrm>
-                          <a:prstGeom prst="line">
-                            <a:avLst/>
-                          </a:prstGeom>
-                          <a:ln w="38100"/>
-                        </wps:spPr>
-                        <wps:style>
-                          <a:lnRef idx="1">
-                            <a:schemeClr val="dk1"/>
-                          </a:lnRef>
-                          <a:fillRef idx="0">
-                            <a:schemeClr val="dk1"/>
-                          </a:fillRef>
-                          <a:effectRef idx="0">
-                            <a:schemeClr val="dk1"/>
-                          </a:effectRef>
-                          <a:fontRef idx="minor">
-                            <a:schemeClr val="tx1"/>
-                          </a:fontRef>
-                        </wps:style>
-                        <wps:bodyPr/>
-                      </wps:wsp>
-                    </a:graphicData>
-                  </a:graphic>
-                </wp:anchor>
-              </w:drawing>
-            </mc:Choice>
-            <mc:Fallback>
-              <w:pict>
-                <v:line w14:anchorId="1021A719" id="Straight Connector 399371092" o:spid="_x0000_s1026" style="position:absolute;z-index:251691008;visibility:visible;mso-wrap-style:square;mso-wrap-distance-left:9pt;mso-wrap-distance-top:0;mso-wrap-distance-right:9pt;mso-wrap-distance-bottom:0;mso-position-horizontal:absolute;mso-position-horizontal-relative:text;mso-position-vertical:absolute;mso-position-vertical-relative:text" from="-18pt,-45.1pt" to="-18pt,757.4pt" o:gfxdata="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" strokecolor="black [3200]" strokeweight="3pt">
-                  <v:stroke joinstyle="miter"/>
-                </v:line>
-              </w:pict>
-            </mc:Fallback>
-          </mc:AlternateContent>
-        </w:r>
-        <w:r>
-          <w:rPr>
-            <w:rFonts w:ascii="Courier New" w:hAnsi="Courier New" w:cs="Courier New"/>
-            <w:b/>
-            <w:noProof/>
-            <w:sz w:val="36"/>
-            <w:lang w:eastAsia="en-PH"/>
-          </w:rPr>
-          <mc:AlternateContent>
-            <mc:Choice Requires="wps">
-              <w:drawing>
-                <wp:anchor distT="0" distB="0" distL="114300" distR="114300" simplePos="0" relativeHeight="251692032" behindDoc="0" locked="0" layoutInCell="1" allowOverlap="1" wp14:anchorId="09090214" wp14:editId="39A163FA">
-                  <wp:simplePos x="0" y="0"/>
-                  <wp:positionH relativeFrom="column">
-                    <wp:posOffset>5715000</wp:posOffset>
-                  </wp:positionH>
-                  <wp:positionV relativeFrom="paragraph">
-                    <wp:posOffset>-419735</wp:posOffset>
-                  </wp:positionV>
-                  <wp:extent cx="0" cy="10033635"/>
-                  <wp:effectExtent l="19050" t="0" r="19050" b="5715"/>
-                  <wp:wrapNone/>
-                  <wp:docPr id="1981961598" name="Straight Connector 1981961598"/>
-                  <wp:cNvGraphicFramePr/>
-                  <a:graphic xmlns:a="http://schemas.openxmlformats.org/drawingml/2006/main">
-                    <a:graphicData uri="http://schemas.microsoft.com/office/word/2010/wordprocessingShape">
-                      <wps:wsp>
-                        <wps:cNvCnPr/>
-                        <wps:spPr>
-                          <a:xfrm>
-                            <a:off x="0" y="0"/>
-                            <a:ext cx="0" cy="10033762"/>
-                          </a:xfrm>
-                          <a:prstGeom prst="line">
-                            <a:avLst/>
-                          </a:prstGeom>
-                          <a:ln w="38100"/>
-                        </wps:spPr>
-                        <wps:style>
-                          <a:lnRef idx="1">
-                            <a:schemeClr val="dk1"/>
-                          </a:lnRef>
-                          <a:fillRef idx="0">
-                            <a:schemeClr val="dk1"/>
-                          </a:fillRef>
-                          <a:effectRef idx="0">
-                            <a:schemeClr val="dk1"/>
-                          </a:effectRef>
-                          <a:fontRef idx="minor">
-                            <a:schemeClr val="tx1"/>
-                          </a:fontRef>
-                        </wps:style>
-                        <wps:bodyPr/>
-                      </wps:wsp>
-                    </a:graphicData>
-                  </a:graphic>
-                </wp:anchor>
-              </w:drawing>
-            </mc:Choice>
-            <mc:Fallback>
-              <w:pict>
-                <v:line w14:anchorId="700154F2" id="Straight Connector 1981961598" o:spid="_x0000_s1026" style="position:absolute;z-index:251692032;visibility:visible;mso-wrap-style:square;mso-wrap-distance-left:9pt;mso-wrap-distance-top:0;mso-wrap-distance-right:9pt;mso-wrap-distance-bottom:0;mso-position-horizontal:absolute;mso-position-horizontal-relative:text;mso-position-vertical:absolute;mso-position-vertical-relative:text" from="450pt,-33.05pt" to="450pt,757pt" o:gfxdata="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" strokecolor="black [3200]" strokeweight="3pt">
-                  <v:stroke joinstyle="miter"/>
-                </v:line>
-              </w:pict>
-            </mc:Fallback>
-          </mc:AlternateContent>
-        </w:r>
-        <w:r>
-          <w:rPr>
-            <w:rFonts w:ascii="Courier New" w:hAnsi="Courier New" w:cs="Courier New"/>
-            <w:b/>
-            <w:sz w:val="36"/>
-          </w:rPr>
-          <w:t>Kalinga State University</w:t>
-        </w:r>
-        <w:r>
-          <w:rPr>
-            <w:rFonts w:ascii="Courier New" w:hAnsi="Courier New" w:cs="Courier New"/>
-            <w:b/>
-            <w:sz w:val="36"/>
-          </w:rPr>
-          <w:tab/>
-        </w:r>
-      </w:p>
-      <w:p>
-        <w:pPr>
-          <w:pStyle w:val="Header"/>
-          <w:tabs>
-            <w:tab w:val="clear" w:pos="9360"/>
-            <w:tab w:val="left" w:pos="2256"/>
-            <w:tab w:val="center" w:pos="4320"/>
-            <w:tab w:val="right" w:pos="8642"/>
-          </w:tabs>
-          <w:rPr>
-            <w:rFonts w:ascii="Courier New" w:hAnsi="Courier New" w:cs="Courier New"/>
-            <w:sz w:val="24"/>
-          </w:rPr>
-        </w:pPr>
-        <w:r>
-          <w:rPr>
-            <w:rFonts w:ascii="Courier New" w:hAnsi="Courier New" w:cs="Courier New"/>
-            <w:sz w:val="24"/>
-          </w:rPr>
-          <w:tab/>
-        </w:r>
-        <w:r>
-          <w:rPr>
-            <w:rFonts w:ascii="Courier New" w:hAnsi="Courier New" w:cs="Courier New"/>
-            <w:sz w:val="24"/>
-          </w:rPr>
-          <w:tab/>
-          <w:t>Bulanao, Tabuk City, Kalinga</w:t>
-        </w:r>
-      </w:p>
-      <w:p>
-        <w:pPr>
-          <w:pStyle w:val="Header"/>
-          <w:tabs>
-            <w:tab w:val="clear" w:pos="9360"/>
-            <w:tab w:val="left" w:pos="2256"/>
-            <w:tab w:val="center" w:pos="4320"/>
-            <w:tab w:val="right" w:pos="8642"/>
-          </w:tabs>
-          <w:rPr>
-            <w:rFonts w:ascii="Courier New" w:hAnsi="Courier New" w:cs="Courier New"/>
-            <w:sz w:val="24"/>
-          </w:rPr>
-        </w:pPr>
-        <w:r>
-          <w:rPr>
-            <w:rFonts w:ascii="Courier New" w:hAnsi="Courier New" w:cs="Courier New"/>
-            <w:sz w:val="24"/>
-          </w:rPr>
-          <w:tab/>
-        </w:r>
-      </w:p>
-      <w:p>
-        <w:pPr>
-          <w:pStyle w:val="Header"/>
-          <w:jc w:val="right"/>
-          <w:rPr>
-            <w:rFonts w:ascii="Courier New" w:hAnsi="Courier New" w:cs="Courier New"/>
-            <w:sz w:val="20"/>
-            <w:szCs w:val="20"/>
-          </w:rPr>
-        </w:pPr>
-        <w:r>
-          <w:rPr>
-            <w:rFonts w:ascii="Courier New" w:hAnsi="Courier New" w:cs="Courier New"/>
-            <w:color w:val="7F7F7F" w:themeColor="background1" w:themeShade="7F"/>
-            <w:spacing w:val="60"/>
-            <w:sz w:val="20"/>
-            <w:szCs w:val="20"/>
-          </w:rPr>
-          <w:t>Introduction</w:t>
-        </w:r>
-        <w:r>
-          <w:rPr>
-            <w:rFonts w:ascii="Courier New" w:hAnsi="Courier New" w:cs="Courier New"/>
-            <w:sz w:val="20"/>
-            <w:szCs w:val="20"/>
-          </w:rPr>
-          <w:t xml:space="preserve"> | </w:t>
-        </w:r>
-        <w:r>
-          <w:rPr>
-            <w:rFonts w:ascii="Courier New" w:hAnsi="Courier New" w:cs="Courier New"/>
-            <w:sz w:val="20"/>
-            <w:szCs w:val="20"/>
-          </w:rPr>
-          <w:fldChar w:fldCharType="begin"/>
-        </w:r>
-        <w:r>
-          <w:rPr>
-            <w:rFonts w:ascii="Courier New" w:hAnsi="Courier New" w:cs="Courier New"/>
-            <w:sz w:val="20"/>
-            <w:szCs w:val="20"/>
-          </w:rPr>
-          <w:instrText xml:space="preserve"> PAGE   \* MERGEFORMAT </w:instrText>
-        </w:r>
-        <w:r>
-          <w:rPr>
-            <w:rFonts w:ascii="Courier New" w:hAnsi="Courier New" w:cs="Courier New"/>
-            <w:sz w:val="20"/>
-            <w:szCs w:val="20"/>
-          </w:rPr>
-          <w:fldChar w:fldCharType="separate"/>
-        </w:r>
-        <w:r>
-          <w:rPr>
-            <w:rFonts w:ascii="Courier New" w:hAnsi="Courier New" w:cs="Courier New"/>
-            <w:b/>
-            <w:bCs/>
-            <w:noProof/>
-            <w:sz w:val="20"/>
-            <w:szCs w:val="20"/>
-          </w:rPr>
-          <w:t>1</w:t>
-        </w:r>
-        <w:r>
-          <w:rPr>
-            <w:rFonts w:ascii="Courier New" w:hAnsi="Courier New" w:cs="Courier New"/>
-            <w:b/>
-            <w:bCs/>
-            <w:noProof/>
-            <w:sz w:val="20"/>
-            <w:szCs w:val="20"/>
-          </w:rPr>
-          <w:fldChar w:fldCharType="end"/>
-        </w:r>
-      </w:p>
-    </w:sdtContent>
-  </w:sdt>
-  <w:p>
-    <w:pPr>
-      <w:pStyle w:val="Header"/>
-      <w:rPr>
-        <w:rFonts w:ascii="Courier New" w:hAnsi="Courier New" w:cs="Courier New"/>
-      </w:rPr>
-    </w:pPr>
-  </w:p>
-</w:hdr>
-</file>
-
-<file path=word/header4.xml><?xml version="1.0" encoding="utf-8"?>
-<w:hdr xmlns:wpc="http://schemas.microsoft.com/office/word/2010/wordprocessingCanvas" xmlns:cx="http://schemas.microsoft.com/office/drawing/2014/chartex" xmlns:cx1="http://schemas.microsoft.com/office/drawing/2015/9/8/chartex" xmlns:cx2="http://schemas.microsoft.com/office/drawing/2015/10/21/chartex" xmlns:cx3="http://schemas.microsoft.com/office/drawing/2016/5/9/chartex" xmlns:cx4="http://schemas.microsoft.com/office/drawing/2016/5/10/chartex" xmlns:cx5="http://schemas.microsoft.com/office/drawing/2016/5/11/chartex" xmlns:cx6="http://schemas.microsoft.com/office/drawing/2016/5/12/chartex" xmlns:cx7="http://schemas.microsoft.com/office/drawing/2016/5/13/chartex" xmlns:cx8="http://schemas.microsoft.com/office/drawing/2016/5/14/chartex" xmlns:mc="http://schemas.openxmlformats.org/markup-compatibility/2006" xmlns:aink="http://schemas.microsoft.com/office/drawing/2016/ink" xmlns:am3d="http://schemas.microsoft.com/office/drawing/2017/model3d" xmlns:o="urn:schemas-microsoft-com:office:office" xmlns:oel="http://schemas.microsoft.com/office/2019/extlst" xmlns:r="http://schemas.openxmlformats.org/officeDocument/2006/relationships" xmlns:m="http://schemas.openxmlformats.org/officeDocument/2006/math" xmlns:v="urn:schemas-microsoft-com:vml" xmlns:wp14="http://schemas.microsoft.com/office/word/2010/wordprocessingDrawing" xmlns:wp="http://schemas.openxmlformats.org/drawingml/2006/wordprocessingDrawing" xmlns:w10="urn:schemas-microsoft-com:office:word" xmlns:w="http://schemas.openxmlformats.org/wordprocessingml/2006/main" xmlns:w14="http://schemas.microsoft.com/office/word/2010/wordml" xmlns:w15="http://schemas.microsoft.com/office/word/2012/wordml" xmlns:w16cex="http://schemas.microsoft.com/office/word/2018/wordml/cex" xmlns:w16cid="http://schemas.microsoft.com/office/word/2016/wordml/cid" xmlns:w16="http://schemas.microsoft.com/office/word/2018/wordml" xmlns:w16du="http://schemas.microsoft.com/office/word/2023/wordml/word16du" xmlns:w16sdtdh="http://schemas.microsoft.com/office/word/2020/wordml/sdtdatahash" xmlns:w16sdtfl="http://schemas.microsoft.com/office/word/2024/wordml/sdtformatlock" xmlns:w16se="http://schemas.microsoft.com/office/word/2015/wordml/symex" xmlns:wpg="http://schemas.microsoft.com/office/word/2010/wordprocessingGroup" xmlns:wpi="http://schemas.microsoft.com/office/word/2010/wordprocessingInk" xmlns:wne="http://schemas.microsoft.com/office/word/2006/wordml" xmlns:wps="http://schemas.microsoft.com/office/word/2010/wordprocessingShape" mc:Ignorable="w14 w15 w16se w16cid w16 w16cex w16sdtdh w16sdtfl w16du wp14">
-  <w:sdt>
-    <w:sdtPr>
-      <w:id w:val="884150331"/>
-    </w:sdtPr>
-    <w:sdtEndPr>
-      <w:rPr>
-        <w:rFonts w:ascii="Courier New" w:hAnsi="Courier New" w:cs="Courier New"/>
-      </w:rPr>
-    </w:sdtEndPr>
-    <w:sdtContent>
-      <w:p>
-        <w:pPr>
-          <w:pStyle w:val="Header"/>
-          <w:tabs>
-            <w:tab w:val="center" w:pos="4321"/>
-            <w:tab w:val="right" w:pos="8642"/>
-          </w:tabs>
-          <w:rPr>
-            <w:rFonts w:ascii="Courier New" w:hAnsi="Courier New" w:cs="Courier New"/>
-            <w:b/>
-            <w:sz w:val="32"/>
-          </w:rPr>
-        </w:pPr>
-        <w:r>
-          <w:tab/>
-        </w:r>
-        <w:r>
-          <w:rPr>
-            <w:rFonts w:ascii="Courier New" w:hAnsi="Courier New" w:cs="Courier New"/>
-            <w:b/>
-            <w:noProof/>
-            <w:sz w:val="36"/>
-            <w:lang w:eastAsia="en-PH"/>
-          </w:rPr>
-          <w:drawing>
-            <wp:anchor distT="0" distB="0" distL="114300" distR="114300" simplePos="0" relativeHeight="251684864" behindDoc="0" locked="0" layoutInCell="1" allowOverlap="1" wp14:anchorId="27DAA8DF" wp14:editId="0A8D47C2">
-              <wp:simplePos x="0" y="0"/>
-              <wp:positionH relativeFrom="column">
-                <wp:posOffset>-246380</wp:posOffset>
-              </wp:positionH>
-              <wp:positionV relativeFrom="paragraph">
-                <wp:posOffset>-198120</wp:posOffset>
-              </wp:positionV>
-              <wp:extent cx="823595" cy="724535"/>
-              <wp:effectExtent l="0" t="0" r="14605" b="18415"/>
-              <wp:wrapNone/>
-              <wp:docPr id="1948264719" name="Picture 1948264719"/>
-              <wp:cNvGraphicFramePr>
-                <a:graphicFrameLocks xmlns:a="http://schemas.openxmlformats.org/drawingml/2006/main" noChangeAspect="1"/>
-              </wp:cNvGraphicFramePr>
-              <a:graphic xmlns:a="http://schemas.openxmlformats.org/drawingml/2006/main">
-                <a:graphicData uri="http://schemas.openxmlformats.org/drawingml/2006/picture">
-                  <pic:pic xmlns:pic="http://schemas.openxmlformats.org/drawingml/2006/picture">
-                    <pic:nvPicPr>
-                      <pic:cNvPr id="700363394" name="Picture 700363394"/>
-                      <pic:cNvPicPr>
-                        <a:picLocks noChangeAspect="1"/>
-                      </pic:cNvPicPr>
-                    </pic:nvPicPr>
-                    <pic:blipFill>
-                      <a:blip r:embed="rId1">
-                        <a:extLst>
-                          <a:ext uri="{28A0092B-C50C-407E-A947-70E740481C1C}">
-                            <a14:useLocalDpi xmlns:a14="http://schemas.microsoft.com/office/drawing/2010/main" val="0"/>
-                          </a:ext>
-                        </a:extLst>
-                      </a:blip>
-                      <a:stretch>
-                        <a:fillRect/>
-                      </a:stretch>
-                    </pic:blipFill>
-                    <pic:spPr>
-                      <a:xfrm>
-                        <a:off x="0" y="0"/>
-                        <a:ext cx="823578" cy="724710"/>
-                      </a:xfrm>
-                      <a:prstGeom prst="rect">
-                        <a:avLst/>
-                      </a:prstGeom>
-                    </pic:spPr>
-                  </pic:pic>
-                </a:graphicData>
-              </a:graphic>
-            </wp:anchor>
-          </w:drawing>
-        </w:r>
-        <w:r>
-          <w:rPr>
-            <w:rFonts w:ascii="Courier New" w:hAnsi="Courier New" w:cs="Courier New"/>
-            <w:b/>
-            <w:noProof/>
-            <w:sz w:val="32"/>
-            <w:lang w:eastAsia="en-PH"/>
-          </w:rPr>
-          <mc:AlternateContent>
-            <mc:Choice Requires="wps">
-              <w:drawing>
-                <wp:anchor distT="0" distB="0" distL="114300" distR="114300" simplePos="0" relativeHeight="251687936" behindDoc="0" locked="0" layoutInCell="1" allowOverlap="1" wp14:anchorId="6906A1A9" wp14:editId="3E74B579">
-                  <wp:simplePos x="0" y="0"/>
-                  <wp:positionH relativeFrom="column">
-                    <wp:posOffset>-1371600</wp:posOffset>
-                  </wp:positionH>
-                  <wp:positionV relativeFrom="paragraph">
-                    <wp:posOffset>-287020</wp:posOffset>
-                  </wp:positionV>
-                  <wp:extent cx="7772400" cy="0"/>
-                  <wp:effectExtent l="0" t="19050" r="0" b="19050"/>
-                  <wp:wrapNone/>
-                  <wp:docPr id="268329290" name="Straight Connector 268329290"/>
-                  <wp:cNvGraphicFramePr/>
-                  <a:graphic xmlns:a="http://schemas.openxmlformats.org/drawingml/2006/main">
-                    <a:graphicData uri="http://schemas.microsoft.com/office/word/2010/wordprocessingShape">
-                      <wps:wsp>
-                        <wps:cNvCnPr/>
-                        <wps:spPr>
-                          <a:xfrm>
-                            <a:off x="0" y="0"/>
-                            <a:ext cx="7772400" cy="0"/>
-                          </a:xfrm>
-                          <a:prstGeom prst="line">
-                            <a:avLst/>
-                          </a:prstGeom>
-                          <a:ln w="38100"/>
-                        </wps:spPr>
-                        <wps:style>
-                          <a:lnRef idx="1">
-                            <a:schemeClr val="dk1"/>
-                          </a:lnRef>
-                          <a:fillRef idx="0">
-                            <a:schemeClr val="dk1"/>
-                          </a:fillRef>
-                          <a:effectRef idx="0">
-                            <a:schemeClr val="dk1"/>
-                          </a:effectRef>
-                          <a:fontRef idx="minor">
-                            <a:schemeClr val="tx1"/>
-                          </a:fontRef>
-                        </wps:style>
-                        <wps:bodyPr/>
-                      </wps:wsp>
-                    </a:graphicData>
-                  </a:graphic>
-                </wp:anchor>
-              </w:drawing>
-            </mc:Choice>
-            <mc:Fallback>
-              <w:pict>
-                <v:line w14:anchorId="0D2D2DF7" id="Straight Connector 268329290" o:spid="_x0000_s1026" style="position:absolute;z-index:251687936;visibility:visible;mso-wrap-style:square;mso-wrap-distance-left:9pt;mso-wrap-distance-top:0;mso-wrap-distance-right:9pt;mso-wrap-distance-bottom:0;mso-position-horizontal:absolute;mso-position-horizontal-relative:text;mso-position-vertical:absolute;mso-position-vertical-relative:text" from="-108pt,-22.6pt" to="7in,-22.6pt" o:gfxdata="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" strokecolor="black [3200]" strokeweight="3pt">
-                  <v:stroke joinstyle="miter"/>
-                </v:line>
-              </w:pict>
-            </mc:Fallback>
-          </mc:AlternateContent>
-        </w:r>
-        <w:r>
-          <w:rPr>
-            <w:rFonts w:ascii="Courier New" w:hAnsi="Courier New" w:cs="Courier New"/>
-            <w:b/>
-            <w:noProof/>
-            <w:sz w:val="36"/>
-            <w:lang w:eastAsia="en-PH"/>
-          </w:rPr>
-          <mc:AlternateContent>
-            <mc:Choice Requires="wps">
-              <w:drawing>
-                <wp:anchor distT="0" distB="0" distL="114300" distR="114300" simplePos="0" relativeHeight="251685888" behindDoc="0" locked="0" layoutInCell="1" allowOverlap="1" wp14:anchorId="1E62BE12" wp14:editId="4D228D95">
-                  <wp:simplePos x="0" y="0"/>
-                  <wp:positionH relativeFrom="column">
-                    <wp:posOffset>-228600</wp:posOffset>
-                  </wp:positionH>
-                  <wp:positionV relativeFrom="paragraph">
-                    <wp:posOffset>-572770</wp:posOffset>
-                  </wp:positionV>
-                  <wp:extent cx="0" cy="10191750"/>
-                  <wp:effectExtent l="19050" t="0" r="19050" b="0"/>
-                  <wp:wrapNone/>
-                  <wp:docPr id="814134297" name="Straight Connector 814134297"/>
-                  <wp:cNvGraphicFramePr/>
-                  <a:graphic xmlns:a="http://schemas.openxmlformats.org/drawingml/2006/main">
-                    <a:graphicData uri="http://schemas.microsoft.com/office/word/2010/wordprocessingShape">
-                      <wps:wsp>
-                        <wps:cNvCnPr/>
-                        <wps:spPr>
-                          <a:xfrm>
-                            <a:off x="0" y="0"/>
-                            <a:ext cx="0" cy="10191896"/>
-                          </a:xfrm>
-                          <a:prstGeom prst="line">
-                            <a:avLst/>
-                          </a:prstGeom>
-                          <a:ln w="38100"/>
-                        </wps:spPr>
-                        <wps:style>
-                          <a:lnRef idx="1">
-                            <a:schemeClr val="dk1"/>
-                          </a:lnRef>
-                          <a:fillRef idx="0">
-                            <a:schemeClr val="dk1"/>
-                          </a:fillRef>
-                          <a:effectRef idx="0">
-                            <a:schemeClr val="dk1"/>
-                          </a:effectRef>
-                          <a:fontRef idx="minor">
-                            <a:schemeClr val="tx1"/>
-                          </a:fontRef>
-                        </wps:style>
-                        <wps:bodyPr/>
-                      </wps:wsp>
-                    </a:graphicData>
-                  </a:graphic>
-                </wp:anchor>
-              </w:drawing>
-            </mc:Choice>
-            <mc:Fallback>
-              <w:pict>
-                <v:line w14:anchorId="33FC20D6" id="Straight Connector 814134297" o:spid="_x0000_s1026" style="position:absolute;z-index:251685888;visibility:visible;mso-wrap-style:square;mso-wrap-distance-left:9pt;mso-wrap-distance-top:0;mso-wrap-distance-right:9pt;mso-wrap-distance-bottom:0;mso-position-horizontal:absolute;mso-position-horizontal-relative:text;mso-position-vertical:absolute;mso-position-vertical-relative:text" from="-18pt,-45.1pt" to="-18pt,757.4pt" o:gfxdata="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" strokecolor="black [3200]" strokeweight="3pt">
-                  <v:stroke joinstyle="miter"/>
-                </v:line>
-              </w:pict>
-            </mc:Fallback>
-          </mc:AlternateContent>
-        </w:r>
-        <w:r>
-          <w:rPr>
-            <w:rFonts w:ascii="Courier New" w:hAnsi="Courier New" w:cs="Courier New"/>
-            <w:b/>
-            <w:noProof/>
-            <w:sz w:val="36"/>
-            <w:lang w:eastAsia="en-PH"/>
-          </w:rPr>
-          <mc:AlternateContent>
-            <mc:Choice Requires="wps">
-              <w:drawing>
-                <wp:anchor distT="0" distB="0" distL="114300" distR="114300" simplePos="0" relativeHeight="251686912" behindDoc="0" locked="0" layoutInCell="1" allowOverlap="1" wp14:anchorId="419E6D30" wp14:editId="75CF9F07">
-                  <wp:simplePos x="0" y="0"/>
-                  <wp:positionH relativeFrom="column">
-                    <wp:posOffset>5715000</wp:posOffset>
-                  </wp:positionH>
-                  <wp:positionV relativeFrom="paragraph">
-                    <wp:posOffset>-419735</wp:posOffset>
-                  </wp:positionV>
-                  <wp:extent cx="0" cy="10033635"/>
-                  <wp:effectExtent l="19050" t="0" r="19050" b="5715"/>
-                  <wp:wrapNone/>
-                  <wp:docPr id="906535342" name="Straight Connector 906535342"/>
-                  <wp:cNvGraphicFramePr/>
-                  <a:graphic xmlns:a="http://schemas.openxmlformats.org/drawingml/2006/main">
-                    <a:graphicData uri="http://schemas.microsoft.com/office/word/2010/wordprocessingShape">
-                      <wps:wsp>
-                        <wps:cNvCnPr/>
-                        <wps:spPr>
-                          <a:xfrm>
-                            <a:off x="0" y="0"/>
-                            <a:ext cx="0" cy="10033762"/>
-                          </a:xfrm>
-                          <a:prstGeom prst="line">
-                            <a:avLst/>
-                          </a:prstGeom>
-                          <a:ln w="38100"/>
-                        </wps:spPr>
-                        <wps:style>
-                          <a:lnRef idx="1">
-                            <a:schemeClr val="dk1"/>
-                          </a:lnRef>
-                          <a:fillRef idx="0">
-                            <a:schemeClr val="dk1"/>
-                          </a:fillRef>
-                          <a:effectRef idx="0">
-                            <a:schemeClr val="dk1"/>
-                          </a:effectRef>
-                          <a:fontRef idx="minor">
-                            <a:schemeClr val="tx1"/>
-                          </a:fontRef>
-                        </wps:style>
-                        <wps:bodyPr/>
-                      </wps:wsp>
-                    </a:graphicData>
-                  </a:graphic>
-                </wp:anchor>
-              </w:drawing>
-            </mc:Choice>
-            <mc:Fallback>
-              <w:pict>
-                <v:line w14:anchorId="09E1D54E" id="Straight Connector 906535342" o:spid="_x0000_s1026" style="position:absolute;z-index:251686912;visibility:visible;mso-wrap-style:square;mso-wrap-distance-left:9pt;mso-wrap-distance-top:0;mso-wrap-distance-right:9pt;mso-wrap-distance-bottom:0;mso-position-horizontal:absolute;mso-position-horizontal-relative:text;mso-position-vertical:absolute;mso-position-vertical-relative:text" from="450pt,-33.05pt" to="450pt,757pt" o:gfxdata="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" strokecolor="black [3200]" strokeweight="3pt">
-                  <v:stroke joinstyle="miter"/>
-                </v:line>
-              </w:pict>
-            </mc:Fallback>
-          </mc:AlternateContent>
-        </w:r>
-        <w:r>
-          <w:rPr>
-            <w:rFonts w:ascii="Courier New" w:hAnsi="Courier New" w:cs="Courier New"/>
-            <w:b/>
-            <w:sz w:val="36"/>
-          </w:rPr>
-          <w:t>Kalinga State University</w:t>
-        </w:r>
-        <w:r>
-          <w:rPr>
-            <w:rFonts w:ascii="Courier New" w:hAnsi="Courier New" w:cs="Courier New"/>
-            <w:b/>
-            <w:sz w:val="36"/>
-          </w:rPr>
-          <w:tab/>
-        </w:r>
-      </w:p>
-      <w:p>
-        <w:pPr>
-          <w:pStyle w:val="Header"/>
-          <w:tabs>
-            <w:tab w:val="clear" w:pos="9360"/>
-            <w:tab w:val="left" w:pos="2256"/>
-            <w:tab w:val="center" w:pos="4320"/>
-            <w:tab w:val="right" w:pos="8642"/>
-          </w:tabs>
-          <w:rPr>
-            <w:rFonts w:ascii="Courier New" w:hAnsi="Courier New" w:cs="Courier New"/>
-            <w:sz w:val="24"/>
-          </w:rPr>
-        </w:pPr>
-        <w:r>
-          <w:rPr>
-            <w:rFonts w:ascii="Courier New" w:hAnsi="Courier New" w:cs="Courier New"/>
-            <w:sz w:val="24"/>
-          </w:rPr>
-          <w:tab/>
-        </w:r>
-        <w:r>
-          <w:rPr>
-            <w:rFonts w:ascii="Courier New" w:hAnsi="Courier New" w:cs="Courier New"/>
-            <w:sz w:val="24"/>
-          </w:rPr>
-          <w:tab/>
-          <w:t>Bulanao, Tabuk City, Kalinga</w:t>
-        </w:r>
-        <w:r>
-          <w:rPr>
-            <w:rFonts w:ascii="Courier New" w:hAnsi="Courier New" w:cs="Courier New"/>
-            <w:sz w:val="24"/>
-          </w:rPr>
-          <w:tab/>
-        </w:r>
-      </w:p>
-      <w:p>
-        <w:pPr>
-          <w:pStyle w:val="Header"/>
-          <w:jc w:val="right"/>
-          <w:rPr>
-            <w:rFonts w:ascii="Courier New" w:hAnsi="Courier New" w:cs="Courier New"/>
-          </w:rPr>
-        </w:pPr>
-      </w:p>
-    </w:sdtContent>
-  </w:sdt>
-  <w:p>
-    <w:pPr>
-      <w:pStyle w:val="Header"/>
-      <w:rPr>
-        <w:rFonts w:ascii="Courier New" w:hAnsi="Courier New" w:cs="Courier New"/>
-      </w:rPr>
-    </w:pPr>
-  </w:p>
-</w:hdr>
-</file>
-
-<file path=word/header5.xml><?xml version="1.0" encoding="utf-8"?>
-<w:hdr xmlns:wpc="http://schemas.microsoft.com/office/word/2010/wordprocessingCanvas" xmlns:cx="http://schemas.microsoft.com/office/drawing/2014/chartex" xmlns:cx1="http://schemas.microsoft.com/office/drawing/2015/9/8/chartex" xmlns:cx2="http://schemas.microsoft.com/office/drawing/2015/10/21/chartex" xmlns:cx3="http://schemas.microsoft.com/office/drawing/2016/5/9/chartex" xmlns:cx4="http://schemas.microsoft.com/office/drawing/2016/5/10/chartex" xmlns:cx5="http://schemas.microsoft.com/office/drawing/2016/5/11/chartex" xmlns:cx6="http://schemas.microsoft.com/office/drawing/2016/5/12/chartex" xmlns:cx7="http://schemas.microsoft.com/office/drawing/2016/5/13/chartex" xmlns:cx8="http://schemas.microsoft.com/office/drawing/2016/5/14/chartex" xmlns:mc="http://schemas.openxmlformats.org/markup-compatibility/2006" xmlns:aink="http://schemas.microsoft.com/office/drawing/2016/ink" xmlns:am3d="http://schemas.microsoft.com/office/drawing/2017/model3d" xmlns:o="urn:schemas-microsoft-com:office:office" xmlns:oel="http://schemas.microsoft.com/office/2019/extlst" xmlns:r="http://schemas.openxmlformats.org/officeDocument/2006/relationships" xmlns:m="http://schemas.openxmlformats.org/officeDocument/2006/math" xmlns:v="urn:schemas-microsoft-com:vml" xmlns:wp14="http://schemas.microsoft.com/office/word/2010/wordprocessingDrawing" xmlns:wp="http://schemas.openxmlformats.org/drawingml/2006/wordprocessingDrawing" xmlns:w10="urn:schemas-microsoft-com:office:word" xmlns:w="http://schemas.openxmlformats.org/wordprocessingml/2006/main" xmlns:w14="http://schemas.microsoft.com/office/word/2010/wordml" xmlns:w15="http://schemas.microsoft.com/office/word/2012/wordml" xmlns:w16cex="http://schemas.microsoft.com/office/word/2018/wordml/cex" xmlns:w16cid="http://schemas.microsoft.com/office/word/2016/wordml/cid" xmlns:w16="http://schemas.microsoft.com/office/word/2018/wordml" xmlns:w16du="http://schemas.microsoft.com/office/word/2023/wordml/word16du" xmlns:w16sdtdh="http://schemas.microsoft.com/office/word/2020/wordml/sdtdatahash" xmlns:w16sdtfl="http://schemas.microsoft.com/office/word/2024/wordml/sdtformatlock" xmlns:w16se="http://schemas.microsoft.com/office/word/2015/wordml/symex" xmlns:wpg="http://schemas.microsoft.com/office/word/2010/wordprocessingGroup" xmlns:wpi="http://schemas.microsoft.com/office/word/2010/wordprocessingInk" xmlns:wne="http://schemas.microsoft.com/office/word/2006/wordml" xmlns:wps="http://schemas.microsoft.com/office/word/2010/wordprocessingShape" mc:Ignorable="w14 w15 w16se w16cid w16 w16cex w16sdtdh w16sdtfl w16du wp14">
-  <w:sdt>
-    <w:sdtPr>
-      <w:id w:val="1594424753"/>
-    </w:sdtPr>
-    <w:sdtEndPr>
-      <w:rPr>
-        <w:rFonts w:ascii="Courier New" w:hAnsi="Courier New" w:cs="Courier New"/>
-        <w:sz w:val="20"/>
-        <w:szCs w:val="20"/>
-      </w:rPr>
-    </w:sdtEndPr>
-    <w:sdtContent>
-      <w:p>
-        <w:pPr>
-          <w:pStyle w:val="Header"/>
-          <w:tabs>
-            <w:tab w:val="center" w:pos="4321"/>
-            <w:tab w:val="right" w:pos="8642"/>
-          </w:tabs>
-          <w:rPr>
-            <w:rFonts w:ascii="Courier New" w:hAnsi="Courier New" w:cs="Courier New"/>
-            <w:b/>
-            <w:sz w:val="32"/>
-          </w:rPr>
-        </w:pPr>
-        <w:r>
-          <w:tab/>
-        </w:r>
-        <w:r>
-          <w:rPr>
-            <w:rFonts w:ascii="Courier New" w:hAnsi="Courier New" w:cs="Courier New"/>
-            <w:b/>
-            <w:noProof/>
-            <w:sz w:val="36"/>
-            <w:lang w:eastAsia="en-PH"/>
-          </w:rPr>
-          <w:drawing>
-            <wp:anchor distT="0" distB="0" distL="114300" distR="114300" simplePos="0" relativeHeight="251700224" behindDoc="0" locked="0" layoutInCell="1" allowOverlap="1" wp14:anchorId="615D653D" wp14:editId="5701BB36">
-              <wp:simplePos x="0" y="0"/>
-              <wp:positionH relativeFrom="column">
-                <wp:posOffset>-246380</wp:posOffset>
-              </wp:positionH>
-              <wp:positionV relativeFrom="paragraph">
-                <wp:posOffset>-198120</wp:posOffset>
-              </wp:positionV>
-              <wp:extent cx="823595" cy="724535"/>
-              <wp:effectExtent l="0" t="0" r="14605" b="18415"/>
-              <wp:wrapNone/>
-              <wp:docPr id="1864054730" name="Picture 1864054730"/>
-              <wp:cNvGraphicFramePr>
-                <a:graphicFrameLocks xmlns:a="http://schemas.openxmlformats.org/drawingml/2006/main" noChangeAspect="1"/>
-              </wp:cNvGraphicFramePr>
-              <a:graphic xmlns:a="http://schemas.openxmlformats.org/drawingml/2006/main">
-                <a:graphicData uri="http://schemas.openxmlformats.org/drawingml/2006/picture">
-                  <pic:pic xmlns:pic="http://schemas.openxmlformats.org/drawingml/2006/picture">
-                    <pic:nvPicPr>
-                      <pic:cNvPr id="700363394" name="Picture 700363394"/>
-                      <pic:cNvPicPr>
-                        <a:picLocks noChangeAspect="1"/>
-                      </pic:cNvPicPr>
-                    </pic:nvPicPr>
-                    <pic:blipFill>
-                      <a:blip r:embed="rId1">
-                        <a:extLst>
-                          <a:ext uri="{28A0092B-C50C-407E-A947-70E740481C1C}">
-                            <a14:useLocalDpi xmlns:a14="http://schemas.microsoft.com/office/drawing/2010/main" val="0"/>
-                          </a:ext>
-                        </a:extLst>
-                      </a:blip>
-                      <a:stretch>
-                        <a:fillRect/>
-                      </a:stretch>
-                    </pic:blipFill>
-                    <pic:spPr>
-                      <a:xfrm>
-                        <a:off x="0" y="0"/>
-                        <a:ext cx="823578" cy="724710"/>
-                      </a:xfrm>
-                      <a:prstGeom prst="rect">
-                        <a:avLst/>
-                      </a:prstGeom>
-                    </pic:spPr>
-                  </pic:pic>
-                </a:graphicData>
-              </a:graphic>
-            </wp:anchor>
-          </w:drawing>
-        </w:r>
-        <w:r>
-          <w:rPr>
-            <w:rFonts w:ascii="Courier New" w:hAnsi="Courier New" w:cs="Courier New"/>
-            <w:b/>
-            <w:noProof/>
-            <w:sz w:val="32"/>
-            <w:lang w:eastAsia="en-PH"/>
-          </w:rPr>
-          <mc:AlternateContent>
-            <mc:Choice Requires="wps">
-              <w:drawing>
-                <wp:anchor distT="0" distB="0" distL="114300" distR="114300" simplePos="0" relativeHeight="251703296" behindDoc="0" locked="0" layoutInCell="1" allowOverlap="1" wp14:anchorId="7877EF97" wp14:editId="2C2F600E">
-                  <wp:simplePos x="0" y="0"/>
-                  <wp:positionH relativeFrom="column">
-                    <wp:posOffset>-1371600</wp:posOffset>
-                  </wp:positionH>
-                  <wp:positionV relativeFrom="paragraph">
-                    <wp:posOffset>-287020</wp:posOffset>
-                  </wp:positionV>
-                  <wp:extent cx="7772400" cy="0"/>
-                  <wp:effectExtent l="0" t="19050" r="0" b="19050"/>
-                  <wp:wrapNone/>
-                  <wp:docPr id="2045287632" name="Straight Connector 2045287632"/>
-                  <wp:cNvGraphicFramePr/>
-                  <a:graphic xmlns:a="http://schemas.openxmlformats.org/drawingml/2006/main">
-                    <a:graphicData uri="http://schemas.microsoft.com/office/word/2010/wordprocessingShape">
-                      <wps:wsp>
-                        <wps:cNvCnPr/>
-                        <wps:spPr>
-                          <a:xfrm>
-                            <a:off x="0" y="0"/>
-                            <a:ext cx="7772400" cy="0"/>
-                          </a:xfrm>
-                          <a:prstGeom prst="line">
-                            <a:avLst/>
-                          </a:prstGeom>
-                          <a:ln w="38100"/>
-                        </wps:spPr>
-                        <wps:style>
-                          <a:lnRef idx="1">
-                            <a:schemeClr val="dk1"/>
-                          </a:lnRef>
-                          <a:fillRef idx="0">
-                            <a:schemeClr val="dk1"/>
-                          </a:fillRef>
-                          <a:effectRef idx="0">
-                            <a:schemeClr val="dk1"/>
-                          </a:effectRef>
-                          <a:fontRef idx="minor">
-                            <a:schemeClr val="tx1"/>
-                          </a:fontRef>
-                        </wps:style>
-                        <wps:bodyPr/>
-                      </wps:wsp>
-                    </a:graphicData>
-                  </a:graphic>
-                </wp:anchor>
-              </w:drawing>
-            </mc:Choice>
-            <mc:Fallback>
-              <w:pict>
-                <v:line w14:anchorId="5973C10D" id="Straight Connector 2045287632" o:spid="_x0000_s1026" style="position:absolute;z-index:251703296;visibility:visible;mso-wrap-style:square;mso-wrap-distance-left:9pt;mso-wrap-distance-top:0;mso-wrap-distance-right:9pt;mso-wrap-distance-bottom:0;mso-position-horizontal:absolute;mso-position-horizontal-relative:text;mso-position-vertical:absolute;mso-position-vertical-relative:text" from="-108pt,-22.6pt" to="7in,-22.6pt" o:gfxdata="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" strokecolor="black [3200]" strokeweight="3pt">
-                  <v:stroke joinstyle="miter"/>
-                </v:line>
-              </w:pict>
-            </mc:Fallback>
-          </mc:AlternateContent>
-        </w:r>
-        <w:r>
-          <w:rPr>
-            <w:rFonts w:ascii="Courier New" w:hAnsi="Courier New" w:cs="Courier New"/>
-            <w:b/>
-            <w:noProof/>
-            <w:sz w:val="36"/>
-            <w:lang w:eastAsia="en-PH"/>
-          </w:rPr>
-          <mc:AlternateContent>
-            <mc:Choice Requires="wps">
-              <w:drawing>
-                <wp:anchor distT="0" distB="0" distL="114300" distR="114300" simplePos="0" relativeHeight="251701248" behindDoc="0" locked="0" layoutInCell="1" allowOverlap="1" wp14:anchorId="3084B7A7" wp14:editId="6E864ED7">
-                  <wp:simplePos x="0" y="0"/>
-                  <wp:positionH relativeFrom="column">
-                    <wp:posOffset>-228600</wp:posOffset>
-                  </wp:positionH>
-                  <wp:positionV relativeFrom="paragraph">
-                    <wp:posOffset>-572770</wp:posOffset>
-                  </wp:positionV>
-                  <wp:extent cx="0" cy="10191750"/>
-                  <wp:effectExtent l="19050" t="0" r="19050" b="0"/>
-                  <wp:wrapNone/>
-                  <wp:docPr id="356865840" name="Straight Connector 356865840"/>
-                  <wp:cNvGraphicFramePr/>
-                  <a:graphic xmlns:a="http://schemas.openxmlformats.org/drawingml/2006/main">
-                    <a:graphicData uri="http://schemas.microsoft.com/office/word/2010/wordprocessingShape">
-                      <wps:wsp>
-                        <wps:cNvCnPr/>
-                        <wps:spPr>
-                          <a:xfrm>
-                            <a:off x="0" y="0"/>
-                            <a:ext cx="0" cy="10191896"/>
-                          </a:xfrm>
-                          <a:prstGeom prst="line">
-                            <a:avLst/>
-                          </a:prstGeom>
-                          <a:ln w="38100"/>
-                        </wps:spPr>
-                        <wps:style>
-                          <a:lnRef idx="1">
-                            <a:schemeClr val="dk1"/>
-                          </a:lnRef>
-                          <a:fillRef idx="0">
-                            <a:schemeClr val="dk1"/>
-                          </a:fillRef>
-                          <a:effectRef idx="0">
-                            <a:schemeClr val="dk1"/>
-                          </a:effectRef>
-                          <a:fontRef idx="minor">
-                            <a:schemeClr val="tx1"/>
-                          </a:fontRef>
-                        </wps:style>
-                        <wps:bodyPr/>
-                      </wps:wsp>
-                    </a:graphicData>
-                  </a:graphic>
-                </wp:anchor>
-              </w:drawing>
-            </mc:Choice>
-            <mc:Fallback>
-              <w:pict>
-                <v:line w14:anchorId="3379FEAB" id="Straight Connector 356865840" o:spid="_x0000_s1026" style="position:absolute;z-index:251701248;visibility:visible;mso-wrap-style:square;mso-wrap-distance-left:9pt;mso-wrap-distance-top:0;mso-wrap-distance-right:9pt;mso-wrap-distance-bottom:0;mso-position-horizontal:absolute;mso-position-horizontal-relative:text;mso-position-vertical:absolute;mso-position-vertical-relative:text" from="-18pt,-45.1pt" to="-18pt,757.4pt" o:gfxdata="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" strokecolor="black [3200]" strokeweight="3pt">
-                  <v:stroke joinstyle="miter"/>
-                </v:line>
-              </w:pict>
-            </mc:Fallback>
-          </mc:AlternateContent>
-        </w:r>
-        <w:r>
-          <w:rPr>
-            <w:rFonts w:ascii="Courier New" w:hAnsi="Courier New" w:cs="Courier New"/>
-            <w:b/>
-            <w:noProof/>
-            <w:sz w:val="36"/>
-            <w:lang w:eastAsia="en-PH"/>
-          </w:rPr>
-          <mc:AlternateContent>
-            <mc:Choice Requires="wps">
-              <w:drawing>
-                <wp:anchor distT="0" distB="0" distL="114300" distR="114300" simplePos="0" relativeHeight="251702272" behindDoc="0" locked="0" layoutInCell="1" allowOverlap="1" wp14:anchorId="318B91C1" wp14:editId="5263787F">
-                  <wp:simplePos x="0" y="0"/>
-                  <wp:positionH relativeFrom="column">
-                    <wp:posOffset>5715000</wp:posOffset>
-                  </wp:positionH>
-                  <wp:positionV relativeFrom="paragraph">
-                    <wp:posOffset>-419735</wp:posOffset>
-                  </wp:positionV>
-                  <wp:extent cx="0" cy="10033635"/>
-                  <wp:effectExtent l="19050" t="0" r="19050" b="5715"/>
-                  <wp:wrapNone/>
-                  <wp:docPr id="1520849400" name="Straight Connector 1520849400"/>
-                  <wp:cNvGraphicFramePr/>
-                  <a:graphic xmlns:a="http://schemas.openxmlformats.org/drawingml/2006/main">
-                    <a:graphicData uri="http://schemas.microsoft.com/office/word/2010/wordprocessingShape">
-                      <wps:wsp>
-                        <wps:cNvCnPr/>
-                        <wps:spPr>
-                          <a:xfrm>
-                            <a:off x="0" y="0"/>
-                            <a:ext cx="0" cy="10033762"/>
-                          </a:xfrm>
-                          <a:prstGeom prst="line">
-                            <a:avLst/>
-                          </a:prstGeom>
-                          <a:ln w="38100"/>
-                        </wps:spPr>
-                        <wps:style>
-                          <a:lnRef idx="1">
-                            <a:schemeClr val="dk1"/>
-                          </a:lnRef>
-                          <a:fillRef idx="0">
-                            <a:schemeClr val="dk1"/>
-                          </a:fillRef>
-                          <a:effectRef idx="0">
-                            <a:schemeClr val="dk1"/>
-                          </a:effectRef>
-                          <a:fontRef idx="minor">
-                            <a:schemeClr val="tx1"/>
-                          </a:fontRef>
-                        </wps:style>
-                        <wps:bodyPr/>
-                      </wps:wsp>
-                    </a:graphicData>
-                  </a:graphic>
-                </wp:anchor>
-              </w:drawing>
-            </mc:Choice>
-            <mc:Fallback>
-              <w:pict>
-                <v:line w14:anchorId="72AD4496" id="Straight Connector 1520849400" o:spid="_x0000_s1026" style="position:absolute;z-index:251702272;visibility:visible;mso-wrap-style:square;mso-wrap-distance-left:9pt;mso-wrap-distance-top:0;mso-wrap-distance-right:9pt;mso-wrap-distance-bottom:0;mso-position-horizontal:absolute;mso-position-horizontal-relative:text;mso-position-vertical:absolute;mso-position-vertical-relative:text" from="450pt,-33.05pt" to="450pt,757pt" o:gfxdata="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" strokecolor="black [3200]" strokeweight="3pt">
-                  <v:stroke joinstyle="miter"/>
-                </v:line>
-              </w:pict>
-            </mc:Fallback>
-          </mc:AlternateContent>
-        </w:r>
-        <w:r>
-          <w:rPr>
-            <w:rFonts w:ascii="Courier New" w:hAnsi="Courier New" w:cs="Courier New"/>
-            <w:b/>
-            <w:sz w:val="36"/>
-          </w:rPr>
-          <w:t>Kalinga State University</w:t>
-        </w:r>
-        <w:r>
-          <w:rPr>
-            <w:rFonts w:ascii="Courier New" w:hAnsi="Courier New" w:cs="Courier New"/>
-            <w:b/>
-            <w:sz w:val="36"/>
-          </w:rPr>
-          <w:tab/>
-        </w:r>
-      </w:p>
-      <w:p>
-        <w:pPr>
-          <w:pStyle w:val="Header"/>
-          <w:tabs>
-            <w:tab w:val="clear" w:pos="9360"/>
-            <w:tab w:val="left" w:pos="2256"/>
-            <w:tab w:val="center" w:pos="4320"/>
-            <w:tab w:val="right" w:pos="8642"/>
-          </w:tabs>
-          <w:rPr>
-            <w:rFonts w:ascii="Courier New" w:hAnsi="Courier New" w:cs="Courier New"/>
-            <w:sz w:val="24"/>
-          </w:rPr>
-        </w:pPr>
-        <w:r>
-          <w:rPr>
-            <w:rFonts w:ascii="Courier New" w:hAnsi="Courier New" w:cs="Courier New"/>
-            <w:sz w:val="24"/>
-          </w:rPr>
-          <w:tab/>
-        </w:r>
-        <w:r>
-          <w:rPr>
-            <w:rFonts w:ascii="Courier New" w:hAnsi="Courier New" w:cs="Courier New"/>
-            <w:sz w:val="24"/>
-          </w:rPr>
-          <w:tab/>
-          <w:t>Bulanao, Tabuk City, Kalinga</w:t>
-        </w:r>
-      </w:p>
-      <w:p>
-        <w:pPr>
-          <w:pStyle w:val="Header"/>
-          <w:tabs>
-            <w:tab w:val="clear" w:pos="9360"/>
-            <w:tab w:val="left" w:pos="2256"/>
-            <w:tab w:val="center" w:pos="4320"/>
-            <w:tab w:val="right" w:pos="8642"/>
-          </w:tabs>
-          <w:rPr>
-            <w:rFonts w:ascii="Courier New" w:hAnsi="Courier New" w:cs="Courier New"/>
-            <w:sz w:val="24"/>
-          </w:rPr>
-        </w:pPr>
-        <w:r>
-          <w:rPr>
-            <w:rFonts w:ascii="Courier New" w:hAnsi="Courier New" w:cs="Courier New"/>
-            <w:sz w:val="24"/>
-          </w:rPr>
-          <w:tab/>
-        </w:r>
-      </w:p>
-      <w:p>
-        <w:pPr>
-          <w:pStyle w:val="Header"/>
-          <w:jc w:val="right"/>
-          <w:rPr>
-            <w:rFonts w:ascii="Courier New" w:hAnsi="Courier New" w:cs="Courier New"/>
-            <w:sz w:val="20"/>
-            <w:szCs w:val="20"/>
-          </w:rPr>
-        </w:pPr>
-        <w:r>
-          <w:rPr>
-            <w:rFonts w:ascii="Courier New" w:hAnsi="Courier New" w:cs="Courier New"/>
-            <w:sz w:val="20"/>
-            <w:szCs w:val="20"/>
-          </w:rPr>
-          <w:t>Review of Related Literature</w:t>
-        </w:r>
-        <w:r>
-          <w:rPr>
-            <w:rFonts w:ascii="Courier New" w:hAnsi="Courier New" w:cs="Courier New"/>
-            <w:sz w:val="20"/>
-            <w:szCs w:val="20"/>
-          </w:rPr>
-          <w:t xml:space="preserve"> | </w:t>
-        </w:r>
-        <w:r>
-          <w:rPr>
-            <w:rFonts w:ascii="Courier New" w:hAnsi="Courier New" w:cs="Courier New"/>
-            <w:sz w:val="20"/>
-            <w:szCs w:val="20"/>
-          </w:rPr>
-          <w:fldChar w:fldCharType="begin"/>
-        </w:r>
-        <w:r>
-          <w:rPr>
-            <w:rFonts w:ascii="Courier New" w:hAnsi="Courier New" w:cs="Courier New"/>
-            <w:sz w:val="20"/>
-            <w:szCs w:val="20"/>
-          </w:rPr>
-          <w:instrText xml:space="preserve"> PAGE   \* MERGEFORMAT </w:instrText>
-        </w:r>
-        <w:r>
-          <w:rPr>
-            <w:rFonts w:ascii="Courier New" w:hAnsi="Courier New" w:cs="Courier New"/>
-            <w:sz w:val="20"/>
-            <w:szCs w:val="20"/>
-          </w:rPr>
-          <w:fldChar w:fldCharType="separate"/>
-        </w:r>
-        <w:r>
-          <w:rPr>
-            <w:rFonts w:ascii="Courier New" w:hAnsi="Courier New" w:cs="Courier New"/>
-            <w:b/>
-            <w:bCs/>
-            <w:noProof/>
-            <w:sz w:val="20"/>
-            <w:szCs w:val="20"/>
-          </w:rPr>
-          <w:t>1</w:t>
-        </w:r>
-        <w:r>
-          <w:rPr>
-            <w:rFonts w:ascii="Courier New" w:hAnsi="Courier New" w:cs="Courier New"/>
-            <w:b/>
-            <w:bCs/>
-            <w:noProof/>
-            <w:sz w:val="20"/>
-            <w:szCs w:val="20"/>
-          </w:rPr>
-          <w:fldChar w:fldCharType="end"/>
-        </w:r>
-      </w:p>
-    </w:sdtContent>
-  </w:sdt>
-  <w:p>
-    <w:pPr>
-      <w:pStyle w:val="Header"/>
-      <w:rPr>
-        <w:rFonts w:ascii="Courier New" w:hAnsi="Courier New" w:cs="Courier New"/>
-      </w:rPr>
-    </w:pPr>
-  </w:p>
-</w:hdr>
-</file>
-
-<file path=word/header6.xml><?xml version="1.0" encoding="utf-8"?>
-<w:hdr xmlns:wpc="http://schemas.microsoft.com/office/word/2010/wordprocessingCanvas" xmlns:cx="http://schemas.microsoft.com/office/drawing/2014/chartex" xmlns:cx1="http://schemas.microsoft.com/office/drawing/2015/9/8/chartex" xmlns:cx2="http://schemas.microsoft.com/office/drawing/2015/10/21/chartex" xmlns:cx3="http://schemas.microsoft.com/office/drawing/2016/5/9/chartex" xmlns:cx4="http://schemas.microsoft.com/office/drawing/2016/5/10/chartex" xmlns:cx5="http://schemas.microsoft.com/office/drawing/2016/5/11/chartex" xmlns:cx6="http://schemas.microsoft.com/office/drawing/2016/5/12/chartex" xmlns:cx7="http://schemas.microsoft.com/office/drawing/2016/5/13/chartex" xmlns:cx8="http://schemas.microsoft.com/office/drawing/2016/5/14/chartex" xmlns:mc="http://schemas.openxmlformats.org/markup-compatibility/2006" xmlns:aink="http://schemas.microsoft.com/office/drawing/2016/ink" xmlns:am3d="http://schemas.microsoft.com/office/drawing/2017/model3d" xmlns:o="urn:schemas-microsoft-com:office:office" xmlns:oel="http://schemas.microsoft.com/office/2019/extlst" xmlns:r="http://schemas.openxmlformats.org/officeDocument/2006/relationships" xmlns:m="http://schemas.openxmlformats.org/officeDocument/2006/math" xmlns:v="urn:schemas-microsoft-com:vml" xmlns:wp14="http://schemas.microsoft.com/office/word/2010/wordprocessingDrawing" xmlns:wp="http://schemas.openxmlformats.org/drawingml/2006/wordprocessingDrawing" xmlns:w10="urn:schemas-microsoft-com:office:word" xmlns:w="http://schemas.openxmlformats.org/wordprocessingml/2006/main" xmlns:w14="http://schemas.microsoft.com/office/word/2010/wordml" xmlns:w15="http://schemas.microsoft.com/office/word/2012/wordml" xmlns:w16cex="http://schemas.microsoft.com/office/word/2018/wordml/cex" xmlns:w16cid="http://schemas.microsoft.com/office/word/2016/wordml/cid" xmlns:w16="http://schemas.microsoft.com/office/word/2018/wordml" xmlns:w16du="http://schemas.microsoft.com/office/word/2023/wordml/word16du" xmlns:w16sdtdh="http://schemas.microsoft.com/office/word/2020/wordml/sdtdatahash" xmlns:w16sdtfl="http://schemas.microsoft.com/office/word/2024/wordml/sdtformatlock" xmlns:w16se="http://schemas.microsoft.com/office/word/2015/wordml/symex" xmlns:wpg="http://schemas.microsoft.com/office/word/2010/wordprocessingGroup" xmlns:wpi="http://schemas.microsoft.com/office/word/2010/wordprocessingInk" xmlns:wne="http://schemas.microsoft.com/office/word/2006/wordml" xmlns:wps="http://schemas.microsoft.com/office/word/2010/wordprocessingShape" mc:Ignorable="w14 w15 w16se w16cid w16 w16cex w16sdtdh w16sdtfl w16du wp14">
-  <w:sdt>
-    <w:sdtPr>
-      <w:id w:val="-356277792"/>
-    </w:sdtPr>
-    <w:sdtEndPr>
-      <w:rPr>
-        <w:rFonts w:ascii="Courier New" w:hAnsi="Courier New" w:cs="Courier New"/>
-        <w:sz w:val="20"/>
-        <w:szCs w:val="20"/>
-      </w:rPr>
-    </w:sdtEndPr>
-    <w:sdtContent>
-      <w:p>
-        <w:pPr>
-          <w:pStyle w:val="Header"/>
-          <w:tabs>
-            <w:tab w:val="center" w:pos="4321"/>
-            <w:tab w:val="right" w:pos="8642"/>
-          </w:tabs>
-          <w:rPr>
-            <w:rFonts w:ascii="Courier New" w:hAnsi="Courier New" w:cs="Courier New"/>
-            <w:b/>
-            <w:sz w:val="32"/>
-          </w:rPr>
-        </w:pPr>
-        <w:r>
-          <w:tab/>
-        </w:r>
-        <w:r>
-          <w:rPr>
-            <w:rFonts w:ascii="Courier New" w:hAnsi="Courier New" w:cs="Courier New"/>
-            <w:b/>
-            <w:noProof/>
-            <w:sz w:val="36"/>
-            <w:lang w:eastAsia="en-PH"/>
-          </w:rPr>
-          <w:drawing>
-            <wp:anchor distT="0" distB="0" distL="114300" distR="114300" simplePos="0" relativeHeight="251695104" behindDoc="0" locked="0" layoutInCell="1" allowOverlap="1" wp14:anchorId="67E0C852" wp14:editId="3571D093">
-              <wp:simplePos x="0" y="0"/>
-              <wp:positionH relativeFrom="column">
-                <wp:posOffset>-246380</wp:posOffset>
-              </wp:positionH>
-              <wp:positionV relativeFrom="paragraph">
-                <wp:posOffset>-198120</wp:posOffset>
-              </wp:positionV>
-              <wp:extent cx="823595" cy="724535"/>
-              <wp:effectExtent l="0" t="0" r="14605" b="18415"/>
-              <wp:wrapNone/>
-              <wp:docPr id="1053198366" name="Picture 1053198366"/>
-              <wp:cNvGraphicFramePr>
-                <a:graphicFrameLocks xmlns:a="http://schemas.openxmlformats.org/drawingml/2006/main" noChangeAspect="1"/>
-              </wp:cNvGraphicFramePr>
-              <a:graphic xmlns:a="http://schemas.openxmlformats.org/drawingml/2006/main">
-                <a:graphicData uri="http://schemas.openxmlformats.org/drawingml/2006/picture">
-                  <pic:pic xmlns:pic="http://schemas.openxmlformats.org/drawingml/2006/picture">
-                    <pic:nvPicPr>
-                      <pic:cNvPr id="700363394" name="Picture 700363394"/>
-                      <pic:cNvPicPr>
-                        <a:picLocks noChangeAspect="1"/>
-                      </pic:cNvPicPr>
-                    </pic:nvPicPr>
-                    <pic:blipFill>
-                      <a:blip r:embed="rId1">
-                        <a:extLst>
-                          <a:ext uri="{28A0092B-C50C-407E-A947-70E740481C1C}">
-                            <a14:useLocalDpi xmlns:a14="http://schemas.microsoft.com/office/drawing/2010/main" val="0"/>
-                          </a:ext>
-                        </a:extLst>
-                      </a:blip>
-                      <a:stretch>
-                        <a:fillRect/>
-                      </a:stretch>
-                    </pic:blipFill>
-                    <pic:spPr>
-                      <a:xfrm>
-                        <a:off x="0" y="0"/>
-                        <a:ext cx="823578" cy="724710"/>
-                      </a:xfrm>
-                      <a:prstGeom prst="rect">
-                        <a:avLst/>
-                      </a:prstGeom>
-                    </pic:spPr>
-                  </pic:pic>
-                </a:graphicData>
-              </a:graphic>
-            </wp:anchor>
-          </w:drawing>
-        </w:r>
-        <w:r>
-          <w:rPr>
-            <w:rFonts w:ascii="Courier New" w:hAnsi="Courier New" w:cs="Courier New"/>
-            <w:b/>
-            <w:noProof/>
-            <w:sz w:val="32"/>
-            <w:lang w:eastAsia="en-PH"/>
-          </w:rPr>
-          <mc:AlternateContent>
-            <mc:Choice Requires="wps">
-              <w:drawing>
-                <wp:anchor distT="0" distB="0" distL="114300" distR="114300" simplePos="0" relativeHeight="251698176" behindDoc="0" locked="0" layoutInCell="1" allowOverlap="1" wp14:anchorId="6A5B7416" wp14:editId="51816448">
-                  <wp:simplePos x="0" y="0"/>
-                  <wp:positionH relativeFrom="column">
-                    <wp:posOffset>-1371600</wp:posOffset>
-                  </wp:positionH>
-                  <wp:positionV relativeFrom="paragraph">
-                    <wp:posOffset>-287020</wp:posOffset>
-                  </wp:positionV>
-                  <wp:extent cx="7772400" cy="0"/>
-                  <wp:effectExtent l="0" t="19050" r="0" b="19050"/>
-                  <wp:wrapNone/>
-                  <wp:docPr id="1787709114" name="Straight Connector 1787709114"/>
-                  <wp:cNvGraphicFramePr/>
-                  <a:graphic xmlns:a="http://schemas.openxmlformats.org/drawingml/2006/main">
-                    <a:graphicData uri="http://schemas.microsoft.com/office/word/2010/wordprocessingShape">
-                      <wps:wsp>
-                        <wps:cNvCnPr/>
-                        <wps:spPr>
-                          <a:xfrm>
-                            <a:off x="0" y="0"/>
-                            <a:ext cx="7772400" cy="0"/>
-                          </a:xfrm>
-                          <a:prstGeom prst="line">
-                            <a:avLst/>
-                          </a:prstGeom>
-                          <a:ln w="38100"/>
-                        </wps:spPr>
-                        <wps:style>
-                          <a:lnRef idx="1">
-                            <a:schemeClr val="dk1"/>
-                          </a:lnRef>
-                          <a:fillRef idx="0">
-                            <a:schemeClr val="dk1"/>
-                          </a:fillRef>
-                          <a:effectRef idx="0">
-                            <a:schemeClr val="dk1"/>
-                          </a:effectRef>
-                          <a:fontRef idx="minor">
-                            <a:schemeClr val="tx1"/>
-                          </a:fontRef>
-                        </wps:style>
-                        <wps:bodyPr/>
-                      </wps:wsp>
-                    </a:graphicData>
-                  </a:graphic>
-                </wp:anchor>
-              </w:drawing>
-            </mc:Choice>
-            <mc:Fallback>
-              <w:pict>
-                <v:line w14:anchorId="41BC4CD1" id="Straight Connector 1787709114" o:spid="_x0000_s1026" style="position:absolute;z-index:251698176;visibility:visible;mso-wrap-style:square;mso-wrap-distance-left:9pt;mso-wrap-distance-top:0;mso-wrap-distance-right:9pt;mso-wrap-distance-bottom:0;mso-position-horizontal:absolute;mso-position-horizontal-relative:text;mso-position-vertical:absolute;mso-position-vertical-relative:text" from="-108pt,-22.6pt" to="7in,-22.6pt" o:gfxdata="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" strokecolor="black [3200]" strokeweight="3pt">
-                  <v:stroke joinstyle="miter"/>
-                </v:line>
-              </w:pict>
-            </mc:Fallback>
-          </mc:AlternateContent>
-        </w:r>
-        <w:r>
-          <w:rPr>
-            <w:rFonts w:ascii="Courier New" w:hAnsi="Courier New" w:cs="Courier New"/>
-            <w:b/>
-            <w:noProof/>
-            <w:sz w:val="36"/>
-            <w:lang w:eastAsia="en-PH"/>
-          </w:rPr>
-          <mc:AlternateContent>
-            <mc:Choice Requires="wps">
-              <w:drawing>
-                <wp:anchor distT="0" distB="0" distL="114300" distR="114300" simplePos="0" relativeHeight="251696128" behindDoc="0" locked="0" layoutInCell="1" allowOverlap="1" wp14:anchorId="6BF0F465" wp14:editId="15DCC985">
-                  <wp:simplePos x="0" y="0"/>
-                  <wp:positionH relativeFrom="column">
-                    <wp:posOffset>-228600</wp:posOffset>
-                  </wp:positionH>
-                  <wp:positionV relativeFrom="paragraph">
-                    <wp:posOffset>-572770</wp:posOffset>
-                  </wp:positionV>
-                  <wp:extent cx="0" cy="10191750"/>
-                  <wp:effectExtent l="19050" t="0" r="19050" b="0"/>
-                  <wp:wrapNone/>
-                  <wp:docPr id="1111103824" name="Straight Connector 1111103824"/>
-                  <wp:cNvGraphicFramePr/>
-                  <a:graphic xmlns:a="http://schemas.openxmlformats.org/drawingml/2006/main">
-                    <a:graphicData uri="http://schemas.microsoft.com/office/word/2010/wordprocessingShape">
-                      <wps:wsp>
-                        <wps:cNvCnPr/>
-                        <wps:spPr>
-                          <a:xfrm>
-                            <a:off x="0" y="0"/>
-                            <a:ext cx="0" cy="10191896"/>
-                          </a:xfrm>
-                          <a:prstGeom prst="line">
-                            <a:avLst/>
-                          </a:prstGeom>
-                          <a:ln w="38100"/>
-                        </wps:spPr>
-                        <wps:style>
-                          <a:lnRef idx="1">
-                            <a:schemeClr val="dk1"/>
-                          </a:lnRef>
-                          <a:fillRef idx="0">
-                            <a:schemeClr val="dk1"/>
-                          </a:fillRef>
-                          <a:effectRef idx="0">
-                            <a:schemeClr val="dk1"/>
-                          </a:effectRef>
-                          <a:fontRef idx="minor">
-                            <a:schemeClr val="tx1"/>
-                          </a:fontRef>
-                        </wps:style>
-                        <wps:bodyPr/>
-                      </wps:wsp>
-                    </a:graphicData>
-                  </a:graphic>
-                </wp:anchor>
-              </w:drawing>
-            </mc:Choice>
-            <mc:Fallback>
-              <w:pict>
-                <v:line w14:anchorId="7B6D0C49" id="Straight Connector 1111103824" o:spid="_x0000_s1026" style="position:absolute;z-index:251696128;visibility:visible;mso-wrap-style:square;mso-wrap-distance-left:9pt;mso-wrap-distance-top:0;mso-wrap-distance-right:9pt;mso-wrap-distance-bottom:0;mso-position-horizontal:absolute;mso-position-horizontal-relative:text;mso-position-vertical:absolute;mso-position-vertical-relative:text" from="-18pt,-45.1pt" to="-18pt,757.4pt" o:gfxdata="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" strokecolor="black [3200]" strokeweight="3pt">
-                  <v:stroke joinstyle="miter"/>
-                </v:line>
-              </w:pict>
-            </mc:Fallback>
-          </mc:AlternateContent>
-        </w:r>
-        <w:r>
-          <w:rPr>
-            <w:rFonts w:ascii="Courier New" w:hAnsi="Courier New" w:cs="Courier New"/>
-            <w:b/>
-            <w:noProof/>
-            <w:sz w:val="36"/>
-            <w:lang w:eastAsia="en-PH"/>
-          </w:rPr>
-          <mc:AlternateContent>
-            <mc:Choice Requires="wps">
-              <w:drawing>
-                <wp:anchor distT="0" distB="0" distL="114300" distR="114300" simplePos="0" relativeHeight="251697152" behindDoc="0" locked="0" layoutInCell="1" allowOverlap="1" wp14:anchorId="522BAC7C" wp14:editId="70850196">
-                  <wp:simplePos x="0" y="0"/>
-                  <wp:positionH relativeFrom="column">
-                    <wp:posOffset>5715000</wp:posOffset>
-                  </wp:positionH>
-                  <wp:positionV relativeFrom="paragraph">
-                    <wp:posOffset>-419735</wp:posOffset>
-                  </wp:positionV>
-                  <wp:extent cx="0" cy="10033635"/>
-                  <wp:effectExtent l="19050" t="0" r="19050" b="5715"/>
-                  <wp:wrapNone/>
-                  <wp:docPr id="60245847" name="Straight Connector 60245847"/>
-                  <wp:cNvGraphicFramePr/>
-                  <a:graphic xmlns:a="http://schemas.openxmlformats.org/drawingml/2006/main">
-                    <a:graphicData uri="http://schemas.microsoft.com/office/word/2010/wordprocessingShape">
-                      <wps:wsp>
-                        <wps:cNvCnPr/>
-                        <wps:spPr>
-                          <a:xfrm>
-                            <a:off x="0" y="0"/>
-                            <a:ext cx="0" cy="10033762"/>
-                          </a:xfrm>
-                          <a:prstGeom prst="line">
-                            <a:avLst/>
-                          </a:prstGeom>
-                          <a:ln w="38100"/>
-                        </wps:spPr>
-                        <wps:style>
-                          <a:lnRef idx="1">
-                            <a:schemeClr val="dk1"/>
-                          </a:lnRef>
-                          <a:fillRef idx="0">
-                            <a:schemeClr val="dk1"/>
-                          </a:fillRef>
-                          <a:effectRef idx="0">
-                            <a:schemeClr val="dk1"/>
-                          </a:effectRef>
-                          <a:fontRef idx="minor">
-                            <a:schemeClr val="tx1"/>
-                          </a:fontRef>
-                        </wps:style>
-                        <wps:bodyPr/>
-                      </wps:wsp>
-                    </a:graphicData>
-                  </a:graphic>
-                </wp:anchor>
-              </w:drawing>
-            </mc:Choice>
-            <mc:Fallback>
-              <w:pict>
-                <v:line w14:anchorId="3BA01796" id="Straight Connector 60245847" o:spid="_x0000_s1026" style="position:absolute;z-index:251697152;visibility:visible;mso-wrap-style:square;mso-wrap-distance-left:9pt;mso-wrap-distance-top:0;mso-wrap-distance-right:9pt;mso-wrap-distance-bottom:0;mso-position-horizontal:absolute;mso-position-horizontal-relative:text;mso-position-vertical:absolute;mso-position-vertical-relative:text" from="450pt,-33.05pt" to="450pt,757pt" o:gfxdata="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" strokecolor="black [3200]" strokeweight="3pt">
-                  <v:stroke joinstyle="miter"/>
-                </v:line>
-              </w:pict>
-            </mc:Fallback>
-          </mc:AlternateContent>
-        </w:r>
-        <w:r>
-          <w:rPr>
-            <w:rFonts w:ascii="Courier New" w:hAnsi="Courier New" w:cs="Courier New"/>
-            <w:b/>
-            <w:sz w:val="36"/>
-          </w:rPr>
-          <w:t>Kalinga State University</w:t>
-        </w:r>
-        <w:r>
-          <w:rPr>
-            <w:rFonts w:ascii="Courier New" w:hAnsi="Courier New" w:cs="Courier New"/>
-            <w:b/>
-            <w:sz w:val="36"/>
-          </w:rPr>
-          <w:tab/>
-        </w:r>
-      </w:p>
-      <w:p>
-        <w:pPr>
-          <w:pStyle w:val="Header"/>
-          <w:tabs>
-            <w:tab w:val="clear" w:pos="9360"/>
-            <w:tab w:val="left" w:pos="2256"/>
-            <w:tab w:val="center" w:pos="4320"/>
-            <w:tab w:val="right" w:pos="8642"/>
-          </w:tabs>
-          <w:rPr>
-            <w:rFonts w:ascii="Courier New" w:hAnsi="Courier New" w:cs="Courier New"/>
-            <w:sz w:val="24"/>
-          </w:rPr>
-        </w:pPr>
-        <w:r>
-          <w:rPr>
-            <w:rFonts w:ascii="Courier New" w:hAnsi="Courier New" w:cs="Courier New"/>
-            <w:sz w:val="24"/>
-          </w:rPr>
-          <w:tab/>
-        </w:r>
-        <w:r>
-          <w:rPr>
-            <w:rFonts w:ascii="Courier New" w:hAnsi="Courier New" w:cs="Courier New"/>
-            <w:sz w:val="24"/>
-          </w:rPr>
-          <w:tab/>
-          <w:t>Bulanao, Tabuk City, Kalinga</w:t>
-        </w:r>
-      </w:p>
-      <w:p>
-        <w:pPr>
-          <w:pStyle w:val="Header"/>
-          <w:tabs>
-            <w:tab w:val="clear" w:pos="9360"/>
-            <w:tab w:val="left" w:pos="2256"/>
-            <w:tab w:val="center" w:pos="4320"/>
-            <w:tab w:val="right" w:pos="8642"/>
-          </w:tabs>
-          <w:rPr>
-            <w:rFonts w:ascii="Courier New" w:hAnsi="Courier New" w:cs="Courier New"/>
-            <w:sz w:val="24"/>
-          </w:rPr>
-        </w:pPr>
-        <w:r>
-          <w:rPr>
-            <w:rFonts w:ascii="Courier New" w:hAnsi="Courier New" w:cs="Courier New"/>
-            <w:sz w:val="24"/>
-          </w:rPr>
-          <w:tab/>
-        </w:r>
-      </w:p>
-      <w:p>
-        <w:pPr>
-          <w:pStyle w:val="Header"/>
-          <w:jc w:val="right"/>
-          <w:rPr>
-            <w:rFonts w:ascii="Courier New" w:hAnsi="Courier New" w:cs="Courier New"/>
-            <w:sz w:val="20"/>
-            <w:szCs w:val="20"/>
-          </w:rPr>
-        </w:pPr>
-      </w:p>
-    </w:sdtContent>
-  </w:sdt>
-  <w:p>
-    <w:pPr>
-      <w:pStyle w:val="Header"/>
-      <w:rPr>
-        <w:rFonts w:ascii="Courier New" w:hAnsi="Courier New" w:cs="Courier New"/>
-      </w:rPr>
-    </w:pPr>
-  </w:p>
-</w:hdr>
-</file>
-
-<file path=word/header7.xml><?xml version="1.0" encoding="utf-8"?>
-<w:hdr xmlns:wpc="http://schemas.microsoft.com/office/word/2010/wordprocessingCanvas" xmlns:cx="http://schemas.microsoft.com/office/drawing/2014/chartex" xmlns:cx1="http://schemas.microsoft.com/office/drawing/2015/9/8/chartex" xmlns:cx2="http://schemas.microsoft.com/office/drawing/2015/10/21/chartex" xmlns:cx3="http://schemas.microsoft.com/office/drawing/2016/5/9/chartex" xmlns:cx4="http://schemas.microsoft.com/office/drawing/2016/5/10/chartex" xmlns:cx5="http://schemas.microsoft.com/office/drawing/2016/5/11/chartex" xmlns:cx6="http://schemas.microsoft.com/office/drawing/2016/5/12/chartex" xmlns:cx7="http://schemas.microsoft.com/office/drawing/2016/5/13/chartex" xmlns:cx8="http://schemas.microsoft.com/office/drawing/2016/5/14/chartex" xmlns:mc="http://schemas.openxmlformats.org/markup-compatibility/2006" xmlns:aink="http://schemas.microsoft.com/office/drawing/2016/ink" xmlns:am3d="http://schemas.microsoft.com/office/drawing/2017/model3d" xmlns:o="urn:schemas-microsoft-com:office:office" xmlns:oel="http://schemas.microsoft.com/office/2019/extlst" xmlns:r="http://schemas.openxmlformats.org/officeDocument/2006/relationships" xmlns:m="http://schemas.openxmlformats.org/officeDocument/2006/math" xmlns:v="urn:schemas-microsoft-com:vml" xmlns:wp14="http://schemas.microsoft.com/office/word/2010/wordprocessingDrawing" xmlns:wp="http://schemas.openxmlformats.org/drawingml/2006/wordprocessingDrawing" xmlns:w10="urn:schemas-microsoft-com:office:word" xmlns:w="http://schemas.openxmlformats.org/wordprocessingml/2006/main" xmlns:w14="http://schemas.microsoft.com/office/word/2010/wordml" xmlns:w15="http://schemas.microsoft.com/office/word/2012/wordml" xmlns:w16cex="http://schemas.microsoft.com/office/word/2018/wordml/cex" xmlns:w16cid="http://schemas.microsoft.com/office/word/2016/wordml/cid" xmlns:w16="http://schemas.microsoft.com/office/word/2018/wordml" xmlns:w16du="http://schemas.microsoft.com/office/word/2023/wordml/word16du" xmlns:w16sdtdh="http://schemas.microsoft.com/office/word/2020/wordml/sdtdatahash" xmlns:w16sdtfl="http://schemas.microsoft.com/office/word/2024/wordml/sdtformatlock" xmlns:w16se="http://schemas.microsoft.com/office/word/2015/wordml/symex" xmlns:wpg="http://schemas.microsoft.com/office/word/2010/wordprocessingGroup" xmlns:wpi="http://schemas.microsoft.com/office/word/2010/wordprocessingInk" xmlns:wne="http://schemas.microsoft.com/office/word/2006/wordml" xmlns:wps="http://schemas.microsoft.com/office/word/2010/wordprocessingShape" mc:Ignorable="w14 w15 w16se w16cid w16 w16cex w16sdtdh w16sdtfl w16du wp14">
-  <w:sdt>
-    <w:sdtPr>
-      <w:id w:val="40792332"/>
-    </w:sdtPr>
-    <w:sdtEndPr>
-      <w:rPr>
-        <w:rFonts w:ascii="Courier New" w:hAnsi="Courier New" w:cs="Courier New"/>
-        <w:sz w:val="20"/>
-        <w:szCs w:val="20"/>
-      </w:rPr>
-    </w:sdtEndPr>
-    <w:sdtContent>
-      <w:p>
-        <w:pPr>
-          <w:pStyle w:val="Header"/>
-          <w:tabs>
-            <w:tab w:val="center" w:pos="4321"/>
-            <w:tab w:val="right" w:pos="8642"/>
-          </w:tabs>
-          <w:rPr>
-            <w:rFonts w:ascii="Courier New" w:hAnsi="Courier New" w:cs="Courier New"/>
-            <w:b/>
-            <w:sz w:val="32"/>
-          </w:rPr>
-        </w:pPr>
-        <w:r>
-          <w:tab/>
-        </w:r>
-        <w:r>
-          <w:rPr>
-            <w:rFonts w:ascii="Courier New" w:hAnsi="Courier New" w:cs="Courier New"/>
-            <w:b/>
-            <w:noProof/>
-            <w:sz w:val="36"/>
-            <w:lang w:eastAsia="en-PH"/>
-          </w:rPr>
-          <w:drawing>
-            <wp:anchor distT="0" distB="0" distL="114300" distR="114300" simplePos="0" relativeHeight="251710464" behindDoc="0" locked="0" layoutInCell="1" allowOverlap="1" wp14:anchorId="400D7994" wp14:editId="5FFDE659">
-              <wp:simplePos x="0" y="0"/>
-              <wp:positionH relativeFrom="column">
-                <wp:posOffset>-246380</wp:posOffset>
-              </wp:positionH>
-              <wp:positionV relativeFrom="paragraph">
-                <wp:posOffset>-198120</wp:posOffset>
-              </wp:positionV>
-              <wp:extent cx="823595" cy="724535"/>
-              <wp:effectExtent l="0" t="0" r="14605" b="18415"/>
-              <wp:wrapNone/>
-              <wp:docPr id="29226787" name="Picture 29226787"/>
-              <wp:cNvGraphicFramePr>
-                <a:graphicFrameLocks xmlns:a="http://schemas.openxmlformats.org/drawingml/2006/main" noChangeAspect="1"/>
-              </wp:cNvGraphicFramePr>
-              <a:graphic xmlns:a="http://schemas.openxmlformats.org/drawingml/2006/main">
-                <a:graphicData uri="http://schemas.openxmlformats.org/drawingml/2006/picture">
-                  <pic:pic xmlns:pic="http://schemas.openxmlformats.org/drawingml/2006/picture">
-                    <pic:nvPicPr>
-                      <pic:cNvPr id="700363394" name="Picture 700363394"/>
-                      <pic:cNvPicPr>
-                        <a:picLocks noChangeAspect="1"/>
-                      </pic:cNvPicPr>
-                    </pic:nvPicPr>
-                    <pic:blipFill>
-                      <a:blip r:embed="rId1">
-                        <a:extLst>
-                          <a:ext uri="{28A0092B-C50C-407E-A947-70E740481C1C}">
-                            <a14:useLocalDpi xmlns:a14="http://schemas.microsoft.com/office/drawing/2010/main" val="0"/>
-                          </a:ext>
-                        </a:extLst>
-                      </a:blip>
-                      <a:stretch>
-                        <a:fillRect/>
-                      </a:stretch>
-                    </pic:blipFill>
-                    <pic:spPr>
-                      <a:xfrm>
-                        <a:off x="0" y="0"/>
-                        <a:ext cx="823578" cy="724710"/>
-                      </a:xfrm>
-                      <a:prstGeom prst="rect">
-                        <a:avLst/>
-                      </a:prstGeom>
-                    </pic:spPr>
-                  </pic:pic>
-                </a:graphicData>
-              </a:graphic>
-            </wp:anchor>
-          </w:drawing>
-        </w:r>
-        <w:r>
-          <w:rPr>
-            <w:rFonts w:ascii="Courier New" w:hAnsi="Courier New" w:cs="Courier New"/>
-            <w:b/>
-            <w:noProof/>
-            <w:sz w:val="32"/>
-            <w:lang w:eastAsia="en-PH"/>
-          </w:rPr>
-          <mc:AlternateContent>
-            <mc:Choice Requires="wps">
-              <w:drawing>
-                <wp:anchor distT="0" distB="0" distL="114300" distR="114300" simplePos="0" relativeHeight="251713536" behindDoc="0" locked="0" layoutInCell="1" allowOverlap="1" wp14:anchorId="2A7ADE64" wp14:editId="46B2780C">
-                  <wp:simplePos x="0" y="0"/>
-                  <wp:positionH relativeFrom="column">
-                    <wp:posOffset>-1371600</wp:posOffset>
-                  </wp:positionH>
-                  <wp:positionV relativeFrom="paragraph">
-                    <wp:posOffset>-287020</wp:posOffset>
-                  </wp:positionV>
-                  <wp:extent cx="7772400" cy="0"/>
-                  <wp:effectExtent l="0" t="19050" r="0" b="19050"/>
-                  <wp:wrapNone/>
-                  <wp:docPr id="15417755" name="Straight Connector 15417755"/>
-                  <wp:cNvGraphicFramePr/>
-                  <a:graphic xmlns:a="http://schemas.openxmlformats.org/drawingml/2006/main">
-                    <a:graphicData uri="http://schemas.microsoft.com/office/word/2010/wordprocessingShape">
-                      <wps:wsp>
-                        <wps:cNvCnPr/>
-                        <wps:spPr>
-                          <a:xfrm>
-                            <a:off x="0" y="0"/>
-                            <a:ext cx="7772400" cy="0"/>
-                          </a:xfrm>
-                          <a:prstGeom prst="line">
-                            <a:avLst/>
-                          </a:prstGeom>
-                          <a:ln w="38100"/>
-                        </wps:spPr>
-                        <wps:style>
-                          <a:lnRef idx="1">
-                            <a:schemeClr val="dk1"/>
-                          </a:lnRef>
-                          <a:fillRef idx="0">
-                            <a:schemeClr val="dk1"/>
-                          </a:fillRef>
-                          <a:effectRef idx="0">
-                            <a:schemeClr val="dk1"/>
-                          </a:effectRef>
-                          <a:fontRef idx="minor">
-                            <a:schemeClr val="tx1"/>
-                          </a:fontRef>
-                        </wps:style>
-                        <wps:bodyPr/>
-                      </wps:wsp>
-                    </a:graphicData>
-                  </a:graphic>
-                </wp:anchor>
-              </w:drawing>
-            </mc:Choice>
-            <mc:Fallback>
-              <w:pict>
-                <v:line w14:anchorId="78616D17" id="Straight Connector 15417755" o:spid="_x0000_s1026" style="position:absolute;z-index:251713536;visibility:visible;mso-wrap-style:square;mso-wrap-distance-left:9pt;mso-wrap-distance-top:0;mso-wrap-distance-right:9pt;mso-wrap-distance-bottom:0;mso-position-horizontal:absolute;mso-position-horizontal-relative:text;mso-position-vertical:absolute;mso-position-vertical-relative:text" from="-108pt,-22.6pt" to="7in,-22.6pt" o:gfxdata="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" strokecolor="black [3200]" strokeweight="3pt">
-                  <v:stroke joinstyle="miter"/>
-                </v:line>
-              </w:pict>
-            </mc:Fallback>
-          </mc:AlternateContent>
-        </w:r>
-        <w:r>
-          <w:rPr>
-            <w:rFonts w:ascii="Courier New" w:hAnsi="Courier New" w:cs="Courier New"/>
-            <w:b/>
-            <w:noProof/>
-            <w:sz w:val="36"/>
-            <w:lang w:eastAsia="en-PH"/>
-          </w:rPr>
-          <mc:AlternateContent>
-            <mc:Choice Requires="wps">
-              <w:drawing>
-                <wp:anchor distT="0" distB="0" distL="114300" distR="114300" simplePos="0" relativeHeight="251711488" behindDoc="0" locked="0" layoutInCell="1" allowOverlap="1" wp14:anchorId="47B43668" wp14:editId="679809A6">
-                  <wp:simplePos x="0" y="0"/>
-                  <wp:positionH relativeFrom="column">
-                    <wp:posOffset>-228600</wp:posOffset>
-                  </wp:positionH>
-                  <wp:positionV relativeFrom="paragraph">
-                    <wp:posOffset>-572770</wp:posOffset>
-                  </wp:positionV>
-                  <wp:extent cx="0" cy="10191750"/>
-                  <wp:effectExtent l="19050" t="0" r="19050" b="0"/>
-                  <wp:wrapNone/>
-                  <wp:docPr id="1857502815" name="Straight Connector 1857502815"/>
-                  <wp:cNvGraphicFramePr/>
-                  <a:graphic xmlns:a="http://schemas.openxmlformats.org/drawingml/2006/main">
-                    <a:graphicData uri="http://schemas.microsoft.com/office/word/2010/wordprocessingShape">
-                      <wps:wsp>
-                        <wps:cNvCnPr/>
-                        <wps:spPr>
-                          <a:xfrm>
-                            <a:off x="0" y="0"/>
-                            <a:ext cx="0" cy="10191896"/>
-                          </a:xfrm>
-                          <a:prstGeom prst="line">
-                            <a:avLst/>
-                          </a:prstGeom>
-                          <a:ln w="38100"/>
-                        </wps:spPr>
-                        <wps:style>
-                          <a:lnRef idx="1">
-                            <a:schemeClr val="dk1"/>
-                          </a:lnRef>
-                          <a:fillRef idx="0">
-                            <a:schemeClr val="dk1"/>
-                          </a:fillRef>
-                          <a:effectRef idx="0">
-                            <a:schemeClr val="dk1"/>
-                          </a:effectRef>
-                          <a:fontRef idx="minor">
-                            <a:schemeClr val="tx1"/>
-                          </a:fontRef>
-                        </wps:style>
-                        <wps:bodyPr/>
-                      </wps:wsp>
-                    </a:graphicData>
-                  </a:graphic>
-                </wp:anchor>
-              </w:drawing>
-            </mc:Choice>
-            <mc:Fallback>
-              <w:pict>
-                <v:line w14:anchorId="1F25FDCB" id="Straight Connector 1857502815" o:spid="_x0000_s1026" style="position:absolute;z-index:251711488;visibility:visible;mso-wrap-style:square;mso-wrap-distance-left:9pt;mso-wrap-distance-top:0;mso-wrap-distance-right:9pt;mso-wrap-distance-bottom:0;mso-position-horizontal:absolute;mso-position-horizontal-relative:text;mso-position-vertical:absolute;mso-position-vertical-relative:text" from="-18pt,-45.1pt" to="-18pt,757.4pt" o:gfxdata="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" strokecolor="black [3200]" strokeweight="3pt">
-                  <v:stroke joinstyle="miter"/>
-                </v:line>
-              </w:pict>
-            </mc:Fallback>
-          </mc:AlternateContent>
-        </w:r>
-        <w:r>
-          <w:rPr>
-            <w:rFonts w:ascii="Courier New" w:hAnsi="Courier New" w:cs="Courier New"/>
-            <w:b/>
-            <w:noProof/>
-            <w:sz w:val="36"/>
-            <w:lang w:eastAsia="en-PH"/>
-          </w:rPr>
-          <mc:AlternateContent>
-            <mc:Choice Requires="wps">
-              <w:drawing>
-                <wp:anchor distT="0" distB="0" distL="114300" distR="114300" simplePos="0" relativeHeight="251712512" behindDoc="0" locked="0" layoutInCell="1" allowOverlap="1" wp14:anchorId="4EB7054A" wp14:editId="5E52B582">
-                  <wp:simplePos x="0" y="0"/>
-                  <wp:positionH relativeFrom="column">
-                    <wp:posOffset>5715000</wp:posOffset>
-                  </wp:positionH>
-                  <wp:positionV relativeFrom="paragraph">
-                    <wp:posOffset>-419735</wp:posOffset>
-                  </wp:positionV>
-                  <wp:extent cx="0" cy="10033635"/>
-                  <wp:effectExtent l="19050" t="0" r="19050" b="5715"/>
-                  <wp:wrapNone/>
-                  <wp:docPr id="1102913797" name="Straight Connector 1102913797"/>
-                  <wp:cNvGraphicFramePr/>
-                  <a:graphic xmlns:a="http://schemas.openxmlformats.org/drawingml/2006/main">
-                    <a:graphicData uri="http://schemas.microsoft.com/office/word/2010/wordprocessingShape">
-                      <wps:wsp>
-                        <wps:cNvCnPr/>
-                        <wps:spPr>
-                          <a:xfrm>
-                            <a:off x="0" y="0"/>
-                            <a:ext cx="0" cy="10033762"/>
-                          </a:xfrm>
-                          <a:prstGeom prst="line">
-                            <a:avLst/>
-                          </a:prstGeom>
-                          <a:ln w="38100"/>
-                        </wps:spPr>
-                        <wps:style>
-                          <a:lnRef idx="1">
-                            <a:schemeClr val="dk1"/>
-                          </a:lnRef>
-                          <a:fillRef idx="0">
-                            <a:schemeClr val="dk1"/>
-                          </a:fillRef>
-                          <a:effectRef idx="0">
-                            <a:schemeClr val="dk1"/>
-                          </a:effectRef>
-                          <a:fontRef idx="minor">
-                            <a:schemeClr val="tx1"/>
-                          </a:fontRef>
-                        </wps:style>
-                        <wps:bodyPr/>
-                      </wps:wsp>
-                    </a:graphicData>
-                  </a:graphic>
-                </wp:anchor>
-              </w:drawing>
-            </mc:Choice>
-            <mc:Fallback>
-              <w:pict>
-                <v:line w14:anchorId="48A6FF55" id="Straight Connector 1102913797" o:spid="_x0000_s1026" style="position:absolute;z-index:251712512;visibility:visible;mso-wrap-style:square;mso-wrap-distance-left:9pt;mso-wrap-distance-top:0;mso-wrap-distance-right:9pt;mso-wrap-distance-bottom:0;mso-position-horizontal:absolute;mso-position-horizontal-relative:text;mso-position-vertical:absolute;mso-position-vertical-relative:text" from="450pt,-33.05pt" to="450pt,757pt" o:gfxdata="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" strokecolor="black [3200]" strokeweight="3pt">
-                  <v:stroke joinstyle="miter"/>
-                </v:line>
-              </w:pict>
-            </mc:Fallback>
-          </mc:AlternateContent>
-        </w:r>
-        <w:r>
-          <w:rPr>
-            <w:rFonts w:ascii="Courier New" w:hAnsi="Courier New" w:cs="Courier New"/>
-            <w:b/>
-            <w:sz w:val="36"/>
-          </w:rPr>
-          <w:t>Kalinga State University</w:t>
-        </w:r>
-        <w:r>
-          <w:rPr>
-            <w:rFonts w:ascii="Courier New" w:hAnsi="Courier New" w:cs="Courier New"/>
-            <w:b/>
-            <w:sz w:val="36"/>
-          </w:rPr>
-          <w:tab/>
-        </w:r>
-      </w:p>
-      <w:p>
-        <w:pPr>
-          <w:pStyle w:val="Header"/>
-          <w:tabs>
-            <w:tab w:val="clear" w:pos="9360"/>
-            <w:tab w:val="left" w:pos="2256"/>
-            <w:tab w:val="center" w:pos="4320"/>
-            <w:tab w:val="right" w:pos="8642"/>
-          </w:tabs>
-          <w:rPr>
-            <w:rFonts w:ascii="Courier New" w:hAnsi="Courier New" w:cs="Courier New"/>
-            <w:sz w:val="24"/>
-          </w:rPr>
-        </w:pPr>
-        <w:r>
-          <w:rPr>
-            <w:rFonts w:ascii="Courier New" w:hAnsi="Courier New" w:cs="Courier New"/>
-            <w:sz w:val="24"/>
-          </w:rPr>
-          <w:tab/>
-        </w:r>
-        <w:r>
-          <w:rPr>
-            <w:rFonts w:ascii="Courier New" w:hAnsi="Courier New" w:cs="Courier New"/>
-            <w:sz w:val="24"/>
-          </w:rPr>
-          <w:tab/>
-          <w:t>Bulanao, Tabuk City, Kalinga</w:t>
-        </w:r>
-      </w:p>
-      <w:p>
-        <w:pPr>
-          <w:pStyle w:val="Header"/>
-          <w:tabs>
-            <w:tab w:val="clear" w:pos="9360"/>
-            <w:tab w:val="left" w:pos="2256"/>
-            <w:tab w:val="center" w:pos="4320"/>
-            <w:tab w:val="right" w:pos="8642"/>
-          </w:tabs>
-          <w:rPr>
-            <w:rFonts w:ascii="Courier New" w:hAnsi="Courier New" w:cs="Courier New"/>
-            <w:sz w:val="24"/>
-          </w:rPr>
-        </w:pPr>
-        <w:r>
-          <w:rPr>
-            <w:rFonts w:ascii="Courier New" w:hAnsi="Courier New" w:cs="Courier New"/>
-            <w:sz w:val="24"/>
-          </w:rPr>
-          <w:tab/>
-        </w:r>
-      </w:p>
-      <w:p>
-        <w:pPr>
-          <w:pStyle w:val="Header"/>
-          <w:jc w:val="right"/>
-          <w:rPr>
-            <w:rFonts w:ascii="Courier New" w:hAnsi="Courier New" w:cs="Courier New"/>
-            <w:sz w:val="20"/>
-            <w:szCs w:val="20"/>
-          </w:rPr>
-        </w:pPr>
-        <w:r>
-          <w:rPr>
-            <w:rFonts w:ascii="Courier New" w:hAnsi="Courier New" w:cs="Courier New"/>
-            <w:color w:val="7F7F7F" w:themeColor="background1" w:themeShade="7F"/>
-            <w:spacing w:val="60"/>
-            <w:sz w:val="20"/>
-            <w:szCs w:val="20"/>
-          </w:rPr>
-          <w:t>Design and Methodology</w:t>
-        </w:r>
-        <w:r>
-          <w:rPr>
-            <w:rFonts w:ascii="Courier New" w:hAnsi="Courier New" w:cs="Courier New"/>
-            <w:sz w:val="20"/>
-            <w:szCs w:val="20"/>
-          </w:rPr>
-          <w:t xml:space="preserve"> | </w:t>
-        </w:r>
-        <w:r>
-          <w:rPr>
-            <w:rFonts w:ascii="Courier New" w:hAnsi="Courier New" w:cs="Courier New"/>
-            <w:sz w:val="20"/>
-            <w:szCs w:val="20"/>
-          </w:rPr>
-          <w:fldChar w:fldCharType="begin"/>
-        </w:r>
-        <w:r>
-          <w:rPr>
-            <w:rFonts w:ascii="Courier New" w:hAnsi="Courier New" w:cs="Courier New"/>
-            <w:sz w:val="20"/>
-            <w:szCs w:val="20"/>
-          </w:rPr>
-          <w:instrText xml:space="preserve"> PAGE   \* MERGEFORMAT </w:instrText>
-        </w:r>
-        <w:r>
-          <w:rPr>
-            <w:rFonts w:ascii="Courier New" w:hAnsi="Courier New" w:cs="Courier New"/>
-            <w:sz w:val="20"/>
-            <w:szCs w:val="20"/>
-          </w:rPr>
-          <w:fldChar w:fldCharType="separate"/>
-        </w:r>
-        <w:r>
-          <w:rPr>
-            <w:rFonts w:ascii="Courier New" w:hAnsi="Courier New" w:cs="Courier New"/>
-            <w:b/>
-            <w:bCs/>
-            <w:noProof/>
-            <w:sz w:val="20"/>
-            <w:szCs w:val="20"/>
-          </w:rPr>
-          <w:t>1</w:t>
-        </w:r>
-        <w:r>
-          <w:rPr>
-            <w:rFonts w:ascii="Courier New" w:hAnsi="Courier New" w:cs="Courier New"/>
-            <w:b/>
-            <w:bCs/>
-            <w:noProof/>
-            <w:sz w:val="20"/>
-            <w:szCs w:val="20"/>
-          </w:rPr>
-          <w:fldChar w:fldCharType="end"/>
-        </w:r>
-      </w:p>
-    </w:sdtContent>
-  </w:sdt>
-  <w:p>
-    <w:pPr>
-      <w:pStyle w:val="Header"/>
-      <w:rPr>
-        <w:rFonts w:ascii="Courier New" w:hAnsi="Courier New" w:cs="Courier New"/>
-      </w:rPr>
-    </w:pPr>
-  </w:p>
-</w:hdr>
-</file>
-
-<file path=word/header8.xml><?xml version="1.0" encoding="utf-8"?>
-<w:hdr xmlns:wpc="http://schemas.microsoft.com/office/word/2010/wordprocessingCanvas" xmlns:cx="http://schemas.microsoft.com/office/drawing/2014/chartex" xmlns:cx1="http://schemas.microsoft.com/office/drawing/2015/9/8/chartex" xmlns:cx2="http://schemas.microsoft.com/office/drawing/2015/10/21/chartex" xmlns:cx3="http://schemas.microsoft.com/office/drawing/2016/5/9/chartex" xmlns:cx4="http://schemas.microsoft.com/office/drawing/2016/5/10/chartex" xmlns:cx5="http://schemas.microsoft.com/office/drawing/2016/5/11/chartex" xmlns:cx6="http://schemas.microsoft.com/office/drawing/2016/5/12/chartex" xmlns:cx7="http://schemas.microsoft.com/office/drawing/2016/5/13/chartex" xmlns:cx8="http://schemas.microsoft.com/office/drawing/2016/5/14/chartex" xmlns:mc="http://schemas.openxmlformats.org/markup-compatibility/2006" xmlns:aink="http://schemas.microsoft.com/office/drawing/2016/ink" xmlns:am3d="http://schemas.microsoft.com/office/drawing/2017/model3d" xmlns:o="urn:schemas-microsoft-com:office:office" xmlns:oel="http://schemas.microsoft.com/office/2019/extlst" xmlns:r="http://schemas.openxmlformats.org/officeDocument/2006/relationships" xmlns:m="http://schemas.openxmlformats.org/officeDocument/2006/math" xmlns:v="urn:schemas-microsoft-com:vml" xmlns:wp14="http://schemas.microsoft.com/office/word/2010/wordprocessingDrawing" xmlns:wp="http://schemas.openxmlformats.org/drawingml/2006/wordprocessingDrawing" xmlns:w10="urn:schemas-microsoft-com:office:word" xmlns:w="http://schemas.openxmlformats.org/wordprocessingml/2006/main" xmlns:w14="http://schemas.microsoft.com/office/word/2010/wordml" xmlns:w15="http://schemas.microsoft.com/office/word/2012/wordml" xmlns:w16cex="http://schemas.microsoft.com/office/word/2018/wordml/cex" xmlns:w16cid="http://schemas.microsoft.com/office/word/2016/wordml/cid" xmlns:w16="http://schemas.microsoft.com/office/word/2018/wordml" xmlns:w16du="http://schemas.microsoft.com/office/word/2023/wordml/word16du" xmlns:w16sdtdh="http://schemas.microsoft.com/office/word/2020/wordml/sdtdatahash" xmlns:w16sdtfl="http://schemas.microsoft.com/office/word/2024/wordml/sdtformatlock" xmlns:w16se="http://schemas.microsoft.com/office/word/2015/wordml/symex" xmlns:wpg="http://schemas.microsoft.com/office/word/2010/wordprocessingGroup" xmlns:wpi="http://schemas.microsoft.com/office/word/2010/wordprocessingInk" xmlns:wne="http://schemas.microsoft.com/office/word/2006/wordml" xmlns:wps="http://schemas.microsoft.com/office/word/2010/wordprocessingShape" mc:Ignorable="w14 w15 w16se w16cid w16 w16cex w16sdtdh w16sdtfl w16du wp14">
-  <w:sdt>
-    <w:sdtPr>
-      <w:id w:val="1983423169"/>
-    </w:sdtPr>
-    <w:sdtEndPr>
-      <w:rPr>
-        <w:rFonts w:ascii="Courier New" w:hAnsi="Courier New" w:cs="Courier New"/>
-        <w:sz w:val="20"/>
-        <w:szCs w:val="20"/>
-      </w:rPr>
-    </w:sdtEndPr>
-    <w:sdtContent>
-      <w:p>
-        <w:pPr>
-          <w:pStyle w:val="Header"/>
-          <w:tabs>
-            <w:tab w:val="center" w:pos="4321"/>
-            <w:tab w:val="right" w:pos="8642"/>
-          </w:tabs>
-          <w:rPr>
-            <w:rFonts w:ascii="Courier New" w:hAnsi="Courier New" w:cs="Courier New"/>
-            <w:b/>
-            <w:sz w:val="32"/>
-          </w:rPr>
-        </w:pPr>
-        <w:r>
-          <w:tab/>
-        </w:r>
-        <w:r>
-          <w:rPr>
-            <w:rFonts w:ascii="Courier New" w:hAnsi="Courier New" w:cs="Courier New"/>
-            <w:b/>
-            <w:noProof/>
-            <w:sz w:val="36"/>
-            <w:lang w:eastAsia="en-PH"/>
-          </w:rPr>
-          <w:drawing>
-            <wp:anchor distT="0" distB="0" distL="114300" distR="114300" simplePos="0" relativeHeight="251705344" behindDoc="0" locked="0" layoutInCell="1" allowOverlap="1" wp14:anchorId="76CF24D9" wp14:editId="03C59511">
-              <wp:simplePos x="0" y="0"/>
-              <wp:positionH relativeFrom="column">
-                <wp:posOffset>-246380</wp:posOffset>
-              </wp:positionH>
-              <wp:positionV relativeFrom="paragraph">
-                <wp:posOffset>-198120</wp:posOffset>
-              </wp:positionV>
-              <wp:extent cx="823595" cy="724535"/>
-              <wp:effectExtent l="0" t="0" r="14605" b="18415"/>
-              <wp:wrapNone/>
-              <wp:docPr id="1220379455" name="Picture 1220379455"/>
-              <wp:cNvGraphicFramePr>
-                <a:graphicFrameLocks xmlns:a="http://schemas.openxmlformats.org/drawingml/2006/main" noChangeAspect="1"/>
-              </wp:cNvGraphicFramePr>
-              <a:graphic xmlns:a="http://schemas.openxmlformats.org/drawingml/2006/main">
-                <a:graphicData uri="http://schemas.openxmlformats.org/drawingml/2006/picture">
-                  <pic:pic xmlns:pic="http://schemas.openxmlformats.org/drawingml/2006/picture">
-                    <pic:nvPicPr>
-                      <pic:cNvPr id="700363394" name="Picture 700363394"/>
-                      <pic:cNvPicPr>
-                        <a:picLocks noChangeAspect="1"/>
-                      </pic:cNvPicPr>
-                    </pic:nvPicPr>
-                    <pic:blipFill>
-                      <a:blip r:embed="rId1">
-                        <a:extLst>
-                          <a:ext uri="{28A0092B-C50C-407E-A947-70E740481C1C}">
-                            <a14:useLocalDpi xmlns:a14="http://schemas.microsoft.com/office/drawing/2010/main" val="0"/>
-                          </a:ext>
-                        </a:extLst>
-                      </a:blip>
-                      <a:stretch>
-                        <a:fillRect/>
-                      </a:stretch>
-                    </pic:blipFill>
-                    <pic:spPr>
-                      <a:xfrm>
-                        <a:off x="0" y="0"/>
-                        <a:ext cx="823578" cy="724710"/>
-                      </a:xfrm>
-                      <a:prstGeom prst="rect">
-                        <a:avLst/>
-                      </a:prstGeom>
-                    </pic:spPr>
-                  </pic:pic>
-                </a:graphicData>
-              </a:graphic>
-            </wp:anchor>
-          </w:drawing>
-        </w:r>
-        <w:r>
-          <w:rPr>
-            <w:rFonts w:ascii="Courier New" w:hAnsi="Courier New" w:cs="Courier New"/>
-            <w:b/>
-            <w:noProof/>
-            <w:sz w:val="32"/>
-            <w:lang w:eastAsia="en-PH"/>
-          </w:rPr>
-          <mc:AlternateContent>
-            <mc:Choice Requires="wps">
-              <w:drawing>
-                <wp:anchor distT="0" distB="0" distL="114300" distR="114300" simplePos="0" relativeHeight="251708416" behindDoc="0" locked="0" layoutInCell="1" allowOverlap="1" wp14:anchorId="4DF466F2" wp14:editId="341E2D7A">
-                  <wp:simplePos x="0" y="0"/>
-                  <wp:positionH relativeFrom="column">
-                    <wp:posOffset>-1371600</wp:posOffset>
-                  </wp:positionH>
-                  <wp:positionV relativeFrom="paragraph">
-                    <wp:posOffset>-287020</wp:posOffset>
-                  </wp:positionV>
-                  <wp:extent cx="7772400" cy="0"/>
-                  <wp:effectExtent l="0" t="19050" r="0" b="19050"/>
-                  <wp:wrapNone/>
-                  <wp:docPr id="190166018" name="Straight Connector 190166018"/>
-                  <wp:cNvGraphicFramePr/>
-                  <a:graphic xmlns:a="http://schemas.openxmlformats.org/drawingml/2006/main">
-                    <a:graphicData uri="http://schemas.microsoft.com/office/word/2010/wordprocessingShape">
-                      <wps:wsp>
-                        <wps:cNvCnPr/>
-                        <wps:spPr>
-                          <a:xfrm>
-                            <a:off x="0" y="0"/>
-                            <a:ext cx="7772400" cy="0"/>
-                          </a:xfrm>
-                          <a:prstGeom prst="line">
-                            <a:avLst/>
-                          </a:prstGeom>
-                          <a:ln w="38100"/>
-                        </wps:spPr>
-                        <wps:style>
-                          <a:lnRef idx="1">
-                            <a:schemeClr val="dk1"/>
-                          </a:lnRef>
-                          <a:fillRef idx="0">
-                            <a:schemeClr val="dk1"/>
-                          </a:fillRef>
-                          <a:effectRef idx="0">
-                            <a:schemeClr val="dk1"/>
-                          </a:effectRef>
-                          <a:fontRef idx="minor">
-                            <a:schemeClr val="tx1"/>
-                          </a:fontRef>
-                        </wps:style>
-                        <wps:bodyPr/>
-                      </wps:wsp>
-                    </a:graphicData>
-                  </a:graphic>
-                </wp:anchor>
-              </w:drawing>
-            </mc:Choice>
-            <mc:Fallback>
-              <w:pict>
-                <v:line w14:anchorId="0AF80BF6" id="Straight Connector 190166018" o:spid="_x0000_s1026" style="position:absolute;z-index:251708416;visibility:visible;mso-wrap-style:square;mso-wrap-distance-left:9pt;mso-wrap-distance-top:0;mso-wrap-distance-right:9pt;mso-wrap-distance-bottom:0;mso-position-horizontal:absolute;mso-position-horizontal-relative:text;mso-position-vertical:absolute;mso-position-vertical-relative:text" from="-108pt,-22.6pt" to="7in,-22.6pt" o:gfxdata="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" strokecolor="black [3200]" strokeweight="3pt">
-                  <v:stroke joinstyle="miter"/>
-                </v:line>
-              </w:pict>
-            </mc:Fallback>
-          </mc:AlternateContent>
-        </w:r>
-        <w:r>
-          <w:rPr>
-            <w:rFonts w:ascii="Courier New" w:hAnsi="Courier New" w:cs="Courier New"/>
-            <w:b/>
-            <w:noProof/>
-            <w:sz w:val="36"/>
-            <w:lang w:eastAsia="en-PH"/>
-          </w:rPr>
-          <mc:AlternateContent>
-            <mc:Choice Requires="wps">
-              <w:drawing>
-                <wp:anchor distT="0" distB="0" distL="114300" distR="114300" simplePos="0" relativeHeight="251706368" behindDoc="0" locked="0" layoutInCell="1" allowOverlap="1" wp14:anchorId="04C379D1" wp14:editId="5A24E7E5">
-                  <wp:simplePos x="0" y="0"/>
-                  <wp:positionH relativeFrom="column">
-                    <wp:posOffset>-228600</wp:posOffset>
-                  </wp:positionH>
-                  <wp:positionV relativeFrom="paragraph">
-                    <wp:posOffset>-572770</wp:posOffset>
-                  </wp:positionV>
-                  <wp:extent cx="0" cy="10191750"/>
-                  <wp:effectExtent l="19050" t="0" r="19050" b="0"/>
-                  <wp:wrapNone/>
-                  <wp:docPr id="341334077" name="Straight Connector 341334077"/>
-                  <wp:cNvGraphicFramePr/>
-                  <a:graphic xmlns:a="http://schemas.openxmlformats.org/drawingml/2006/main">
-                    <a:graphicData uri="http://schemas.microsoft.com/office/word/2010/wordprocessingShape">
-                      <wps:wsp>
-                        <wps:cNvCnPr/>
-                        <wps:spPr>
-                          <a:xfrm>
-                            <a:off x="0" y="0"/>
-                            <a:ext cx="0" cy="10191896"/>
-                          </a:xfrm>
-                          <a:prstGeom prst="line">
-                            <a:avLst/>
-                          </a:prstGeom>
-                          <a:ln w="38100"/>
-                        </wps:spPr>
-                        <wps:style>
-                          <a:lnRef idx="1">
-                            <a:schemeClr val="dk1"/>
-                          </a:lnRef>
-                          <a:fillRef idx="0">
-                            <a:schemeClr val="dk1"/>
-                          </a:fillRef>
-                          <a:effectRef idx="0">
-                            <a:schemeClr val="dk1"/>
-                          </a:effectRef>
-                          <a:fontRef idx="minor">
-                            <a:schemeClr val="tx1"/>
-                          </a:fontRef>
-                        </wps:style>
-                        <wps:bodyPr/>
-                      </wps:wsp>
-                    </a:graphicData>
-                  </a:graphic>
-                </wp:anchor>
-              </w:drawing>
-            </mc:Choice>
-            <mc:Fallback>
-              <w:pict>
-                <v:line w14:anchorId="42220F27" id="Straight Connector 341334077" o:spid="_x0000_s1026" style="position:absolute;z-index:251706368;visibility:visible;mso-wrap-style:square;mso-wrap-distance-left:9pt;mso-wrap-distance-top:0;mso-wrap-distance-right:9pt;mso-wrap-distance-bottom:0;mso-position-horizontal:absolute;mso-position-horizontal-relative:text;mso-position-vertical:absolute;mso-position-vertical-relative:text" from="-18pt,-45.1pt" to="-18pt,757.4pt" o:gfxdata="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" strokecolor="black [3200]" strokeweight="3pt">
-                  <v:stroke joinstyle="miter"/>
-                </v:line>
-              </w:pict>
-            </mc:Fallback>
-          </mc:AlternateContent>
-        </w:r>
-        <w:r>
-          <w:rPr>
-            <w:rFonts w:ascii="Courier New" w:hAnsi="Courier New" w:cs="Courier New"/>
-            <w:b/>
-            <w:noProof/>
-            <w:sz w:val="36"/>
-            <w:lang w:eastAsia="en-PH"/>
-          </w:rPr>
-          <mc:AlternateContent>
-            <mc:Choice Requires="wps">
-              <w:drawing>
-                <wp:anchor distT="0" distB="0" distL="114300" distR="114300" simplePos="0" relativeHeight="251707392" behindDoc="0" locked="0" layoutInCell="1" allowOverlap="1" wp14:anchorId="54E11308" wp14:editId="59A407C0">
-                  <wp:simplePos x="0" y="0"/>
-                  <wp:positionH relativeFrom="column">
-                    <wp:posOffset>5715000</wp:posOffset>
-                  </wp:positionH>
-                  <wp:positionV relativeFrom="paragraph">
-                    <wp:posOffset>-419735</wp:posOffset>
-                  </wp:positionV>
-                  <wp:extent cx="0" cy="10033635"/>
-                  <wp:effectExtent l="19050" t="0" r="19050" b="5715"/>
-                  <wp:wrapNone/>
-                  <wp:docPr id="194450568" name="Straight Connector 194450568"/>
-                  <wp:cNvGraphicFramePr/>
-                  <a:graphic xmlns:a="http://schemas.openxmlformats.org/drawingml/2006/main">
-                    <a:graphicData uri="http://schemas.microsoft.com/office/word/2010/wordprocessingShape">
-                      <wps:wsp>
-                        <wps:cNvCnPr/>
-                        <wps:spPr>
-                          <a:xfrm>
-                            <a:off x="0" y="0"/>
-                            <a:ext cx="0" cy="10033762"/>
-                          </a:xfrm>
-                          <a:prstGeom prst="line">
-                            <a:avLst/>
-                          </a:prstGeom>
-                          <a:ln w="38100"/>
-                        </wps:spPr>
-                        <wps:style>
-                          <a:lnRef idx="1">
-                            <a:schemeClr val="dk1"/>
-                          </a:lnRef>
-                          <a:fillRef idx="0">
-                            <a:schemeClr val="dk1"/>
-                          </a:fillRef>
-                          <a:effectRef idx="0">
-                            <a:schemeClr val="dk1"/>
-                          </a:effectRef>
-                          <a:fontRef idx="minor">
-                            <a:schemeClr val="tx1"/>
-                          </a:fontRef>
-                        </wps:style>
-                        <wps:bodyPr/>
-                      </wps:wsp>
-                    </a:graphicData>
-                  </a:graphic>
-                </wp:anchor>
-              </w:drawing>
-            </mc:Choice>
-            <mc:Fallback>
-              <w:pict>
-                <v:line w14:anchorId="0F0EBD7E" id="Straight Connector 194450568" o:spid="_x0000_s1026" style="position:absolute;z-index:251707392;visibility:visible;mso-wrap-style:square;mso-wrap-distance-left:9pt;mso-wrap-distance-top:0;mso-wrap-distance-right:9pt;mso-wrap-distance-bottom:0;mso-position-horizontal:absolute;mso-position-horizontal-relative:text;mso-position-vertical:absolute;mso-position-vertical-relative:text" from="450pt,-33.05pt" to="450pt,757pt" o:gfxdata="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" strokecolor="black [3200]" strokeweight="3pt">
-                  <v:stroke joinstyle="miter"/>
-                </v:line>
-              </w:pict>
-            </mc:Fallback>
-          </mc:AlternateContent>
-        </w:r>
-        <w:r>
-          <w:rPr>
-            <w:rFonts w:ascii="Courier New" w:hAnsi="Courier New" w:cs="Courier New"/>
-            <w:b/>
-            <w:sz w:val="36"/>
-          </w:rPr>
-          <w:t>Kalinga State University</w:t>
-        </w:r>
-        <w:r>
-          <w:rPr>
-            <w:rFonts w:ascii="Courier New" w:hAnsi="Courier New" w:cs="Courier New"/>
-            <w:b/>
-            <w:sz w:val="36"/>
-          </w:rPr>
-          <w:tab/>
-        </w:r>
-      </w:p>
-      <w:p>
-        <w:pPr>
-          <w:pStyle w:val="Header"/>
-          <w:tabs>
-            <w:tab w:val="clear" w:pos="9360"/>
-            <w:tab w:val="left" w:pos="2256"/>
-            <w:tab w:val="center" w:pos="4320"/>
-            <w:tab w:val="right" w:pos="8642"/>
-          </w:tabs>
-          <w:rPr>
-            <w:rFonts w:ascii="Courier New" w:hAnsi="Courier New" w:cs="Courier New"/>
-            <w:sz w:val="24"/>
-          </w:rPr>
-        </w:pPr>
-        <w:r>
-          <w:rPr>
-            <w:rFonts w:ascii="Courier New" w:hAnsi="Courier New" w:cs="Courier New"/>
-            <w:sz w:val="24"/>
-          </w:rPr>
-          <w:tab/>
-        </w:r>
-        <w:r>
-          <w:rPr>
-            <w:rFonts w:ascii="Courier New" w:hAnsi="Courier New" w:cs="Courier New"/>
-            <w:sz w:val="24"/>
-          </w:rPr>
-          <w:tab/>
-          <w:t>Bulanao, Tabuk City, Kalinga</w:t>
-        </w:r>
-      </w:p>
-      <w:p>
-        <w:pPr>
-          <w:pStyle w:val="Header"/>
-          <w:tabs>
-            <w:tab w:val="clear" w:pos="9360"/>
-            <w:tab w:val="left" w:pos="2256"/>
-            <w:tab w:val="center" w:pos="4320"/>
-            <w:tab w:val="right" w:pos="8642"/>
-          </w:tabs>
-          <w:rPr>
-            <w:rFonts w:ascii="Courier New" w:hAnsi="Courier New" w:cs="Courier New"/>
-            <w:sz w:val="24"/>
-          </w:rPr>
-        </w:pPr>
-        <w:r>
-          <w:rPr>
-            <w:rFonts w:ascii="Courier New" w:hAnsi="Courier New" w:cs="Courier New"/>
-            <w:sz w:val="24"/>
-          </w:rPr>
-          <w:tab/>
-        </w:r>
-      </w:p>
-      <w:p>
-        <w:pPr>
-          <w:pStyle w:val="Header"/>
-          <w:jc w:val="right"/>
-          <w:rPr>
-            <w:rFonts w:ascii="Courier New" w:hAnsi="Courier New" w:cs="Courier New"/>
-            <w:sz w:val="20"/>
-            <w:szCs w:val="20"/>
-          </w:rPr>
-        </w:pPr>
-      </w:p>
-    </w:sdtContent>
-  </w:sdt>
-  <w:p>
-    <w:pPr>
-      <w:pStyle w:val="Header"/>
-      <w:rPr>
-        <w:rFonts w:ascii="Courier New" w:hAnsi="Courier New" w:cs="Courier New"/>
-      </w:rPr>
-    </w:pPr>
-  </w:p>
-</w:hdr>
-</file>
-
-<file path=word/header9.xml><?xml version="1.0" encoding="utf-8"?>
 <w:hdr xmlns:wpc="http://schemas.microsoft.com/office/word/2010/wordprocessingCanvas" xmlns:cx="http://schemas.microsoft.com/office/drawing/2014/chartex" xmlns:cx1="http://schemas.microsoft.com/office/drawing/2015/9/8/chartex" xmlns:cx2="http://schemas.microsoft.com/office/drawing/2015/10/21/chartex" xmlns:cx3="http://schemas.microsoft.com/office/drawing/2016/5/9/chartex" xmlns:cx4="http://schemas.microsoft.com/office/drawing/2016/5/10/chartex" xmlns:cx5="http://schemas.microsoft.com/office/drawing/2016/5/11/chartex" xmlns:cx6="http://schemas.microsoft.com/office/drawing/2016/5/12/chartex" xmlns:cx7="http://schemas.microsoft.com/office/drawing/2016/5/13/chartex" xmlns:cx8="http://schemas.microsoft.com/office/drawing/2016/5/14/chartex" xmlns:mc="http://schemas.openxmlformats.org/markup-compatibility/2006" xmlns:aink="http://schemas.microsoft.com/office/drawing/2016/ink" xmlns:am3d="http://schemas.microsoft.com/office/drawing/2017/model3d" xmlns:o="urn:schemas-microsoft-com:office:office" xmlns:oel="http://schemas.microsoft.com/office/2019/extlst" xmlns:r="http://schemas.openxmlformats.org/officeDocument/2006/relationships" xmlns:m="http://schemas.openxmlformats.org/officeDocument/2006/math" xmlns:v="urn:schemas-microsoft-com:vml" xmlns:wp14="http://schemas.microsoft.com/office/word/2010/wordprocessingDrawing" xmlns:wp="http://schemas.openxmlformats.org/drawingml/2006/wordprocessingDrawing" xmlns:w10="urn:schemas-microsoft-com:office:word" xmlns:w="http://schemas.openxmlformats.org/wordprocessingml/2006/main" xmlns:w14="http://schemas.microsoft.com/office/word/2010/wordml" xmlns:w15="http://schemas.microsoft.com/office/word/2012/wordml" xmlns:w16cex="http://schemas.microsoft.com/office/word/2018/wordml/cex" xmlns:w16cid="http://schemas.microsoft.com/office/word/2016/wordml/cid" xmlns:w16="http://schemas.microsoft.com/office/word/2018/wordml" xmlns:w16du="http://schemas.microsoft.com/office/word/2023/wordml/word16du" xmlns:w16sdtdh="http://schemas.microsoft.com/office/word/2020/wordml/sdtdatahash" xmlns:w16sdtfl="http://schemas.microsoft.com/office/word/2024/wordml/sdtformatlock" xmlns:w16se="http://schemas.microsoft.com/office/word/2015/wordml/symex" xmlns:wpg="http://schemas.microsoft.com/office/word/2010/wordprocessingGroup" xmlns:wpi="http://schemas.microsoft.com/office/word/2010/wordprocessingInk" xmlns:wne="http://schemas.microsoft.com/office/word/2006/wordml" xmlns:wps="http://schemas.microsoft.com/office/word/2010/wordprocessingShape" mc:Ignorable="w14 w15 w16se w16cid w16 w16cex w16sdtdh w16sdtfl w16du wp14">
   <w:sdt>
     <w:sdtPr>
@@ -11660,6 +8105,393 @@
           </w:rPr>
           <w:fldChar w:fldCharType="end"/>
         </w:r>
+      </w:p>
+    </w:sdtContent>
+  </w:sdt>
+  <w:p>
+    <w:pPr>
+      <w:pStyle w:val="Header"/>
+      <w:rPr>
+        <w:rFonts w:ascii="Courier New" w:hAnsi="Courier New" w:cs="Courier New"/>
+      </w:rPr>
+    </w:pPr>
+  </w:p>
+</w:hdr>
+</file>
+
+<file path=word/header2.xml><?xml version="1.0" encoding="utf-8"?>
+<w:hdr xmlns:wpc="http://schemas.microsoft.com/office/word/2010/wordprocessingCanvas" xmlns:cx="http://schemas.microsoft.com/office/drawing/2014/chartex" xmlns:cx1="http://schemas.microsoft.com/office/drawing/2015/9/8/chartex" xmlns:cx2="http://schemas.microsoft.com/office/drawing/2015/10/21/chartex" xmlns:cx3="http://schemas.microsoft.com/office/drawing/2016/5/9/chartex" xmlns:cx4="http://schemas.microsoft.com/office/drawing/2016/5/10/chartex" xmlns:cx5="http://schemas.microsoft.com/office/drawing/2016/5/11/chartex" xmlns:cx6="http://schemas.microsoft.com/office/drawing/2016/5/12/chartex" xmlns:cx7="http://schemas.microsoft.com/office/drawing/2016/5/13/chartex" xmlns:cx8="http://schemas.microsoft.com/office/drawing/2016/5/14/chartex" xmlns:mc="http://schemas.openxmlformats.org/markup-compatibility/2006" xmlns:aink="http://schemas.microsoft.com/office/drawing/2016/ink" xmlns:am3d="http://schemas.microsoft.com/office/drawing/2017/model3d" xmlns:o="urn:schemas-microsoft-com:office:office" xmlns:oel="http://schemas.microsoft.com/office/2019/extlst" xmlns:r="http://schemas.openxmlformats.org/officeDocument/2006/relationships" xmlns:m="http://schemas.openxmlformats.org/officeDocument/2006/math" xmlns:v="urn:schemas-microsoft-com:vml" xmlns:wp14="http://schemas.microsoft.com/office/word/2010/wordprocessingDrawing" xmlns:wp="http://schemas.openxmlformats.org/drawingml/2006/wordprocessingDrawing" xmlns:w10="urn:schemas-microsoft-com:office:word" xmlns:w="http://schemas.openxmlformats.org/wordprocessingml/2006/main" xmlns:w14="http://schemas.microsoft.com/office/word/2010/wordml" xmlns:w15="http://schemas.microsoft.com/office/word/2012/wordml" xmlns:w16cex="http://schemas.microsoft.com/office/word/2018/wordml/cex" xmlns:w16cid="http://schemas.microsoft.com/office/word/2016/wordml/cid" xmlns:w16="http://schemas.microsoft.com/office/word/2018/wordml" xmlns:w16du="http://schemas.microsoft.com/office/word/2023/wordml/word16du" xmlns:w16sdtdh="http://schemas.microsoft.com/office/word/2020/wordml/sdtdatahash" xmlns:w16sdtfl="http://schemas.microsoft.com/office/word/2024/wordml/sdtformatlock" xmlns:w16se="http://schemas.microsoft.com/office/word/2015/wordml/symex" xmlns:wpg="http://schemas.microsoft.com/office/word/2010/wordprocessingGroup" xmlns:wpi="http://schemas.microsoft.com/office/word/2010/wordprocessingInk" xmlns:wne="http://schemas.microsoft.com/office/word/2006/wordml" xmlns:wps="http://schemas.microsoft.com/office/word/2010/wordprocessingShape" mc:Ignorable="w14 w15 w16se w16cid w16 w16cex w16sdtdh w16sdtfl w16du wp14">
+  <w:sdt>
+    <w:sdtPr>
+      <w:id w:val="1831483142"/>
+    </w:sdtPr>
+    <w:sdtEndPr>
+      <w:rPr>
+        <w:rFonts w:ascii="Courier New" w:hAnsi="Courier New" w:cs="Courier New"/>
+        <w:sz w:val="20"/>
+        <w:szCs w:val="20"/>
+      </w:rPr>
+    </w:sdtEndPr>
+    <w:sdtContent>
+      <w:p>
+        <w:pPr>
+          <w:pStyle w:val="Header"/>
+          <w:tabs>
+            <w:tab w:val="center" w:pos="4321"/>
+            <w:tab w:val="right" w:pos="8642"/>
+          </w:tabs>
+          <w:rPr>
+            <w:rFonts w:ascii="Courier New" w:hAnsi="Courier New" w:cs="Courier New"/>
+            <w:b/>
+            <w:sz w:val="32"/>
+          </w:rPr>
+        </w:pPr>
+        <w:r>
+          <w:tab/>
+        </w:r>
+        <w:r>
+          <w:rPr>
+            <w:rFonts w:ascii="Courier New" w:hAnsi="Courier New" w:cs="Courier New"/>
+            <w:b/>
+            <w:noProof/>
+            <w:sz w:val="36"/>
+            <w:lang w:eastAsia="en-PH"/>
+          </w:rPr>
+          <w:drawing>
+            <wp:anchor distT="0" distB="0" distL="114300" distR="114300" simplePos="0" relativeHeight="251720704" behindDoc="0" locked="0" layoutInCell="1" allowOverlap="1" wp14:anchorId="2D4E91FD" wp14:editId="3A435028">
+              <wp:simplePos x="0" y="0"/>
+              <wp:positionH relativeFrom="column">
+                <wp:posOffset>-246380</wp:posOffset>
+              </wp:positionH>
+              <wp:positionV relativeFrom="paragraph">
+                <wp:posOffset>-198120</wp:posOffset>
+              </wp:positionV>
+              <wp:extent cx="823595" cy="724535"/>
+              <wp:effectExtent l="0" t="0" r="14605" b="18415"/>
+              <wp:wrapNone/>
+              <wp:docPr id="2026318676" name="Picture 2026318676"/>
+              <wp:cNvGraphicFramePr>
+                <a:graphicFrameLocks xmlns:a="http://schemas.openxmlformats.org/drawingml/2006/main" noChangeAspect="1"/>
+              </wp:cNvGraphicFramePr>
+              <a:graphic xmlns:a="http://schemas.openxmlformats.org/drawingml/2006/main">
+                <a:graphicData uri="http://schemas.openxmlformats.org/drawingml/2006/picture">
+                  <pic:pic xmlns:pic="http://schemas.openxmlformats.org/drawingml/2006/picture">
+                    <pic:nvPicPr>
+                      <pic:cNvPr id="700363394" name="Picture 700363394"/>
+                      <pic:cNvPicPr>
+                        <a:picLocks noChangeAspect="1"/>
+                      </pic:cNvPicPr>
+                    </pic:nvPicPr>
+                    <pic:blipFill>
+                      <a:blip r:embed="rId1">
+                        <a:extLst>
+                          <a:ext uri="{28A0092B-C50C-407E-A947-70E740481C1C}">
+                            <a14:useLocalDpi xmlns:a14="http://schemas.microsoft.com/office/drawing/2010/main" val="0"/>
+                          </a:ext>
+                        </a:extLst>
+                      </a:blip>
+                      <a:stretch>
+                        <a:fillRect/>
+                      </a:stretch>
+                    </pic:blipFill>
+                    <pic:spPr>
+                      <a:xfrm>
+                        <a:off x="0" y="0"/>
+                        <a:ext cx="823578" cy="724710"/>
+                      </a:xfrm>
+                      <a:prstGeom prst="rect">
+                        <a:avLst/>
+                      </a:prstGeom>
+                    </pic:spPr>
+                  </pic:pic>
+                </a:graphicData>
+              </a:graphic>
+            </wp:anchor>
+          </w:drawing>
+        </w:r>
+        <w:r>
+          <w:rPr>
+            <w:rFonts w:ascii="Courier New" w:hAnsi="Courier New" w:cs="Courier New"/>
+            <w:b/>
+            <w:noProof/>
+            <w:sz w:val="32"/>
+            <w:lang w:eastAsia="en-PH"/>
+          </w:rPr>
+          <mc:AlternateContent>
+            <mc:Choice Requires="wps">
+              <w:drawing>
+                <wp:anchor distT="0" distB="0" distL="114300" distR="114300" simplePos="0" relativeHeight="251723776" behindDoc="0" locked="0" layoutInCell="1" allowOverlap="1" wp14:anchorId="4366DFAE" wp14:editId="5C9FE52F">
+                  <wp:simplePos x="0" y="0"/>
+                  <wp:positionH relativeFrom="column">
+                    <wp:posOffset>-1371600</wp:posOffset>
+                  </wp:positionH>
+                  <wp:positionV relativeFrom="paragraph">
+                    <wp:posOffset>-287020</wp:posOffset>
+                  </wp:positionV>
+                  <wp:extent cx="7772400" cy="0"/>
+                  <wp:effectExtent l="0" t="19050" r="0" b="19050"/>
+                  <wp:wrapNone/>
+                  <wp:docPr id="2030725421" name="Straight Connector 2030725421"/>
+                  <wp:cNvGraphicFramePr/>
+                  <a:graphic xmlns:a="http://schemas.openxmlformats.org/drawingml/2006/main">
+                    <a:graphicData uri="http://schemas.microsoft.com/office/word/2010/wordprocessingShape">
+                      <wps:wsp>
+                        <wps:cNvCnPr/>
+                        <wps:spPr>
+                          <a:xfrm>
+                            <a:off x="0" y="0"/>
+                            <a:ext cx="7772400" cy="0"/>
+                          </a:xfrm>
+                          <a:prstGeom prst="line">
+                            <a:avLst/>
+                          </a:prstGeom>
+                          <a:ln w="38100"/>
+                        </wps:spPr>
+                        <wps:style>
+                          <a:lnRef idx="1">
+                            <a:schemeClr val="dk1"/>
+                          </a:lnRef>
+                          <a:fillRef idx="0">
+                            <a:schemeClr val="dk1"/>
+                          </a:fillRef>
+                          <a:effectRef idx="0">
+                            <a:schemeClr val="dk1"/>
+                          </a:effectRef>
+                          <a:fontRef idx="minor">
+                            <a:schemeClr val="tx1"/>
+                          </a:fontRef>
+                        </wps:style>
+                        <wps:bodyPr/>
+                      </wps:wsp>
+                    </a:graphicData>
+                  </a:graphic>
+                </wp:anchor>
+              </w:drawing>
+            </mc:Choice>
+            <mc:Fallback>
+              <w:pict>
+                <v:line w14:anchorId="464CD259" id="Straight Connector 2030725421" o:spid="_x0000_s1026" style="position:absolute;z-index:251723776;visibility:visible;mso-wrap-style:square;mso-wrap-distance-left:9pt;mso-wrap-distance-top:0;mso-wrap-distance-right:9pt;mso-wrap-distance-bottom:0;mso-position-horizontal:absolute;mso-position-horizontal-relative:text;mso-position-vertical:absolute;mso-position-vertical-relative:text" from="-108pt,-22.6pt" to="7in,-22.6pt" o:gfxdata="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" strokecolor="black [3200]" strokeweight="3pt">
+                  <v:stroke joinstyle="miter"/>
+                </v:line>
+              </w:pict>
+            </mc:Fallback>
+          </mc:AlternateContent>
+        </w:r>
+        <w:r>
+          <w:rPr>
+            <w:rFonts w:ascii="Courier New" w:hAnsi="Courier New" w:cs="Courier New"/>
+            <w:b/>
+            <w:noProof/>
+            <w:sz w:val="36"/>
+            <w:lang w:eastAsia="en-PH"/>
+          </w:rPr>
+          <mc:AlternateContent>
+            <mc:Choice Requires="wps">
+              <w:drawing>
+                <wp:anchor distT="0" distB="0" distL="114300" distR="114300" simplePos="0" relativeHeight="251721728" behindDoc="0" locked="0" layoutInCell="1" allowOverlap="1" wp14:anchorId="7D282725" wp14:editId="0872A5F0">
+                  <wp:simplePos x="0" y="0"/>
+                  <wp:positionH relativeFrom="column">
+                    <wp:posOffset>-228600</wp:posOffset>
+                  </wp:positionH>
+                  <wp:positionV relativeFrom="paragraph">
+                    <wp:posOffset>-572770</wp:posOffset>
+                  </wp:positionV>
+                  <wp:extent cx="0" cy="10191750"/>
+                  <wp:effectExtent l="19050" t="0" r="19050" b="0"/>
+                  <wp:wrapNone/>
+                  <wp:docPr id="904603731" name="Straight Connector 904603731"/>
+                  <wp:cNvGraphicFramePr/>
+                  <a:graphic xmlns:a="http://schemas.openxmlformats.org/drawingml/2006/main">
+                    <a:graphicData uri="http://schemas.microsoft.com/office/word/2010/wordprocessingShape">
+                      <wps:wsp>
+                        <wps:cNvCnPr/>
+                        <wps:spPr>
+                          <a:xfrm>
+                            <a:off x="0" y="0"/>
+                            <a:ext cx="0" cy="10191896"/>
+                          </a:xfrm>
+                          <a:prstGeom prst="line">
+                            <a:avLst/>
+                          </a:prstGeom>
+                          <a:ln w="38100"/>
+                        </wps:spPr>
+                        <wps:style>
+                          <a:lnRef idx="1">
+                            <a:schemeClr val="dk1"/>
+                          </a:lnRef>
+                          <a:fillRef idx="0">
+                            <a:schemeClr val="dk1"/>
+                          </a:fillRef>
+                          <a:effectRef idx="0">
+                            <a:schemeClr val="dk1"/>
+                          </a:effectRef>
+                          <a:fontRef idx="minor">
+                            <a:schemeClr val="tx1"/>
+                          </a:fontRef>
+                        </wps:style>
+                        <wps:bodyPr/>
+                      </wps:wsp>
+                    </a:graphicData>
+                  </a:graphic>
+                </wp:anchor>
+              </w:drawing>
+            </mc:Choice>
+            <mc:Fallback>
+              <w:pict>
+                <v:line w14:anchorId="41B0706A" id="Straight Connector 904603731" o:spid="_x0000_s1026" style="position:absolute;z-index:251721728;visibility:visible;mso-wrap-style:square;mso-wrap-distance-left:9pt;mso-wrap-distance-top:0;mso-wrap-distance-right:9pt;mso-wrap-distance-bottom:0;mso-position-horizontal:absolute;mso-position-horizontal-relative:text;mso-position-vertical:absolute;mso-position-vertical-relative:text" from="-18pt,-45.1pt" to="-18pt,757.4pt" o:gfxdata="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" strokecolor="black [3200]" strokeweight="3pt">
+                  <v:stroke joinstyle="miter"/>
+                </v:line>
+              </w:pict>
+            </mc:Fallback>
+          </mc:AlternateContent>
+        </w:r>
+        <w:r>
+          <w:rPr>
+            <w:rFonts w:ascii="Courier New" w:hAnsi="Courier New" w:cs="Courier New"/>
+            <w:b/>
+            <w:noProof/>
+            <w:sz w:val="36"/>
+            <w:lang w:eastAsia="en-PH"/>
+          </w:rPr>
+          <mc:AlternateContent>
+            <mc:Choice Requires="wps">
+              <w:drawing>
+                <wp:anchor distT="0" distB="0" distL="114300" distR="114300" simplePos="0" relativeHeight="251722752" behindDoc="0" locked="0" layoutInCell="1" allowOverlap="1" wp14:anchorId="3154A674" wp14:editId="178287CF">
+                  <wp:simplePos x="0" y="0"/>
+                  <wp:positionH relativeFrom="column">
+                    <wp:posOffset>5715000</wp:posOffset>
+                  </wp:positionH>
+                  <wp:positionV relativeFrom="paragraph">
+                    <wp:posOffset>-419735</wp:posOffset>
+                  </wp:positionV>
+                  <wp:extent cx="0" cy="10033635"/>
+                  <wp:effectExtent l="19050" t="0" r="19050" b="5715"/>
+                  <wp:wrapNone/>
+                  <wp:docPr id="1590466236" name="Straight Connector 1590466236"/>
+                  <wp:cNvGraphicFramePr/>
+                  <a:graphic xmlns:a="http://schemas.openxmlformats.org/drawingml/2006/main">
+                    <a:graphicData uri="http://schemas.microsoft.com/office/word/2010/wordprocessingShape">
+                      <wps:wsp>
+                        <wps:cNvCnPr/>
+                        <wps:spPr>
+                          <a:xfrm>
+                            <a:off x="0" y="0"/>
+                            <a:ext cx="0" cy="10033762"/>
+                          </a:xfrm>
+                          <a:prstGeom prst="line">
+                            <a:avLst/>
+                          </a:prstGeom>
+                          <a:ln w="38100"/>
+                        </wps:spPr>
+                        <wps:style>
+                          <a:lnRef idx="1">
+                            <a:schemeClr val="dk1"/>
+                          </a:lnRef>
+                          <a:fillRef idx="0">
+                            <a:schemeClr val="dk1"/>
+                          </a:fillRef>
+                          <a:effectRef idx="0">
+                            <a:schemeClr val="dk1"/>
+                          </a:effectRef>
+                          <a:fontRef idx="minor">
+                            <a:schemeClr val="tx1"/>
+                          </a:fontRef>
+                        </wps:style>
+                        <wps:bodyPr/>
+                      </wps:wsp>
+                    </a:graphicData>
+                  </a:graphic>
+                </wp:anchor>
+              </w:drawing>
+            </mc:Choice>
+            <mc:Fallback>
+              <w:pict>
+                <v:line w14:anchorId="188C4CA3" id="Straight Connector 1590466236" o:spid="_x0000_s1026" style="position:absolute;z-index:251722752;visibility:visible;mso-wrap-style:square;mso-wrap-distance-left:9pt;mso-wrap-distance-top:0;mso-wrap-distance-right:9pt;mso-wrap-distance-bottom:0;mso-position-horizontal:absolute;mso-position-horizontal-relative:text;mso-position-vertical:absolute;mso-position-vertical-relative:text" from="450pt,-33.05pt" to="450pt,757pt" o:gfxdata="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" strokecolor="black [3200]" strokeweight="3pt">
+                  <v:stroke joinstyle="miter"/>
+                </v:line>
+              </w:pict>
+            </mc:Fallback>
+          </mc:AlternateContent>
+        </w:r>
+        <w:r>
+          <w:rPr>
+            <w:rFonts w:ascii="Courier New" w:hAnsi="Courier New" w:cs="Courier New"/>
+            <w:b/>
+            <w:sz w:val="36"/>
+          </w:rPr>
+          <w:t>Kalinga State University</w:t>
+        </w:r>
+        <w:r>
+          <w:rPr>
+            <w:rFonts w:ascii="Courier New" w:hAnsi="Courier New" w:cs="Courier New"/>
+            <w:b/>
+            <w:sz w:val="36"/>
+          </w:rPr>
+          <w:tab/>
+        </w:r>
+      </w:p>
+      <w:p>
+        <w:pPr>
+          <w:pStyle w:val="Header"/>
+          <w:tabs>
+            <w:tab w:val="clear" w:pos="9360"/>
+            <w:tab w:val="left" w:pos="2256"/>
+            <w:tab w:val="center" w:pos="4320"/>
+            <w:tab w:val="right" w:pos="8642"/>
+          </w:tabs>
+          <w:rPr>
+            <w:rFonts w:ascii="Courier New" w:hAnsi="Courier New" w:cs="Courier New"/>
+            <w:sz w:val="24"/>
+          </w:rPr>
+        </w:pPr>
+        <w:r>
+          <w:rPr>
+            <w:rFonts w:ascii="Courier New" w:hAnsi="Courier New" w:cs="Courier New"/>
+            <w:sz w:val="24"/>
+          </w:rPr>
+          <w:tab/>
+        </w:r>
+        <w:r>
+          <w:rPr>
+            <w:rFonts w:ascii="Courier New" w:hAnsi="Courier New" w:cs="Courier New"/>
+            <w:sz w:val="24"/>
+          </w:rPr>
+          <w:tab/>
+          <w:t>Bulanao, Tabuk City, Kalinga</w:t>
+        </w:r>
+      </w:p>
+      <w:p>
+        <w:pPr>
+          <w:pStyle w:val="Header"/>
+          <w:tabs>
+            <w:tab w:val="clear" w:pos="9360"/>
+            <w:tab w:val="left" w:pos="2256"/>
+            <w:tab w:val="center" w:pos="4320"/>
+            <w:tab w:val="right" w:pos="8642"/>
+          </w:tabs>
+          <w:rPr>
+            <w:rFonts w:ascii="Courier New" w:hAnsi="Courier New" w:cs="Courier New"/>
+            <w:sz w:val="24"/>
+          </w:rPr>
+        </w:pPr>
+        <w:r>
+          <w:rPr>
+            <w:rFonts w:ascii="Courier New" w:hAnsi="Courier New" w:cs="Courier New"/>
+            <w:sz w:val="24"/>
+          </w:rPr>
+          <w:tab/>
+        </w:r>
+      </w:p>
+      <w:p>
+        <w:pPr>
+          <w:pStyle w:val="Header"/>
+          <w:jc w:val="right"/>
+          <w:rPr>
+            <w:rFonts w:ascii="Courier New" w:hAnsi="Courier New" w:cs="Courier New"/>
+            <w:sz w:val="20"/>
+            <w:szCs w:val="20"/>
+          </w:rPr>
+        </w:pPr>
       </w:p>
     </w:sdtContent>
   </w:sdt>
@@ -13396,7 +10228,7 @@
         <w:tab w:val="right" w:leader="dot" w:pos="8630"/>
       </w:tabs>
       <w:spacing w:before="120" w:after="0" w:line="360" w:lineRule="auto"/>
-      <w:ind w:left="0" w:right="560"/>
+      <w:ind w:right="560"/>
     </w:pPr>
     <w:rPr>
       <w:rFonts w:ascii="Courier New" w:hAnsi="Courier New" w:cs="Courier New"/>
@@ -13414,7 +10246,7 @@
       <w:tabs>
         <w:tab w:val="right" w:leader="dot" w:pos="8630"/>
       </w:tabs>
-      <w:spacing w:before="0" w:after="0" w:line="360" w:lineRule="auto"/>
+      <w:spacing w:after="0" w:line="360" w:lineRule="auto"/>
       <w:ind w:left="440" w:right="560"/>
     </w:pPr>
     <w:rPr>
@@ -13434,7 +10266,7 @@
         <w:tab w:val="right" w:leader="dot" w:pos="8630"/>
       </w:tabs>
       <w:spacing w:before="60" w:after="0" w:line="360" w:lineRule="auto"/>
-      <w:ind w:left="0" w:right="560"/>
+      <w:ind w:right="560"/>
     </w:pPr>
     <w:rPr>
       <w:rFonts w:ascii="Courier New" w:hAnsi="Courier New" w:cs="Courier New"/>
@@ -13702,6 +10534,10 @@
 </file>
 
 <file path=customXml/item1.xml><?xml version="1.0" encoding="utf-8"?>
+<b:Sources xmlns:b="http://schemas.openxmlformats.org/officeDocument/2006/bibliography" xmlns="http://schemas.openxmlformats.org/officeDocument/2006/bibliography" SelectedStyle="\APASixthEditionOfficeOnline.xsl" StyleName="APA" Version="6"/>
+</file>
+
+<file path=customXml/item2.xml><?xml version="1.0" encoding="utf-8"?>
 <s:customData xmlns="http://www.wps.cn/officeDocument/2013/wpsCustomData" xmlns:s="http://www.wps.cn/officeDocument/2013/wpsCustomData">
   <customSectProps>
     <customSectPr/>
@@ -13713,22 +10549,18 @@
 </s:customData>
 </file>
 
-<file path=customXml/item2.xml><?xml version="1.0" encoding="utf-8"?>
-<b:Sources xmlns:b="http://schemas.openxmlformats.org/officeDocument/2006/bibliography" xmlns="http://schemas.openxmlformats.org/officeDocument/2006/bibliography" SelectedStyle="\APASixthEditionOfficeOnline.xsl" StyleName="APA" Version="6"/>
+<file path=customXml/itemProps1.xml><?xml version="1.0" encoding="utf-8"?>
+<ds:datastoreItem xmlns:ds="http://schemas.openxmlformats.org/officeDocument/2006/customXml" ds:itemID="{5EC2CED6-9A61-4FA3-BB1B-E128CC05341B}">
+  <ds:schemaRefs>
+    <ds:schemaRef ds:uri="http://schemas.openxmlformats.org/officeDocument/2006/bibliography"/>
+  </ds:schemaRefs>
+</ds:datastoreItem>
 </file>
 
-<file path=customXml/itemProps1.xml><?xml version="1.0" encoding="utf-8"?>
+<file path=customXml/itemProps2.xml><?xml version="1.0" encoding="utf-8"?>
 <ds:datastoreItem xmlns:ds="http://schemas.openxmlformats.org/officeDocument/2006/customXml" ds:itemID="{B1977F7D-205B-4081-913C-38D41E755F92}">
   <ds:schemaRefs>
     <ds:schemaRef ds:uri="http://www.wps.cn/officeDocument/2013/wpsCustomData"/>
   </ds:schemaRefs>
 </ds:datastoreItem>
-</file>
-
-<file path=customXml/itemProps2.xml><?xml version="1.0" encoding="utf-8"?>
-<ds:datastoreItem xmlns:ds="http://schemas.openxmlformats.org/officeDocument/2006/customXml" ds:itemID="{5EC2CED6-9A61-4FA3-BB1B-E128CC05341B}">
-  <ds:schemaRefs>
-    <ds:schemaRef ds:uri="http://schemas.openxmlformats.org/officeDocument/2006/bibliography"/>
-  </ds:schemaRefs>
-</ds:datastoreItem>
 </file>
</xml_diff>

<commit_message>
Restore the page border's bottom lines
The bottom lines of the page border live in the footer. The front pages
had been given a footer with only the roman page number, and the first
page of each chapter an empty footer, so those pages lost the lines; the
Chapter 4 copy had no footer at all. All of them now use the footer with
the lines (the front pages keep their page number). Built on the group's
latest copy.

Co-Authored-By: Claude Opus 5.5 <noreply@anthropic.com>
Claude-Session: https://claude.ai/code/session_01MN4gTfErSULVtFJnUJ6zoR
</commit_message>
<xml_diff>
--- a/docs/paper/Auditrix - Chapter 4.docx
+++ b/docs/paper/Auditrix - Chapter 4.docx
@@ -77,7 +77,25 @@
           <w:sz w:val="24"/>
           <w:szCs w:val="24"/>
         </w:rPr>
-        <w:t>This chapter presents the analysis, presentation, discussion, and findings of the study gathered by the researchers. Data collected from the six (6) Program Chairpersons of the College of Engineering and Information Technology (CEIT), selected IT experts, and students who experienced prerequisite violations are systematically organized, interpreted, and analyzed. The presentation of results corresponds directly to the Statement of the Problem: (1) the current process for evaluating students' prerequisite compliance with the curriculum, (2) the problems encountered in that process, (3) the design of a curriculum audit system to ensure prerequisite compliance, and (4) the level of compliance of the proposed system, Auditrix, to the ISO/IEC 25010 software quality standard. The results of the testing done on the developed system are presented before SOP No. 4.</w:t>
+        <w:t xml:space="preserve">This chapter presents the analysis, presentation, discussion, and findings of the study gathered by the researchers. Data collected from the six (6) Program Chairpersons of the College of Engineering and Information Technology (CEIT), selected IT experts, and students who experienced prerequisite violations are systematically organized, interpreted, and analyzed. The presentation of results corresponds directly to the Statement of the Problem: (1) the current process for evaluating students' prerequisite compliance with the curriculum, (2) the problems encountered in that process, (3) the design of a curriculum audit system to ensure prerequisite compliance, and (4) the level of compliance of the proposed system, </w:t>
+      </w:r>
+      <w:proofErr w:type="spellStart"/>
+      <w:r>
+        <w:rPr>
+          <w:rFonts w:ascii="Courier New" w:hAnsi="Courier New" w:cs="Courier New"/>
+          <w:sz w:val="24"/>
+          <w:szCs w:val="24"/>
+        </w:rPr>
+        <w:t>Auditrix</w:t>
+      </w:r>
+      <w:proofErr w:type="spellEnd"/>
+      <w:r>
+        <w:rPr>
+          <w:rFonts w:ascii="Courier New" w:hAnsi="Courier New" w:cs="Courier New"/>
+          <w:sz w:val="24"/>
+          <w:szCs w:val="24"/>
+        </w:rPr>
+        <w:t>, to the ISO/IEC 25010 software quality standard. The results of the testing done on the developed system are presented before SOP No. 4.</w:t>
       </w:r>
     </w:p>
     <w:p>
@@ -715,7 +733,29 @@
           <w:sz w:val="24"/>
           <w:szCs w:val="24"/>
         </w:rPr>
-        <w:t xml:space="preserve">1. Late-Detection Blindspots. </w:t>
+        <w:t xml:space="preserve">1. Late-Detection </w:t>
+      </w:r>
+      <w:proofErr w:type="spellStart"/>
+      <w:r>
+        <w:rPr>
+          <w:rFonts w:ascii="Courier New" w:hAnsi="Courier New" w:cs="Courier New"/>
+          <w:b/>
+          <w:bCs/>
+          <w:sz w:val="24"/>
+          <w:szCs w:val="24"/>
+        </w:rPr>
+        <w:t>Blindspots</w:t>
+      </w:r>
+      <w:proofErr w:type="spellEnd"/>
+      <w:r>
+        <w:rPr>
+          <w:rFonts w:ascii="Courier New" w:hAnsi="Courier New" w:cs="Courier New"/>
+          <w:b/>
+          <w:bCs/>
+          <w:sz w:val="24"/>
+          <w:szCs w:val="24"/>
+        </w:rPr>
+        <w:t xml:space="preserve">. </w:t>
       </w:r>
       <w:r>
         <w:rPr>
@@ -874,7 +914,25 @@
           <w:sz w:val="24"/>
           <w:szCs w:val="24"/>
         </w:rPr>
-        <w:t xml:space="preserve">presents these three problems in an Ishikawa (fishbone) diagram, with each problem as a branch and its causes listed under it: Late-Detection Blindspots (no structural block during digital enrollment selection; violations found only at the final graduation audit), Absence of Automated Compliance-Checking Tools (the MIS cannot cross-reference grades with the curriculum; verification rests on the Chairperson's manual review; no automated safeguard between data entry and eligibility), and Limited Student Awareness of Prerequisite Requirements (the MIS does not alert students when they are ineligible; students unknowingly enroll without the prerequisites). Together, they lead to the same effect: students who are delayed in completing their program, with extra semesters and costs.</w:t>
+        <w:t xml:space="preserve">presents these three problems in an Ishikawa (fishbone) diagram, with each problem as a branch and its causes listed under it: Late-Detection </w:t>
+      </w:r>
+      <w:proofErr w:type="spellStart"/>
+      <w:r>
+        <w:rPr>
+          <w:rFonts w:ascii="Courier New" w:hAnsi="Courier New" w:cs="Courier New"/>
+          <w:sz w:val="24"/>
+          <w:szCs w:val="24"/>
+        </w:rPr>
+        <w:t>Blindspots</w:t>
+      </w:r>
+      <w:proofErr w:type="spellEnd"/>
+      <w:r>
+        <w:rPr>
+          <w:rFonts w:ascii="Courier New" w:hAnsi="Courier New" w:cs="Courier New"/>
+          <w:sz w:val="24"/>
+          <w:szCs w:val="24"/>
+        </w:rPr>
+        <w:t xml:space="preserve"> (no structural block during digital enrollment selection; violations found only at the final graduation audit), Absence of Automated Compliance-Checking Tools (the MIS cannot cross-reference grades with the curriculum; verification rests on the Chairperson's manual review; no automated safeguard between data entry and eligibility), and Limited Student Awareness of Prerequisite Requirements (the MIS does not alert students when they are ineligible; students unknowingly enroll without the prerequisites). Together, they lead to the same effect: students who are delayed in completing their program, with extra semesters and costs.</w:t>
       </w:r>
       <w:r>
         <w:fldChar w:fldCharType="begin"/>
@@ -944,7 +1002,25 @@
           <w:sz w:val="24"/>
           <w:szCs w:val="24"/>
         </w:rPr>
-        <w:t>developed Auditrix,</w:t>
+        <w:t xml:space="preserve">developed </w:t>
+      </w:r>
+      <w:proofErr w:type="spellStart"/>
+      <w:r>
+        <w:rPr>
+          <w:rFonts w:ascii="Courier New" w:hAnsi="Courier New" w:cs="Courier New"/>
+          <w:sz w:val="24"/>
+          <w:szCs w:val="24"/>
+        </w:rPr>
+        <w:t>Auditrix</w:t>
+      </w:r>
+      <w:proofErr w:type="spellEnd"/>
+      <w:r>
+        <w:rPr>
+          <w:rFonts w:ascii="Courier New" w:hAnsi="Courier New" w:cs="Courier New"/>
+          <w:sz w:val="24"/>
+          <w:szCs w:val="24"/>
+        </w:rPr>
+        <w:t>,</w:t>
       </w:r>
       <w:r>
         <w:rPr>
@@ -968,7 +1044,25 @@
           <w:sz w:val="24"/>
           <w:szCs w:val="24"/>
         </w:rPr>
-        <w:t xml:space="preserve"> and year-standing requirements of the student's curriculum. It was built for any college and program, and was tested with the BSCpE, BSIT</w:t>
+        <w:t xml:space="preserve"> and year-standing requirements of the student's curriculum. It was built for any college and program, and was tested with the </w:t>
+      </w:r>
+      <w:proofErr w:type="spellStart"/>
+      <w:r>
+        <w:rPr>
+          <w:rFonts w:ascii="Courier New" w:hAnsi="Courier New" w:cs="Courier New"/>
+          <w:sz w:val="24"/>
+          <w:szCs w:val="24"/>
+        </w:rPr>
+        <w:t>BSCpE</w:t>
+      </w:r>
+      <w:proofErr w:type="spellEnd"/>
+      <w:r>
+        <w:rPr>
+          <w:rFonts w:ascii="Courier New" w:hAnsi="Courier New" w:cs="Courier New"/>
+          <w:sz w:val="24"/>
+          <w:szCs w:val="24"/>
+        </w:rPr>
+        <w:t>, BSIT</w:t>
       </w:r>
       <w:r>
         <w:rPr>
@@ -984,7 +1078,7 @@
           <w:sz w:val="24"/>
           <w:szCs w:val="24"/>
         </w:rPr>
-        <w:t xml:space="preserve"> and BSCE programs of the CEIT. The system was built using the Iterative and Incremental Development (IID) model, allowing the Audit Engine's logic to be reviewed early and refined across three functional increments: (1) curriculum, </w:t>
+        <w:t xml:space="preserve"> and BSCE </w:t>
       </w:r>
       <w:r>
         <w:rPr>
@@ -993,7 +1087,7 @@
           <w:szCs w:val="24"/>
         </w:rPr>
         <w:lastRenderedPageBreak/>
-        <w:t>student and grade records with a basic audit; (2) curriculum versions, imports, student movements and the redesigned interface; and (3) the term-based audit, automatic year levels, and the regular and irregular classification.</w:t>
+        <w:t>programs of the CEIT. The system was built using the Iterative and Incremental Development (IID) model, allowing the Audit Engine's logic to be reviewed early and refined across three functional increments: (1) curriculum, student and grade records with a basic audit; (2) curriculum versions, imports, student movements and the redesigned interface; and (3) the term-based audit, automatic year levels, and the regular and irregular classification.</w:t>
       </w:r>
     </w:p>
     <w:p>
@@ -1013,7 +1107,25 @@
           <w:sz w:val="24"/>
           <w:szCs w:val="24"/>
         </w:rPr>
-        <w:t>The system runs on Next.js 16 (App Router and server actions) with React 19 and TypeScript, styled with Tailwind CSS 4 in a KSU green theme designed for responsiveness across desktop, tablet, and mobile. Supabase serves as the backend-as-a-service, hosting the PostgreSQL database, authentication, and Row-Level Security (RLS) policies; the database schema is built step by step by 30 migration scripts. Curricula are exported to PDF with @react-pdf/renderer. Interface flows were prototyped as high-fidelity mockups in Figma prior to implementation.</w:t>
+        <w:t xml:space="preserve">The system runs on Next.js 16 (App Router and server actions) with React 19 and TypeScript, styled with Tailwind CSS 4 in a KSU green theme designed for responsiveness across desktop, tablet, and mobile. </w:t>
+      </w:r>
+      <w:proofErr w:type="spellStart"/>
+      <w:r>
+        <w:rPr>
+          <w:rFonts w:ascii="Courier New" w:hAnsi="Courier New" w:cs="Courier New"/>
+          <w:sz w:val="24"/>
+          <w:szCs w:val="24"/>
+        </w:rPr>
+        <w:t>Supabase</w:t>
+      </w:r>
+      <w:proofErr w:type="spellEnd"/>
+      <w:r>
+        <w:rPr>
+          <w:rFonts w:ascii="Courier New" w:hAnsi="Courier New" w:cs="Courier New"/>
+          <w:sz w:val="24"/>
+          <w:szCs w:val="24"/>
+        </w:rPr>
+        <w:t xml:space="preserve"> serves as the backend-as-a-service, hosting the PostgreSQL database, authentication, and Row-Level Security (RLS) policies; the database schema is built step by step by 30 migration scripts. Curricula are exported to PDF with @react-pdf/renderer. Interface flows were prototyped as high-fidelity mockups in Figma prior to implementation.</w:t>
       </w:r>
     </w:p>
     <w:p>
@@ -1033,7 +1145,34 @@
           <w:sz w:val="24"/>
           <w:szCs w:val="24"/>
         </w:rPr>
-        <w:t>At the core of Auditrix is a TypeScript-based audit engine that checks every subject of the student's curriculum against the student's grade records and gives each subject one of five statuses, shown in Table 4.1 together with the subject's grade and the term in which it was taken:</w:t>
+        <w:t xml:space="preserve">At the core of </w:t>
+      </w:r>
+      <w:proofErr w:type="spellStart"/>
+      <w:r>
+        <w:rPr>
+          <w:rFonts w:ascii="Courier New" w:hAnsi="Courier New" w:cs="Courier New"/>
+          <w:sz w:val="24"/>
+          <w:szCs w:val="24"/>
+        </w:rPr>
+        <w:t>Auditrix</w:t>
+      </w:r>
+      <w:proofErr w:type="spellEnd"/>
+      <w:r>
+        <w:rPr>
+          <w:rFonts w:ascii="Courier New" w:hAnsi="Courier New" w:cs="Courier New"/>
+          <w:sz w:val="24"/>
+          <w:szCs w:val="24"/>
+        </w:rPr>
+        <w:t xml:space="preserve"> is a TypeScript-based audit engine that checks every subject of the student's curriculum against the student's grade records and gives each subject </w:t>
+      </w:r>
+      <w:r>
+        <w:rPr>
+          <w:rFonts w:ascii="Courier New" w:hAnsi="Courier New" w:cs="Courier New"/>
+          <w:sz w:val="24"/>
+          <w:szCs w:val="24"/>
+        </w:rPr>
+        <w:lastRenderedPageBreak/>
+        <w:t>one of five statuses, shown in Table 4.1 together with the subject's grade and the term in which it was taken:</w:t>
       </w:r>
     </w:p>
     <w:tbl>
@@ -1076,7 +1215,6 @@
                 <w:sz w:val="24"/>
                 <w:szCs w:val="24"/>
               </w:rPr>
-              <w:lastRenderedPageBreak/>
               <w:t>Status</w:t>
             </w:r>
           </w:p>
@@ -1436,7 +1574,7 @@
           <w:sz w:val="24"/>
           <w:szCs w:val="24"/>
         </w:rPr>
-        <w:t xml:space="preserve">The statuses are not stored at the moment a grade is entered. Instead, every time a student's audit is shown, the engine compares the term in which each subject was taken with the term in which each of its requirements was passed. Because of this, grades can be encoded in any order and the result stays the same, and a violation remains on the student's record until the subject is retaken after its requirements are met. This design replaced the system's first checker, </w:t>
+        <w:t xml:space="preserve">The statuses are not stored at the moment a grade is entered. Instead, every time a student's audit is shown, the engine compares the term in which each subject was taken with the term in which each of its requirements was passed. Because of this, grades can be encoded in any order and the result stays the same, and a violation remains on the student's </w:t>
       </w:r>
       <w:r>
         <w:rPr>
@@ -1445,7 +1583,7 @@
           <w:szCs w:val="24"/>
         </w:rPr>
         <w:lastRenderedPageBreak/>
-        <w:t>which stored a permanent flag at the moment of entry; the reasons for the change are discussed under Testing of the System.</w:t>
+        <w:t>record until the subject is retaken after its requirements are met. This design replaced the system's first checker, which stored a permanent flag at the moment of entry; the reasons for the change are discussed under Testing of the System.</w:t>
       </w:r>
     </w:p>
     <w:p>
@@ -1525,7 +1663,7 @@
           <w:sz w:val="24"/>
           <w:szCs w:val="24"/>
         </w:rPr>
-        <w:t xml:space="preserve"> The KSU Student Handbook requires a prerequisite to be passed prior to taking a subject and nullifies the credit of a subject taken without it. Accordingly, a prerequisite must be passed in a term before the term in which the subject was taken; passing it in the same term is a violation. Taking a subject while its prerequisite is still INC is also a violation, since an INC counts as passed only from the term in which it was resolved. A subject taken out of order earns no credit: it does not </w:t>
+        <w:t xml:space="preserve"> The KSU Student Handbook requires a prerequisite to be passed prior to taking a subject and nullifies the credit of a subject taken without it. Accordingly, a prerequisite must be passed in a term before the term in which the subject was taken; passing it in the same term is a violation. Taking a subject while its prerequisite is still INC is also a violation, since an INC </w:t>
       </w:r>
       <w:r>
         <w:rPr>
@@ -1534,7 +1672,7 @@
           <w:szCs w:val="24"/>
         </w:rPr>
         <w:lastRenderedPageBreak/>
-        <w:t>satisfy later prerequisites, does not count toward units or year level, and has to be retaken. If a prerequisite's grade from an earlier term is still in progress, the subject is Pending rather than a violation.</w:t>
+        <w:t>counts as passed only from the term in which it was resolved. A subject taken out of order earns no credit: it does not satisfy later prerequisites, does not count toward units or year level, and has to be retaken. If a prerequisite's grade from an earlier term is still in progress, the subject is Pending rather than a violation.</w:t>
       </w:r>
     </w:p>
     <w:p>
@@ -1564,8 +1702,18 @@
           <w:sz w:val="24"/>
           <w:szCs w:val="24"/>
         </w:rPr>
-        <w:t xml:space="preserve"> The Student Handbook defines co-requisites as subjects taken simultaneously, in the same semester. In Auditrix</w:t>
-      </w:r>
+        <w:t xml:space="preserve"> The Student Handbook defines co-requisites as subjects taken simultaneously, in the same semester. In </w:t>
+      </w:r>
+      <w:proofErr w:type="spellStart"/>
+      <w:r>
+        <w:rPr>
+          <w:rFonts w:ascii="Courier New" w:hAnsi="Courier New" w:cs="Courier New"/>
+          <w:sz w:val="24"/>
+          <w:szCs w:val="24"/>
+        </w:rPr>
+        <w:t>Auditrix</w:t>
+      </w:r>
+      <w:proofErr w:type="spellEnd"/>
       <w:r>
         <w:rPr>
           <w:rFonts w:ascii="Courier New" w:hAnsi="Courier New" w:cs="Courier New"/>
@@ -1658,7 +1806,7 @@
           <w:sz w:val="24"/>
           <w:szCs w:val="24"/>
         </w:rPr>
-        <w:t xml:space="preserve">that a student's year level should follow what the student has finished in the curriculum, the year level is computed from the share of the curriculum's units passed, as shown in Table 4.2. Passing every subject of the earlier years also moves a student up, even if the units fall slightly short. Only passes that count, and only those earned before the current semester, are included, so students move up when the Dean moves the college to a new semester. The year level given at registration or import is used as a starting point until the </w:t>
+        <w:t xml:space="preserve">that a student's year level should follow what the student has finished in the curriculum, the year level is computed from the share of the curriculum's units passed, as shown in Table 4.2. Passing every subject of the earlier years also moves a student up, even if the units fall slightly short. Only passes that count, and only those earned before the current semester, are included, so students move up when the Dean moves the </w:t>
       </w:r>
       <w:r>
         <w:rPr>
@@ -1667,7 +1815,7 @@
           <w:szCs w:val="24"/>
         </w:rPr>
         <w:lastRenderedPageBreak/>
-        <w:t>grades show more, and a chairperson can set a year level by hand for a special case and set it back to automatic.</w:t>
+        <w:t>college to a new semester. The year level given at registration or import is used as a starting point until the grades show more, and a chairperson can set a year level by hand for a special case and set it back to automatic.</w:t>
       </w:r>
     </w:p>
     <w:tbl>
@@ -2038,7 +2186,7 @@
           <w:sz w:val="24"/>
           <w:szCs w:val="24"/>
         </w:rPr>
-        <w:t xml:space="preserve"> Per the Student Handbook and the Operations Manual, a student is regular when enrolled in the full prescribed load for the current semester, and irregular when enrolled in less; the missing subjects are listed. The prescribed load is taken to be the curriculum's </w:t>
+        <w:t xml:space="preserve"> Per the Student Handbook and the Operations Manual, a student is regular when enrolled in the full prescribed load for the current semester, and </w:t>
       </w:r>
       <w:r>
         <w:rPr>
@@ -2047,7 +2195,7 @@
           <w:szCs w:val="24"/>
         </w:rPr>
         <w:lastRenderedPageBreak/>
-        <w:t>subjects for the student's year level and the current semester, not counting subjects already passed in an earlier term, and back subjects taken on top of a full load do not make a student irregular. Enrollment is known from the grades (or "in progress" records) of the current semester; with nothing recorded, the status is "Not determined</w:t>
+        <w:t>irregular when enrolled in less; the missing subjects are listed. The prescribed load is taken to be the curriculum's subjects for the student's year level and the current semester, not counting subjects already passed in an earlier term, and back subjects taken on top of a full load do not make a student irregular. Enrollment is known from the grades (or "in progress" records) of the current semester; with nothing recorded, the status is "Not determined</w:t>
       </w:r>
       <w:r>
         <w:rPr>
@@ -2063,7 +2211,25 @@
           <w:sz w:val="24"/>
           <w:szCs w:val="24"/>
         </w:rPr>
-        <w:t>" and the student is not counted either way. At the start of a semester, the chairperson marks the subjects each student is taking as In progress, so the status is known before any grades come in.</w:t>
+        <w:t xml:space="preserve">" and the student is not counted either way. At the start of a semester, the chairperson marks the subjects each student is taking as </w:t>
+      </w:r>
+      <w:proofErr w:type="gramStart"/>
+      <w:r>
+        <w:rPr>
+          <w:rFonts w:ascii="Courier New" w:hAnsi="Courier New" w:cs="Courier New"/>
+          <w:sz w:val="24"/>
+          <w:szCs w:val="24"/>
+        </w:rPr>
+        <w:t>In</w:t>
+      </w:r>
+      <w:proofErr w:type="gramEnd"/>
+      <w:r>
+        <w:rPr>
+          <w:rFonts w:ascii="Courier New" w:hAnsi="Courier New" w:cs="Courier New"/>
+          <w:sz w:val="24"/>
+          <w:szCs w:val="24"/>
+        </w:rPr>
+        <w:t xml:space="preserve"> progress, so the status is known before any grades come in.</w:t>
       </w:r>
     </w:p>
     <w:p>
@@ -2109,7 +2275,43 @@
           <w:sz w:val="24"/>
           <w:szCs w:val="24"/>
         </w:rPr>
-        <w:t xml:space="preserve"> and 3.0 (passing), 5.0 (failing), and INC, and a subject the student is taking this semester can be marked In progress. Several subjects can be ticked and marked In progress at once; ticking all leaves out the subjects the student cannot take yet (e.g., "Can't take yet. Needs: MATH 111"), which can still be ticked one by one if the student is enrolled in them anyway. Only changed grades are saved, and changing an existing grade is treated as a correction that asks for confirmation. A final grade for an </w:t>
+        <w:t xml:space="preserve"> and 3.0 (passing), 5.0 (failing), and INC, and a subject the student is taking this semester can be marked </w:t>
+      </w:r>
+      <w:proofErr w:type="gramStart"/>
+      <w:r>
+        <w:rPr>
+          <w:rFonts w:ascii="Courier New" w:hAnsi="Courier New" w:cs="Courier New"/>
+          <w:sz w:val="24"/>
+          <w:szCs w:val="24"/>
+        </w:rPr>
+        <w:t>In</w:t>
+      </w:r>
+      <w:proofErr w:type="gramEnd"/>
+      <w:r>
+        <w:rPr>
+          <w:rFonts w:ascii="Courier New" w:hAnsi="Courier New" w:cs="Courier New"/>
+          <w:sz w:val="24"/>
+          <w:szCs w:val="24"/>
+        </w:rPr>
+        <w:t xml:space="preserve"> progress. Several subjects can be ticked and marked </w:t>
+      </w:r>
+      <w:proofErr w:type="gramStart"/>
+      <w:r>
+        <w:rPr>
+          <w:rFonts w:ascii="Courier New" w:hAnsi="Courier New" w:cs="Courier New"/>
+          <w:sz w:val="24"/>
+          <w:szCs w:val="24"/>
+        </w:rPr>
+        <w:t>In</w:t>
+      </w:r>
+      <w:proofErr w:type="gramEnd"/>
+      <w:r>
+        <w:rPr>
+          <w:rFonts w:ascii="Courier New" w:hAnsi="Courier New" w:cs="Courier New"/>
+          <w:sz w:val="24"/>
+          <w:szCs w:val="24"/>
+        </w:rPr>
+        <w:t xml:space="preserve"> progress at once; ticking all leaves out the subjects the student cannot take yet (e.g., "Can't take yet. Needs: MATH 111"), which can still be ticked one by one if the student is enrolled in them anyway. Only changed grades </w:t>
       </w:r>
       <w:r>
         <w:rPr>
@@ -2118,7 +2320,7 @@
           <w:szCs w:val="24"/>
         </w:rPr>
         <w:lastRenderedPageBreak/>
-        <w:t>INC keeps the subject in the term it was taken and records the term in which the INC was resolved (shown as "INC → 25-1"). Since only the latest attempt of a subject is kept as the student's record, a grade from an earlier term than the recorded one is refused unless the chairperson confirms that it corrects a wrongly entered term. After saving, a message names any subject that has just become a violation, and every grade ever entered is kept in the student's grade logbook together with who entered it and when. The database writes this logbook itself, so its entries cannot be edited or deleted, and it accepts only KSU grades that match their status and well-formed terms.</w:t>
+        <w:t>are saved, and changing an existing grade is treated as a correction that asks for confirmation. A final grade for an INC keeps the subject in the term it was taken and records the term in which the INC was resolved (shown as "INC → 25-1"). Since only the latest attempt of a subject is kept as the student's record, a grade from an earlier term than the recorded one is refused unless the chairperson confirms that it corrects a wrongly entered term. After saving, a message names any subject that has just become a violation, and every grade ever entered is kept in the student's grade logbook together with who entered it and when. The database writes this logbook itself, so its entries cannot be edited or deleted, and it accepts only KSU grades that match their status and well-formed terms.</w:t>
       </w:r>
     </w:p>
     <w:p>
@@ -2148,7 +2350,52 @@
           <w:sz w:val="24"/>
           <w:szCs w:val="24"/>
         </w:rPr>
-        <w:t xml:space="preserve"> Each program keeps curriculum versions by effective year (e.g., BSCpE 2019 and 2023), and a new version can copy an existing one. Each subject has a code, title, units, year level and semester (including midyear), and its requirements. Curricula can be imported from an Excel (.xlsx or .xls) or CSV file, in a format designed by the researchers, with a preview of what will be added, changed or removed before saving, exported to CSV or PDF, and every change is kept in a per-version change history showing who changed what, and when.</w:t>
+        <w:t xml:space="preserve"> Each program keeps curriculum versions by effective year (e.g., </w:t>
+      </w:r>
+      <w:proofErr w:type="spellStart"/>
+      <w:r>
+        <w:rPr>
+          <w:rFonts w:ascii="Courier New" w:hAnsi="Courier New" w:cs="Courier New"/>
+          <w:sz w:val="24"/>
+          <w:szCs w:val="24"/>
+        </w:rPr>
+        <w:t>BSCpE</w:t>
+      </w:r>
+      <w:proofErr w:type="spellEnd"/>
+      <w:r>
+        <w:rPr>
+          <w:rFonts w:ascii="Courier New" w:hAnsi="Courier New" w:cs="Courier New"/>
+          <w:sz w:val="24"/>
+          <w:szCs w:val="24"/>
+        </w:rPr>
+        <w:t xml:space="preserve"> 2019 and 2023), and a new version can copy an existing one. Each subject has a code, title, units, year level and semester (including midyear), and its requirements. Curricula can be imported from an Excel (.xlsx or .</w:t>
+      </w:r>
+      <w:proofErr w:type="spellStart"/>
+      <w:r>
+        <w:rPr>
+          <w:rFonts w:ascii="Courier New" w:hAnsi="Courier New" w:cs="Courier New"/>
+          <w:sz w:val="24"/>
+          <w:szCs w:val="24"/>
+        </w:rPr>
+        <w:t>xls</w:t>
+      </w:r>
+      <w:proofErr w:type="spellEnd"/>
+      <w:r>
+        <w:rPr>
+          <w:rFonts w:ascii="Courier New" w:hAnsi="Courier New" w:cs="Courier New"/>
+          <w:sz w:val="24"/>
+          <w:szCs w:val="24"/>
+        </w:rPr>
+        <w:t xml:space="preserve">) or CSV file, in a format designed by the researchers, with a preview of what will be added, changed or removed before saving, exported to CSV or PDF, and </w:t>
+      </w:r>
+      <w:r>
+        <w:rPr>
+          <w:rFonts w:ascii="Courier New" w:hAnsi="Courier New" w:cs="Courier New"/>
+          <w:sz w:val="24"/>
+          <w:szCs w:val="24"/>
+        </w:rPr>
+        <w:lastRenderedPageBreak/>
+        <w:t>every change is kept in a per-version change history showing who changed what, and when.</w:t>
       </w:r>
     </w:p>
     <w:p>
@@ -2170,7 +2417,6 @@
           <w:sz w:val="24"/>
           <w:szCs w:val="24"/>
         </w:rPr>
-        <w:lastRenderedPageBreak/>
         <w:t>Students and student movements.</w:t>
       </w:r>
       <w:r>
@@ -2179,7 +2425,25 @@
           <w:sz w:val="24"/>
           <w:szCs w:val="24"/>
         </w:rPr>
-        <w:t xml:space="preserve"> Students are registered one at a time or imported from an Excel (.xlsx or .xls) or CSV file, either the system's template or a class list exported from the KSU MIS (its "Export to Excel" file, in the format the Program Chairpersons provided), and ID numbers are checked against the KSU format (e.g., 24-113792). When a student shifts, the releasing chairperson files a shift request and the receiving program's chairperson accepts the student into one of their curriculum versions. Transfers in and out and drops are recorded as well, and every movement is kept in the student's history. Marking a student as dropped or transferred out locks the record: the database refuses changes to the student's grades, details and year level until the chairperson reopens the record, which is also kept in the history. A Student Movements page lists every shift, transfer, drop and reopening, with search and filters. The student list can be searched from the top bar of any page and filtered by year level, curriculum version and status, and the reason for each student's status is shown under the name (e.g., "Out of order: PHYS 201").</w:t>
+        <w:t xml:space="preserve"> Students are registered one at a time or imported from an Excel (.xlsx or .</w:t>
+      </w:r>
+      <w:proofErr w:type="spellStart"/>
+      <w:r>
+        <w:rPr>
+          <w:rFonts w:ascii="Courier New" w:hAnsi="Courier New" w:cs="Courier New"/>
+          <w:sz w:val="24"/>
+          <w:szCs w:val="24"/>
+        </w:rPr>
+        <w:t>xls</w:t>
+      </w:r>
+      <w:proofErr w:type="spellEnd"/>
+      <w:r>
+        <w:rPr>
+          <w:rFonts w:ascii="Courier New" w:hAnsi="Courier New" w:cs="Courier New"/>
+          <w:sz w:val="24"/>
+          <w:szCs w:val="24"/>
+        </w:rPr>
+        <w:t>) or CSV file, either the system's template or a class list exported from the KSU MIS (its "Export to Excel" file, in the format the Program Chairpersons provided), and ID numbers are checked against the KSU format (e.g., 24-113792). When a student shifts, the releasing chairperson files a shift request and the receiving program's chairperson accepts the student into one of their curriculum versions. Transfers in and out and drops are recorded as well, and every movement is kept in the student's history. Marking a student as dropped or transferred out locks the record: the database refuses changes to the student's grades, details and year level until the chairperson reopens the record, which is also kept in the history. A Student Movements page lists every shift, transfer, drop and reopening, with search and filters. The student list can be searched from the top bar of any page and filtered by year level, curriculum version and status, and the reason for each student's status is shown under the name (e.g., "Out of order: PHYS 201").</w:t>
       </w:r>
     </w:p>
     <w:p>
@@ -2201,6 +2465,7 @@
           <w:sz w:val="24"/>
           <w:szCs w:val="24"/>
         </w:rPr>
+        <w:lastRenderedPageBreak/>
         <w:t>Dashboard.</w:t>
       </w:r>
       <w:r>
@@ -2209,16 +2474,7 @@
           <w:sz w:val="24"/>
           <w:szCs w:val="24"/>
         </w:rPr>
-        <w:t xml:space="preserve"> A "Needs attention" banner at the top lists what to act on, such as students with violations, students </w:t>
-      </w:r>
-      <w:r>
-        <w:rPr>
-          <w:rFonts w:ascii="Courier New" w:hAnsi="Courier New" w:cs="Courier New"/>
-          <w:sz w:val="24"/>
-          <w:szCs w:val="24"/>
-        </w:rPr>
-        <w:lastRenderedPageBreak/>
-        <w:t>with nothing recorded for the current semester, or an unset semester, each linked to the matching filtered student list. Per program, the dashboard shows the total number of students, the regular and irregular students (and how many are not yet determined), the students with violations, the curriculum versions, and the number of shifts, transfers and drops. Four charts are built only from recorded data: regular, irregular and not determined students; students by year level from Freshman to Senior; bottleneck subjects, where the most students' latest grade is 5.0 or INC; and the subjects most often taken out of order. Each chart has a short explanation, shows the exact numbers on hover, and can be viewed as a table. The Dean sets the current semester from the dashboard and compares the programs of the college side by side, but does not open individual students' records, which remain the chairperson's work.</w:t>
+        <w:t xml:space="preserve"> A "Needs attention" banner at the top lists what to act on, such as students with violations, students with nothing recorded for the current semester, or an unset semester, each linked to the matching filtered student list. Per program, the dashboard shows the total number of students, the regular and irregular students (and how many are not yet determined), the students with violations, the curriculum versions, and the number of shifts, transfers and drops. Four charts are built only from recorded data: regular, irregular and not determined students; students by year level from Freshman to Senior; bottleneck subjects, where the most students' latest grade is 5.0 or INC; and the subjects most often taken out of order. Each chart has a short explanation, shows the exact numbers on hover, and can be viewed as a table. The Dean sets the current semester from the dashboard and compares the programs of the college side by side, but does not open individual students' records, which remain the chairperson's work.</w:t>
       </w:r>
     </w:p>
     <w:p>
@@ -2248,7 +2504,25 @@
           <w:sz w:val="24"/>
           <w:szCs w:val="24"/>
         </w:rPr>
-        <w:t xml:space="preserve"> Supabase RLS scopes visibility by role: Program Chairpersons see only the data of their own program, while Deans see their whole college. Operations that must all succeed together, such as creating a program with its chairperson account, replacing a chairperson, or accepting a shifting student, run as single </w:t>
+        <w:t xml:space="preserve"> </w:t>
+      </w:r>
+      <w:proofErr w:type="spellStart"/>
+      <w:r>
+        <w:rPr>
+          <w:rFonts w:ascii="Courier New" w:hAnsi="Courier New" w:cs="Courier New"/>
+          <w:sz w:val="24"/>
+          <w:szCs w:val="24"/>
+        </w:rPr>
+        <w:t>Supabase</w:t>
+      </w:r>
+      <w:proofErr w:type="spellEnd"/>
+      <w:r>
+        <w:rPr>
+          <w:rFonts w:ascii="Courier New" w:hAnsi="Courier New" w:cs="Courier New"/>
+          <w:sz w:val="24"/>
+          <w:szCs w:val="24"/>
+        </w:rPr>
+        <w:t xml:space="preserve"> RLS scopes visibility by role: Program Chairpersons see only the data of their own program, while Deans see their whole college. Operations that must all succeed together, such as creating </w:t>
       </w:r>
       <w:r>
         <w:rPr>
@@ -2257,7 +2531,7 @@
           <w:szCs w:val="24"/>
         </w:rPr>
         <w:lastRenderedPageBreak/>
-        <w:t>database transactions. A new chairperson receives a temporary password from the Dean and must choose their own at first login, guided by a checklist that ticks each password rule as it is met, and actions that are hard to undo, such as dropping a student or saving grades, ask for confirmation first. Every page checks the user's role, so a page meant for another role cannot be opened by typing its address; users are signed out after 30 minutes without activity; and an account is blocked for 15 minutes after five wrong passwords.</w:t>
+        <w:t>a program with its chairperson account, replacing a chairperson, or accepting a shifting student, run as single database transactions. A new chairperson receives a temporary password from the Dean and must choose their own at first login, guided by a checklist that ticks each password rule as it is met, and actions that are hard to undo, such as dropping a student or saving grades, ask for confirmation first. Every page checks the user's role, so a page meant for another role cannot be opened by typing its address; users are signed out after 30 minutes without activity; and an account is blocked for 15 minutes after five wrong passwords.</w:t>
       </w:r>
     </w:p>
     <w:p>
@@ -2405,16 +2679,8 @@
           <w:sz w:val="24"/>
           <w:szCs w:val="24"/>
         </w:rPr>
-        <w:t xml:space="preserve">Term-based grade entry with KSU grade values, In progress marking for several subjects at once, INC completion, </w:t>
-      </w:r>
-      <w:r>
-        <w:rPr>
-          <w:rFonts w:ascii="Courier New" w:hAnsi="Courier New" w:cs="Courier New"/>
-          <w:sz w:val="24"/>
-          <w:szCs w:val="24"/>
-        </w:rPr>
         <w:lastRenderedPageBreak/>
-        <w:t>earlier-term protection and a database-written grade logbook</w:t>
+        <w:t>Term-based grade entry with KSU grade values, In progress marking for several subjects at once, INC completion, earlier-term protection and a database-written grade logbook</w:t>
       </w:r>
     </w:p>
     <w:p>
@@ -2437,7 +2703,43 @@
           <w:sz w:val="24"/>
           <w:szCs w:val="24"/>
         </w:rPr>
-        <w:t>Curriculum management with versioning (e.g., BSCpE 2019 vs. BSCpE 2023), change history, and import with preview</w:t>
+        <w:t xml:space="preserve">Curriculum management with versioning (e.g., </w:t>
+      </w:r>
+      <w:proofErr w:type="spellStart"/>
+      <w:r>
+        <w:rPr>
+          <w:rFonts w:ascii="Courier New" w:hAnsi="Courier New" w:cs="Courier New"/>
+          <w:sz w:val="24"/>
+          <w:szCs w:val="24"/>
+        </w:rPr>
+        <w:t>BSCpE</w:t>
+      </w:r>
+      <w:proofErr w:type="spellEnd"/>
+      <w:r>
+        <w:rPr>
+          <w:rFonts w:ascii="Courier New" w:hAnsi="Courier New" w:cs="Courier New"/>
+          <w:sz w:val="24"/>
+          <w:szCs w:val="24"/>
+        </w:rPr>
+        <w:t xml:space="preserve"> 2019 vs. </w:t>
+      </w:r>
+      <w:proofErr w:type="spellStart"/>
+      <w:r>
+        <w:rPr>
+          <w:rFonts w:ascii="Courier New" w:hAnsi="Courier New" w:cs="Courier New"/>
+          <w:sz w:val="24"/>
+          <w:szCs w:val="24"/>
+        </w:rPr>
+        <w:t>BSCpE</w:t>
+      </w:r>
+      <w:proofErr w:type="spellEnd"/>
+      <w:r>
+        <w:rPr>
+          <w:rFonts w:ascii="Courier New" w:hAnsi="Courier New" w:cs="Courier New"/>
+          <w:sz w:val="24"/>
+          <w:szCs w:val="24"/>
+        </w:rPr>
+        <w:t xml:space="preserve"> 2023), change history, and import with preview</w:t>
       </w:r>
     </w:p>
     <w:p>
@@ -2598,7 +2900,16 @@
           <w:sz w:val="24"/>
           <w:szCs w:val="24"/>
         </w:rPr>
-        <w:t>The system does not include subsystems for the Registrar, Accounting, or Library, and it is not connected to the KSU MIS. Its logic is limited to descriptive auditing (identifying compliance with existing rules); it does not perform predictive analytics, graduation monitoring, or AI-driven enrollment counseling.</w:t>
+        <w:t xml:space="preserve">The system does not include subsystems for the Registrar, Accounting, or Library, and it is not connected to the KSU MIS. Its logic is limited to descriptive auditing (identifying compliance with existing rules); it </w:t>
+      </w:r>
+      <w:r>
+        <w:rPr>
+          <w:rFonts w:ascii="Courier New" w:hAnsi="Courier New" w:cs="Courier New"/>
+          <w:sz w:val="24"/>
+          <w:szCs w:val="24"/>
+        </w:rPr>
+        <w:lastRenderedPageBreak/>
+        <w:t>does not perform predictive analytics, graduation monitoring, or AI-driven enrollment counseling.</w:t>
       </w:r>
     </w:p>
     <w:p>
@@ -2622,7 +2933,6 @@
           <w:sz w:val="24"/>
           <w:szCs w:val="24"/>
         </w:rPr>
-        <w:lastRenderedPageBreak/>
         <w:t>Input-Process-Output (IPO) Diagram of the Proposed System</w:t>
       </w:r>
       <w:r>
@@ -3191,7 +3501,43 @@
           <w:sz w:val="24"/>
           <w:szCs w:val="24"/>
         </w:rPr>
-        <w:t xml:space="preserve"> traces the audit of a single subject. After the chairperson saves a term's grades or marks subjects In progress, which are first checked for valid KSU grade values and for conflicts with a later recorded term, the audit engine looks at the student's record for each subject. A subject with no record is Available if its requirements have been passed, Pending if it is waiting for a requirement's final grade, and Unavailable otherwise, with the missing </w:t>
+        <w:t xml:space="preserve"> traces the audit of a single subject. After the chairperson saves a term's grades or marks subjects </w:t>
+      </w:r>
+      <w:proofErr w:type="gramStart"/>
+      <w:r>
+        <w:rPr>
+          <w:rFonts w:ascii="Courier New" w:hAnsi="Courier New" w:cs="Courier New"/>
+          <w:sz w:val="24"/>
+          <w:szCs w:val="24"/>
+        </w:rPr>
+        <w:t>In</w:t>
+      </w:r>
+      <w:proofErr w:type="gramEnd"/>
+      <w:r>
+        <w:rPr>
+          <w:rFonts w:ascii="Courier New" w:hAnsi="Courier New" w:cs="Courier New"/>
+          <w:sz w:val="24"/>
+          <w:szCs w:val="24"/>
+        </w:rPr>
+        <w:t xml:space="preserve"> progress, which are first checked for valid KSU grade values and for conflicts with a later recorded term, the audit engine looks at the student's record for each subject. A subject with no record is Available if its requirements have been passed, </w:t>
+      </w:r>
+      <w:proofErr w:type="gramStart"/>
+      <w:r>
+        <w:rPr>
+          <w:rFonts w:ascii="Courier New" w:hAnsi="Courier New" w:cs="Courier New"/>
+          <w:sz w:val="24"/>
+          <w:szCs w:val="24"/>
+        </w:rPr>
+        <w:t>Pending</w:t>
+      </w:r>
+      <w:proofErr w:type="gramEnd"/>
+      <w:r>
+        <w:rPr>
+          <w:rFonts w:ascii="Courier New" w:hAnsi="Courier New" w:cs="Courier New"/>
+          <w:sz w:val="24"/>
+          <w:szCs w:val="24"/>
+        </w:rPr>
+        <w:t xml:space="preserve"> if it is waiting for a requirement's final grade, and Unavailable otherwise, with the missing </w:t>
       </w:r>
       <w:r>
         <w:rPr>
@@ -3307,7 +3653,25 @@
           <w:sz w:val="24"/>
           <w:szCs w:val="24"/>
         </w:rPr>
-        <w:t xml:space="preserve"> outlines the system's navigation. From Login (and the password change required at a chairperson's first login), users land on the Dashboard. A Program Chairperson's menu leads to Students, Register Student, Shift In a Student, Student Movements and Manage Curriculum, and a student search is available from the top bar of every page; from Students, each student's audit page opens the Edit Student, Grade Logbook, Transfer / Shift, and Enter Grades pages. A Dean's menu leads to the Dashboard, where the current semester is set and the programs are compared, Student Movements, Create Program and Reassign Chairperson. Account Settings is available to both roles.</w:t>
+        <w:t xml:space="preserve"> outlines the system's navigation. From Login (and the password change required at a chairperson's first login), users land on the Dashboard. A Program Chairperson's menu leads to Students, Register Student, Shift </w:t>
+      </w:r>
+      <w:proofErr w:type="gramStart"/>
+      <w:r>
+        <w:rPr>
+          <w:rFonts w:ascii="Courier New" w:hAnsi="Courier New" w:cs="Courier New"/>
+          <w:sz w:val="24"/>
+          <w:szCs w:val="24"/>
+        </w:rPr>
+        <w:t>In</w:t>
+      </w:r>
+      <w:proofErr w:type="gramEnd"/>
+      <w:r>
+        <w:rPr>
+          <w:rFonts w:ascii="Courier New" w:hAnsi="Courier New" w:cs="Courier New"/>
+          <w:sz w:val="24"/>
+          <w:szCs w:val="24"/>
+        </w:rPr>
+        <w:t xml:space="preserve"> a Student, Student Movements and Manage Curriculum, and a student search is available from the top bar of every page; from Students, each student's audit page opens the Edit Student, Grade Logbook, Transfer / Shift, and Enter Grades pages. A Dean's menu leads to the Dashboard, where the current semester is set and the programs are compared, Student Movements, Create Program and Reassign Chairperson. Account Settings is available to both roles.</w:t>
       </w:r>
       <w:r>
         <w:fldChar w:fldCharType="begin"/>
@@ -3340,8 +3704,20 @@
           <w:sz w:val="24"/>
           <w:szCs w:val="24"/>
         </w:rPr>
-        <w:t>Figure 4.7. User Interface of Auditrix</w:t>
-      </w:r>
+        <w:t xml:space="preserve">Figure 4.7. User Interface of </w:t>
+      </w:r>
+      <w:proofErr w:type="spellStart"/>
+      <w:r>
+        <w:rPr>
+          <w:rFonts w:ascii="Courier New" w:hAnsi="Courier New" w:cs="Courier New"/>
+          <w:b/>
+          <w:bCs/>
+          <w:sz w:val="24"/>
+          <w:szCs w:val="24"/>
+        </w:rPr>
+        <w:t>Auditrix</w:t>
+      </w:r>
+      <w:proofErr w:type="spellEnd"/>
       <w:r>
         <w:fldChar w:fldCharType="begin"/>
       </w:r>
@@ -4377,7 +4753,29 @@
           <w:sz w:val="24"/>
           <w:szCs w:val="24"/>
         </w:rPr>
-        <w:t>Figure 4.7l. First Log In — password change with the rules checklist</w:t>
+        <w:t xml:space="preserve">Figure 4.7l. First Log In — password change with the </w:t>
+      </w:r>
+      <w:proofErr w:type="gramStart"/>
+      <w:r>
+        <w:rPr>
+          <w:rFonts w:ascii="Courier New" w:hAnsi="Courier New" w:cs="Courier New"/>
+          <w:b/>
+          <w:bCs/>
+          <w:sz w:val="24"/>
+          <w:szCs w:val="24"/>
+        </w:rPr>
+        <w:t>rules</w:t>
+      </w:r>
+      <w:proofErr w:type="gramEnd"/>
+      <w:r>
+        <w:rPr>
+          <w:rFonts w:ascii="Courier New" w:hAnsi="Courier New" w:cs="Courier New"/>
+          <w:b/>
+          <w:bCs/>
+          <w:sz w:val="24"/>
+          <w:szCs w:val="24"/>
+        </w:rPr>
+        <w:t xml:space="preserve"> checklist</w:t>
       </w:r>
       <w:r>
         <w:fldChar w:fldCharType="begin"/>
@@ -5135,7 +5533,43 @@
           <w:sz w:val="24"/>
           <w:szCs w:val="24"/>
         </w:rPr>
-        <w:t xml:space="preserve"> A total of 163 automated tests were written using the test runner built into Node.js, and all 163 pass. The tests need no database or network: the server actions are tested with Supabase replaced by an in-memory fake. Table 4.3 summarizes what they check.</w:t>
+        <w:t xml:space="preserve"> A total of 163 automated tests were written using the test runner built into Node.js, and all 163 </w:t>
+      </w:r>
+      <w:proofErr w:type="gramStart"/>
+      <w:r>
+        <w:rPr>
+          <w:rFonts w:ascii="Courier New" w:hAnsi="Courier New" w:cs="Courier New"/>
+          <w:sz w:val="24"/>
+          <w:szCs w:val="24"/>
+        </w:rPr>
+        <w:t>pass</w:t>
+      </w:r>
+      <w:proofErr w:type="gramEnd"/>
+      <w:r>
+        <w:rPr>
+          <w:rFonts w:ascii="Courier New" w:hAnsi="Courier New" w:cs="Courier New"/>
+          <w:sz w:val="24"/>
+          <w:szCs w:val="24"/>
+        </w:rPr>
+        <w:t xml:space="preserve">. The tests need no database or network: the server actions are tested with </w:t>
+      </w:r>
+      <w:proofErr w:type="spellStart"/>
+      <w:r>
+        <w:rPr>
+          <w:rFonts w:ascii="Courier New" w:hAnsi="Courier New" w:cs="Courier New"/>
+          <w:sz w:val="24"/>
+          <w:szCs w:val="24"/>
+        </w:rPr>
+        <w:t>Supabase</w:t>
+      </w:r>
+      <w:proofErr w:type="spellEnd"/>
+      <w:r>
+        <w:rPr>
+          <w:rFonts w:ascii="Courier New" w:hAnsi="Courier New" w:cs="Courier New"/>
+          <w:sz w:val="24"/>
+          <w:szCs w:val="24"/>
+        </w:rPr>
+        <w:t xml:space="preserve"> replaced by an in-memory fake. Table 4.3 summarizes what they check.</w:t>
       </w:r>
     </w:p>
     <w:tbl>
@@ -5473,7 +5907,61 @@
                 <w:sz w:val="20"/>
                 <w:szCs w:val="20"/>
               </w:rPr>
-              <w:t>Curriculum CSV / .xls parsing and the import preview plan; reading CSV, Excel workbooks (.xlsx), KSU-MIS .xls and Excel re-saved .xls; old Excel 97-2003 and damaged files; student template and .xlsx import</w:t>
+              <w:t>Curriculum CSV / .</w:t>
+            </w:r>
+            <w:proofErr w:type="spellStart"/>
+            <w:r>
+              <w:rPr>
+                <w:rFonts w:ascii="Courier New" w:hAnsi="Courier New" w:cs="Courier New"/>
+                <w:sz w:val="20"/>
+                <w:szCs w:val="20"/>
+              </w:rPr>
+              <w:t>xls</w:t>
+            </w:r>
+            <w:proofErr w:type="spellEnd"/>
+            <w:r>
+              <w:rPr>
+                <w:rFonts w:ascii="Courier New" w:hAnsi="Courier New" w:cs="Courier New"/>
+                <w:sz w:val="20"/>
+                <w:szCs w:val="20"/>
+              </w:rPr>
+              <w:t xml:space="preserve"> parsing and the import preview plan; reading CSV, Excel workbooks (.xlsx), KSU-MIS .</w:t>
+            </w:r>
+            <w:proofErr w:type="spellStart"/>
+            <w:r>
+              <w:rPr>
+                <w:rFonts w:ascii="Courier New" w:hAnsi="Courier New" w:cs="Courier New"/>
+                <w:sz w:val="20"/>
+                <w:szCs w:val="20"/>
+              </w:rPr>
+              <w:t>xls</w:t>
+            </w:r>
+            <w:proofErr w:type="spellEnd"/>
+            <w:r>
+              <w:rPr>
+                <w:rFonts w:ascii="Courier New" w:hAnsi="Courier New" w:cs="Courier New"/>
+                <w:sz w:val="20"/>
+                <w:szCs w:val="20"/>
+              </w:rPr>
+              <w:t xml:space="preserve"> and Excel re-saved .</w:t>
+            </w:r>
+            <w:proofErr w:type="spellStart"/>
+            <w:r>
+              <w:rPr>
+                <w:rFonts w:ascii="Courier New" w:hAnsi="Courier New" w:cs="Courier New"/>
+                <w:sz w:val="20"/>
+                <w:szCs w:val="20"/>
+              </w:rPr>
+              <w:t>xls</w:t>
+            </w:r>
+            <w:proofErr w:type="spellEnd"/>
+            <w:r>
+              <w:rPr>
+                <w:rFonts w:ascii="Courier New" w:hAnsi="Courier New" w:cs="Courier New"/>
+                <w:sz w:val="20"/>
+                <w:szCs w:val="20"/>
+              </w:rPr>
+              <w:t>; old Excel 97-2003 and damaged files; student template and .xlsx import</w:t>
             </w:r>
           </w:p>
         </w:tc>
@@ -5605,7 +6093,7 @@
           <w:sz w:val="24"/>
           <w:szCs w:val="24"/>
         </w:rPr>
-        <w:t xml:space="preserve">Table 4.3. Summary of the Automated Tests</w:t>
+        <w:t>Table 4.3. Summary of the Automated Tests</w:t>
       </w:r>
       <w:r>
         <w:fldChar w:fldCharType="begin"/>
@@ -5653,7 +6141,25 @@
           <w:szCs w:val="24"/>
         </w:rPr>
         <w:lastRenderedPageBreak/>
-        <w:t>their reasons, INC completion, the out-of-order warning after saving grades, setting the current semester, automatic year levels moving up with grades and semesters, chairperson overrides, regular and irregular counts, .xls and .xlsx imports, the earlier-term warning, and the password checklist. All scenarios passed after the defects found were fixed.</w:t>
+        <w:t>their reasons, INC completion, the out-of-order warning after saving grades, setting the current semester, automatic year levels moving up with grades and semesters, chairperson overrides, regular and irregular counts, .</w:t>
+      </w:r>
+      <w:proofErr w:type="spellStart"/>
+      <w:r>
+        <w:rPr>
+          <w:rFonts w:ascii="Courier New" w:hAnsi="Courier New" w:cs="Courier New"/>
+          <w:sz w:val="24"/>
+          <w:szCs w:val="24"/>
+        </w:rPr>
+        <w:t>xls</w:t>
+      </w:r>
+      <w:proofErr w:type="spellEnd"/>
+      <w:r>
+        <w:rPr>
+          <w:rFonts w:ascii="Courier New" w:hAnsi="Courier New" w:cs="Courier New"/>
+          <w:sz w:val="24"/>
+          <w:szCs w:val="24"/>
+        </w:rPr>
+        <w:t xml:space="preserve"> and .xlsx imports, the earlier-term warning, and the password checklist. All scenarios passed after the defects found were fixed.</w:t>
       </w:r>
     </w:p>
     <w:p>
@@ -5872,7 +6378,25 @@
           <w:sz w:val="24"/>
           <w:szCs w:val="24"/>
         </w:rPr>
-        <w:t xml:space="preserve">Upon completion of the system, Auditrix is to be evaluated by the Program Chairpersons and selected IT experts using a printed (paper-based) questionnaire built on the ISO/IEC 25010 software quality model, with each characteristic mapped to a specific part of the system. Responses will be analyzed using the Weighted Mean. Table 4.4 will present the extent of compliance per quality characteristic.</w:t>
+        <w:t xml:space="preserve">Upon completion of the system, </w:t>
+      </w:r>
+      <w:proofErr w:type="spellStart"/>
+      <w:r>
+        <w:rPr>
+          <w:rFonts w:ascii="Courier New" w:hAnsi="Courier New" w:cs="Courier New"/>
+          <w:sz w:val="24"/>
+          <w:szCs w:val="24"/>
+        </w:rPr>
+        <w:t>Auditrix</w:t>
+      </w:r>
+      <w:proofErr w:type="spellEnd"/>
+      <w:r>
+        <w:rPr>
+          <w:rFonts w:ascii="Courier New" w:hAnsi="Courier New" w:cs="Courier New"/>
+          <w:sz w:val="24"/>
+          <w:szCs w:val="24"/>
+        </w:rPr>
+        <w:t xml:space="preserve"> is to be evaluated by the Program Chairpersons and selected IT experts using a printed (paper-based) questionnaire built on the ISO/IEC 25010 software quality model, with each characteristic mapped to a specific part of the system. Responses will be analyzed using the Weighted Mean. Table 4.4 will present the extent of compliance per quality characteristic.</w:t>
       </w:r>
     </w:p>
     <w:tbl>
@@ -6940,7 +7464,29 @@
           <w:sz w:val="24"/>
           <w:szCs w:val="24"/>
         </w:rPr>
-        <w:t xml:space="preserve">Table 4.4. Extent of Compliance of Auditrix with ISO/IEC 25010</w:t>
+        <w:t xml:space="preserve">Table 4.4. Extent of Compliance of </w:t>
+      </w:r>
+      <w:proofErr w:type="spellStart"/>
+      <w:r>
+        <w:rPr>
+          <w:rFonts w:ascii="Courier New" w:hAnsi="Courier New" w:cs="Courier New"/>
+          <w:b/>
+          <w:bCs/>
+          <w:sz w:val="24"/>
+          <w:szCs w:val="24"/>
+        </w:rPr>
+        <w:t>Auditrix</w:t>
+      </w:r>
+      <w:proofErr w:type="spellEnd"/>
+      <w:r>
+        <w:rPr>
+          <w:rFonts w:ascii="Courier New" w:hAnsi="Courier New" w:cs="Courier New"/>
+          <w:b/>
+          <w:bCs/>
+          <w:sz w:val="24"/>
+          <w:szCs w:val="24"/>
+        </w:rPr>
+        <w:t xml:space="preserve"> with ISO/IEC 25010</w:t>
       </w:r>
       <w:r>
         <w:fldChar w:fldCharType="begin"/>
@@ -6955,6 +7501,8 @@
     <w:sectPr>
       <w:headerReference w:type="default" r:id="rId71"/>
       <w:headerReference w:type="first" r:id="rId72"/>
+      <w:footerReference w:type="default" r:id="rId16"/>
+      <w:footerReference w:type="first" r:id="rId16"/>
       <w:pgSz w:w="12242" w:h="15842"/>
       <w:pgMar w:top="1440" w:right="1440" w:bottom="1440" w:left="2160" w:header="709" w:footer="709" w:gutter="0"/>
       <w:pgNumType w:start="53"/>
@@ -7094,8 +7642,89 @@
 
 <file path=word/footer3.xml><?xml version="1.0" encoding="utf-8"?>
 <w:ftr xmlns:wpc="http://schemas.microsoft.com/office/word/2010/wordprocessingCanvas" xmlns:cx="http://schemas.microsoft.com/office/drawing/2014/chartex" xmlns:cx1="http://schemas.microsoft.com/office/drawing/2015/9/8/chartex" xmlns:cx2="http://schemas.microsoft.com/office/drawing/2015/10/21/chartex" xmlns:cx3="http://schemas.microsoft.com/office/drawing/2016/5/9/chartex" xmlns:cx4="http://schemas.microsoft.com/office/drawing/2016/5/10/chartex" xmlns:cx5="http://schemas.microsoft.com/office/drawing/2016/5/11/chartex" xmlns:cx6="http://schemas.microsoft.com/office/drawing/2016/5/12/chartex" xmlns:cx7="http://schemas.microsoft.com/office/drawing/2016/5/13/chartex" xmlns:cx8="http://schemas.microsoft.com/office/drawing/2016/5/14/chartex" xmlns:mc="http://schemas.openxmlformats.org/markup-compatibility/2006" xmlns:aink="http://schemas.microsoft.com/office/drawing/2016/ink" xmlns:am3d="http://schemas.microsoft.com/office/drawing/2017/model3d" xmlns:o="urn:schemas-microsoft-com:office:office" xmlns:oel="http://schemas.microsoft.com/office/2019/extlst" xmlns:r="http://schemas.openxmlformats.org/officeDocument/2006/relationships" xmlns:m="http://schemas.openxmlformats.org/officeDocument/2006/math" xmlns:v="urn:schemas-microsoft-com:vml" xmlns:wp14="http://schemas.microsoft.com/office/word/2010/wordprocessingDrawing" xmlns:wp="http://schemas.openxmlformats.org/drawingml/2006/wordprocessingDrawing" xmlns:w10="urn:schemas-microsoft-com:office:word" xmlns:w="http://schemas.openxmlformats.org/wordprocessingml/2006/main" xmlns:w14="http://schemas.microsoft.com/office/word/2010/wordml" xmlns:w15="http://schemas.microsoft.com/office/word/2012/wordml" xmlns:w16cex="http://schemas.microsoft.com/office/word/2018/wordml/cex" xmlns:w16cid="http://schemas.microsoft.com/office/word/2016/wordml/cid" xmlns:w16="http://schemas.microsoft.com/office/word/2018/wordml" xmlns:w16du="http://schemas.microsoft.com/office/word/2023/wordml/word16du" xmlns:w16sdtdh="http://schemas.microsoft.com/office/word/2020/wordml/sdtdatahash" xmlns:w16sdtfl="http://schemas.microsoft.com/office/word/2024/wordml/sdtformatlock" xmlns:w16se="http://schemas.microsoft.com/office/word/2015/wordml/symex" xmlns:wpg="http://schemas.microsoft.com/office/word/2010/wordprocessingGroup" xmlns:wpi="http://schemas.microsoft.com/office/word/2010/wordprocessingInk" xmlns:wne="http://schemas.microsoft.com/office/word/2006/wordml" xmlns:wps="http://schemas.microsoft.com/office/word/2010/wordprocessingShape" mc:Ignorable="w14 w15 w16se w16cid w16 w16cex w16sdtdh w16sdtfl w16du wp14">
+  <w:sdt>
+    <w:sdtPr>
+      <w:id w:val="-346180850"/>
+    </w:sdtPr>
+    <w:sdtContent>
+      <w:p>
+        <w:pPr>
+          <w:pStyle w:val="Footer"/>
+          <w:jc w:val="center"/>
+        </w:pPr>
+        <w:r>
+          <w:rPr>
+            <w:rFonts w:ascii="Courier New" w:hAnsi="Courier New" w:cs="Courier New"/>
+            <w:noProof/>
+            <w:lang w:eastAsia="en-PH"/>
+          </w:rPr>
+          <mc:AlternateContent>
+            <mc:Choice Requires="wps">
+              <w:drawing>
+                <wp:anchor distT="0" distB="0" distL="114300" distR="114300" simplePos="0" relativeHeight="251645952" behindDoc="0" locked="0" layoutInCell="1" allowOverlap="1" wp14:anchorId="597055CA" wp14:editId="492FEC36">
+                  <wp:simplePos x="0" y="0"/>
+                  <wp:positionH relativeFrom="page">
+                    <wp:align>left</wp:align>
+                  </wp:positionH>
+                  <wp:positionV relativeFrom="paragraph">
+                    <wp:posOffset>-112395</wp:posOffset>
+                  </wp:positionV>
+                  <wp:extent cx="7772400" cy="0"/>
+                  <wp:effectExtent l="0" t="19050" r="19050" b="19050"/>
+                  <wp:wrapNone/>
+                  <wp:docPr id="431550391" name="Straight Connector 431550391"/>
+                  <wp:cNvGraphicFramePr/>
+                  <a:graphic xmlns:a="http://schemas.openxmlformats.org/drawingml/2006/main">
+                    <a:graphicData uri="http://schemas.microsoft.com/office/word/2010/wordprocessingShape">
+                      <wps:wsp>
+                        <wps:cNvCnPr/>
+                        <wps:spPr>
+                          <a:xfrm>
+                            <a:off x="0" y="0"/>
+                            <a:ext cx="7772400" cy="0"/>
+                          </a:xfrm>
+                          <a:prstGeom prst="line">
+                            <a:avLst/>
+                          </a:prstGeom>
+                          <a:ln w="38100"/>
+                        </wps:spPr>
+                        <wps:style>
+                          <a:lnRef idx="1">
+                            <a:schemeClr val="dk1"/>
+                          </a:lnRef>
+                          <a:fillRef idx="0">
+                            <a:schemeClr val="dk1"/>
+                          </a:fillRef>
+                          <a:effectRef idx="0">
+                            <a:schemeClr val="dk1"/>
+                          </a:effectRef>
+                          <a:fontRef idx="minor">
+                            <a:schemeClr val="tx1"/>
+                          </a:fontRef>
+                        </wps:style>
+                        <wps:bodyPr/>
+                      </wps:wsp>
+                    </a:graphicData>
+                  </a:graphic>
+                </wp:anchor>
+              </w:drawing>
+            </mc:Choice>
+            <mc:Fallback>
+              <w:pict>
+                <v:line w14:anchorId="7E22F063" id="Straight Connector 431550391" o:spid="_x0000_s1026" style="position:absolute;z-index:251664384;visibility:visible;mso-wrap-style:square;mso-wrap-distance-left:9pt;mso-wrap-distance-top:0;mso-wrap-distance-right:9pt;mso-wrap-distance-bottom:0;mso-position-horizontal:left;mso-position-horizontal-relative:page;mso-position-vertical:absolute;mso-position-vertical-relative:text" from="0,-8.85pt" to="612pt,-8.85pt" o:gfxdata="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" strokecolor="black [3200]" strokeweight="3pt">
+                  <v:stroke joinstyle="miter"/>
+                  <w10:wrap anchorx="page"/>
+                </v:line>
+              </w:pict>
+            </mc:Fallback>
+          </mc:AlternateContent>
+        </w:r>
+      </w:p>
+    </w:sdtContent>
+  </w:sdt>
   <w:p>
     <w:pPr>
+      <w:pStyle w:val="Footer"/>
       <w:jc w:val="center"/>
     </w:pPr>
     <w:r>
@@ -7128,7 +7757,15 @@
         <w:sz w:val="24"/>
         <w:szCs w:val="24"/>
       </w:rPr>
-      <w:t>ii</w:t>
+      <w:t>i</w:t>
+    </w:r>
+    <w:r>
+      <w:rPr>
+        <w:rFonts w:ascii="Courier New" w:hAnsi="Courier New" w:cs="Courier New"/>
+        <w:sz w:val="24"/>
+        <w:szCs w:val="24"/>
+      </w:rPr>
+      <w:t>i</w:t>
     </w:r>
     <w:r>
       <w:rPr>
@@ -7598,7 +8235,22 @@
             <w:sz w:val="24"/>
           </w:rPr>
           <w:tab/>
-          <w:t>Bulanao, Tabuk City, Kalinga</w:t>
+        </w:r>
+        <w:proofErr w:type="spellStart"/>
+        <w:r>
+          <w:rPr>
+            <w:rFonts w:ascii="Courier New" w:hAnsi="Courier New" w:cs="Courier New"/>
+            <w:sz w:val="24"/>
+          </w:rPr>
+          <w:t>Bulanao</w:t>
+        </w:r>
+        <w:proofErr w:type="spellEnd"/>
+        <w:r>
+          <w:rPr>
+            <w:rFonts w:ascii="Courier New" w:hAnsi="Courier New" w:cs="Courier New"/>
+            <w:sz w:val="24"/>
+          </w:rPr>
+          <w:t>, Tabuk City, Kalinga</w:t>
         </w:r>
       </w:p>
       <w:p>
@@ -7695,8 +8347,9 @@
             <w:szCs w:val="24"/>
             <w:lang w:val="en-US"/>
           </w:rPr>
-          <w:t>College of Engineering and Information Technol</w:t>
-        </w:r>
+          <w:t xml:space="preserve">College of Engineering and Information </w:t>
+        </w:r>
+        <w:proofErr w:type="spellStart"/>
         <w:r>
           <w:rPr>
             <w:rFonts w:ascii="Courier New" w:hAnsi="Courier New" w:cs="Courier New"/>
@@ -7704,8 +8357,18 @@
             <w:szCs w:val="24"/>
             <w:lang w:val="en-US"/>
           </w:rPr>
+          <w:t>Technol</w:t>
+        </w:r>
+        <w:r>
+          <w:rPr>
+            <w:rFonts w:ascii="Courier New" w:hAnsi="Courier New" w:cs="Courier New"/>
+            <w:sz w:val="24"/>
+            <w:szCs w:val="24"/>
+            <w:lang w:val="en-US"/>
+          </w:rPr>
           <w:t>og</w:t>
         </w:r>
+        <w:proofErr w:type="spellEnd"/>
       </w:p>
       <w:p>
         <w:pPr>
@@ -8067,7 +8730,22 @@
             <w:sz w:val="24"/>
           </w:rPr>
           <w:tab/>
-          <w:t>Bulanao, Tabuk City, Kalinga</w:t>
+        </w:r>
+        <w:proofErr w:type="spellStart"/>
+        <w:r>
+          <w:rPr>
+            <w:rFonts w:ascii="Courier New" w:hAnsi="Courier New" w:cs="Courier New"/>
+            <w:sz w:val="24"/>
+          </w:rPr>
+          <w:t>Bulanao</w:t>
+        </w:r>
+        <w:proofErr w:type="spellEnd"/>
+        <w:r>
+          <w:rPr>
+            <w:rFonts w:ascii="Courier New" w:hAnsi="Courier New" w:cs="Courier New"/>
+            <w:sz w:val="24"/>
+          </w:rPr>
+          <w:t>, Tabuk City, Kalinga</w:t>
         </w:r>
       </w:p>
       <w:p>
@@ -8516,7 +9194,22 @@
             <w:sz w:val="24"/>
           </w:rPr>
           <w:tab/>
-          <w:t>Bulanao, Tabuk City, Kalinga</w:t>
+        </w:r>
+        <w:proofErr w:type="spellStart"/>
+        <w:r>
+          <w:rPr>
+            <w:rFonts w:ascii="Courier New" w:hAnsi="Courier New" w:cs="Courier New"/>
+            <w:sz w:val="24"/>
+          </w:rPr>
+          <w:t>Bulanao</w:t>
+        </w:r>
+        <w:proofErr w:type="spellEnd"/>
+        <w:r>
+          <w:rPr>
+            <w:rFonts w:ascii="Courier New" w:hAnsi="Courier New" w:cs="Courier New"/>
+            <w:sz w:val="24"/>
+          </w:rPr>
+          <w:t>, Tabuk City, Kalinga</w:t>
         </w:r>
       </w:p>
       <w:p>
@@ -8936,7 +9629,22 @@
             <w:sz w:val="24"/>
           </w:rPr>
           <w:tab/>
-          <w:t>Bulanao, Tabuk City, Kalinga</w:t>
+        </w:r>
+        <w:proofErr w:type="spellStart"/>
+        <w:r>
+          <w:rPr>
+            <w:rFonts w:ascii="Courier New" w:hAnsi="Courier New" w:cs="Courier New"/>
+            <w:sz w:val="24"/>
+          </w:rPr>
+          <w:t>Bulanao</w:t>
+        </w:r>
+        <w:proofErr w:type="spellEnd"/>
+        <w:r>
+          <w:rPr>
+            <w:rFonts w:ascii="Courier New" w:hAnsi="Courier New" w:cs="Courier New"/>
+            <w:sz w:val="24"/>
+          </w:rPr>
+          <w:t>, Tabuk City, Kalinga</w:t>
         </w:r>
       </w:p>
       <w:p>
@@ -9033,8 +9741,9 @@
             <w:szCs w:val="24"/>
             <w:lang w:val="en-US"/>
           </w:rPr>
-          <w:t>College of Engineering and Information Technol</w:t>
-        </w:r>
+          <w:t xml:space="preserve">College of Engineering and Information </w:t>
+        </w:r>
+        <w:proofErr w:type="spellStart"/>
         <w:r>
           <w:rPr>
             <w:rFonts w:ascii="Courier New" w:hAnsi="Courier New" w:cs="Courier New"/>
@@ -9042,8 +9751,18 @@
             <w:szCs w:val="24"/>
             <w:lang w:val="en-US"/>
           </w:rPr>
+          <w:t>Technol</w:t>
+        </w:r>
+        <w:r>
+          <w:rPr>
+            <w:rFonts w:ascii="Courier New" w:hAnsi="Courier New" w:cs="Courier New"/>
+            <w:sz w:val="24"/>
+            <w:szCs w:val="24"/>
+            <w:lang w:val="en-US"/>
+          </w:rPr>
           <w:t>og</w:t>
         </w:r>
+        <w:proofErr w:type="spellEnd"/>
       </w:p>
       <w:p>
         <w:pPr>
@@ -9405,7 +10124,22 @@
             <w:sz w:val="24"/>
           </w:rPr>
           <w:tab/>
-          <w:t>Bulanao, Tabuk City, Kalinga</w:t>
+        </w:r>
+        <w:proofErr w:type="spellStart"/>
+        <w:r>
+          <w:rPr>
+            <w:rFonts w:ascii="Courier New" w:hAnsi="Courier New" w:cs="Courier New"/>
+            <w:sz w:val="24"/>
+          </w:rPr>
+          <w:t>Bulanao</w:t>
+        </w:r>
+        <w:proofErr w:type="spellEnd"/>
+        <w:r>
+          <w:rPr>
+            <w:rFonts w:ascii="Courier New" w:hAnsi="Courier New" w:cs="Courier New"/>
+            <w:sz w:val="24"/>
+          </w:rPr>
+          <w:t>, Tabuk City, Kalinga</w:t>
         </w:r>
       </w:p>
       <w:p>
@@ -9854,7 +10588,22 @@
             <w:sz w:val="24"/>
           </w:rPr>
           <w:tab/>
-          <w:t>Bulanao, Tabuk City, Kalinga</w:t>
+        </w:r>
+        <w:proofErr w:type="spellStart"/>
+        <w:r>
+          <w:rPr>
+            <w:rFonts w:ascii="Courier New" w:hAnsi="Courier New" w:cs="Courier New"/>
+            <w:sz w:val="24"/>
+          </w:rPr>
+          <w:t>Bulanao</w:t>
+        </w:r>
+        <w:proofErr w:type="spellEnd"/>
+        <w:r>
+          <w:rPr>
+            <w:rFonts w:ascii="Courier New" w:hAnsi="Courier New" w:cs="Courier New"/>
+            <w:sz w:val="24"/>
+          </w:rPr>
+          <w:t>, Tabuk City, Kalinga</w:t>
         </w:r>
         <w:r>
           <w:rPr>
@@ -10224,7 +10973,22 @@
             <w:sz w:val="24"/>
           </w:rPr>
           <w:tab/>
-          <w:t>Bulanao, Tabuk City, Kalinga</w:t>
+        </w:r>
+        <w:proofErr w:type="spellStart"/>
+        <w:r>
+          <w:rPr>
+            <w:rFonts w:ascii="Courier New" w:hAnsi="Courier New" w:cs="Courier New"/>
+            <w:sz w:val="24"/>
+          </w:rPr>
+          <w:t>Bulanao</w:t>
+        </w:r>
+        <w:proofErr w:type="spellEnd"/>
+        <w:r>
+          <w:rPr>
+            <w:rFonts w:ascii="Courier New" w:hAnsi="Courier New" w:cs="Courier New"/>
+            <w:sz w:val="24"/>
+          </w:rPr>
+          <w:t>, Tabuk City, Kalinga</w:t>
         </w:r>
       </w:p>
       <w:p>
@@ -10673,7 +11437,22 @@
             <w:sz w:val="24"/>
           </w:rPr>
           <w:tab/>
-          <w:t>Bulanao, Tabuk City, Kalinga</w:t>
+        </w:r>
+        <w:proofErr w:type="spellStart"/>
+        <w:r>
+          <w:rPr>
+            <w:rFonts w:ascii="Courier New" w:hAnsi="Courier New" w:cs="Courier New"/>
+            <w:sz w:val="24"/>
+          </w:rPr>
+          <w:t>Bulanao</w:t>
+        </w:r>
+        <w:proofErr w:type="spellEnd"/>
+        <w:r>
+          <w:rPr>
+            <w:rFonts w:ascii="Courier New" w:hAnsi="Courier New" w:cs="Courier New"/>
+            <w:sz w:val="24"/>
+          </w:rPr>
+          <w:t>, Tabuk City, Kalinga</w:t>
         </w:r>
       </w:p>
       <w:p>
@@ -11060,7 +11839,22 @@
             <w:sz w:val="24"/>
           </w:rPr>
           <w:tab/>
-          <w:t>Bulanao, Tabuk City, Kalinga</w:t>
+        </w:r>
+        <w:proofErr w:type="spellStart"/>
+        <w:r>
+          <w:rPr>
+            <w:rFonts w:ascii="Courier New" w:hAnsi="Courier New" w:cs="Courier New"/>
+            <w:sz w:val="24"/>
+          </w:rPr>
+          <w:t>Bulanao</w:t>
+        </w:r>
+        <w:proofErr w:type="spellEnd"/>
+        <w:r>
+          <w:rPr>
+            <w:rFonts w:ascii="Courier New" w:hAnsi="Courier New" w:cs="Courier New"/>
+            <w:sz w:val="24"/>
+          </w:rPr>
+          <w:t>, Tabuk City, Kalinga</w:t>
         </w:r>
       </w:p>
       <w:p>
@@ -11511,7 +12305,22 @@
             <w:sz w:val="24"/>
           </w:rPr>
           <w:tab/>
-          <w:t>Bulanao, Tabuk City, Kalinga</w:t>
+        </w:r>
+        <w:proofErr w:type="spellStart"/>
+        <w:r>
+          <w:rPr>
+            <w:rFonts w:ascii="Courier New" w:hAnsi="Courier New" w:cs="Courier New"/>
+            <w:sz w:val="24"/>
+          </w:rPr>
+          <w:t>Bulanao</w:t>
+        </w:r>
+        <w:proofErr w:type="spellEnd"/>
+        <w:r>
+          <w:rPr>
+            <w:rFonts w:ascii="Courier New" w:hAnsi="Courier New" w:cs="Courier New"/>
+            <w:sz w:val="24"/>
+          </w:rPr>
+          <w:t>, Tabuk City, Kalinga</w:t>
         </w:r>
       </w:p>
       <w:p>
@@ -13588,10 +14397,6 @@
 </file>
 
 <file path=customXml/item1.xml><?xml version="1.0" encoding="utf-8"?>
-<b:Sources xmlns:b="http://schemas.openxmlformats.org/officeDocument/2006/bibliography" xmlns="http://schemas.openxmlformats.org/officeDocument/2006/bibliography" SelectedStyle="\APASixthEditionOfficeOnline.xsl" StyleName="APA" Version="6"/>
-</file>
-
-<file path=customXml/item2.xml><?xml version="1.0" encoding="utf-8"?>
 <s:customData xmlns="http://www.wps.cn/officeDocument/2013/wpsCustomData" xmlns:s="http://www.wps.cn/officeDocument/2013/wpsCustomData">
   <customSectProps>
     <customSectPr/>
@@ -13603,18 +14408,22 @@
 </s:customData>
 </file>
 
+<file path=customXml/item2.xml><?xml version="1.0" encoding="utf-8"?>
+<b:Sources xmlns:b="http://schemas.openxmlformats.org/officeDocument/2006/bibliography" xmlns="http://schemas.openxmlformats.org/officeDocument/2006/bibliography" SelectedStyle="\APASixthEditionOfficeOnline.xsl" StyleName="APA" Version="6"/>
+</file>
+
 <file path=customXml/itemProps1.xml><?xml version="1.0" encoding="utf-8"?>
+<ds:datastoreItem xmlns:ds="http://schemas.openxmlformats.org/officeDocument/2006/customXml" ds:itemID="{B1977F7D-205B-4081-913C-38D41E755F92}">
+  <ds:schemaRefs>
+    <ds:schemaRef ds:uri="http://www.wps.cn/officeDocument/2013/wpsCustomData"/>
+  </ds:schemaRefs>
+</ds:datastoreItem>
+</file>
+
+<file path=customXml/itemProps2.xml><?xml version="1.0" encoding="utf-8"?>
 <ds:datastoreItem xmlns:ds="http://schemas.openxmlformats.org/officeDocument/2006/customXml" ds:itemID="{5EC2CED6-9A61-4FA3-BB1B-E128CC05341B}">
   <ds:schemaRefs>
     <ds:schemaRef ds:uri="http://schemas.openxmlformats.org/officeDocument/2006/bibliography"/>
   </ds:schemaRefs>
 </ds:datastoreItem>
-</file>
-
-<file path=customXml/itemProps2.xml><?xml version="1.0" encoding="utf-8"?>
-<ds:datastoreItem xmlns:ds="http://schemas.openxmlformats.org/officeDocument/2006/customXml" ds:itemID="{B1977F7D-205B-4081-913C-38D41E755F92}">
-  <ds:schemaRefs>
-    <ds:schemaRef ds:uri="http://www.wps.cn/officeDocument/2013/wpsCustomData"/>
-  </ds:schemaRefs>
-</ds:datastoreItem>
 </file>
</xml_diff>

<commit_message>
Add the line under the header to every chapter page
Only the front-matter header had a horizontal line under the university
name; the chapter headers never did. The same line is now in all eight
chapter headers, below the chapter label on the running pages.

Co-Authored-By: Claude Opus 5.5 <noreply@anthropic.com>
Claude-Session: https://claude.ai/code/session_01MN4gTfErSULVtFJnUJ6zoR
</commit_message>
<xml_diff>
--- a/docs/paper/Auditrix - Chapter 4.docx
+++ b/docs/paper/Auditrix - Chapter 4.docx
@@ -8783,6 +8783,75 @@
         <w:r>
           <w:rPr>
             <w:rFonts w:ascii="Courier New" w:hAnsi="Courier New" w:cs="Courier New"/>
+            <w:noProof/>
+            <w:lang w:eastAsia="en-PH"/>
+          </w:rPr>
+          <mc:AlternateContent>
+            <mc:Choice Requires="wps">
+              <w:drawing>
+                <wp:anchor distT="0" distB="0" distL="114300" distR="114300" simplePos="0" relativeHeight="251643904" behindDoc="0" locked="0" layoutInCell="1" allowOverlap="1">
+                  <wp:simplePos x="0" y="0"/>
+                  <wp:positionH relativeFrom="page">
+                    <wp:align>right</wp:align>
+                  </wp:positionH>
+                  <wp:positionV relativeFrom="paragraph">
+                    <wp:posOffset>204470</wp:posOffset>
+                  </wp:positionV>
+                  <wp:extent cx="7772400" cy="0"/>
+                  <wp:effectExtent l="0" t="19050" r="19050" b="19050"/>
+                  <wp:wrapNone/>
+                  <wp:docPr id="9900" name="Straight Connector 29"/>
+                  <wp:cNvGraphicFramePr/>
+                  <a:graphic xmlns:a="http://schemas.openxmlformats.org/drawingml/2006/main">
+                    <a:graphicData uri="http://schemas.microsoft.com/office/word/2010/wordprocessingShape">
+                      <wps:wsp>
+                        <wps:cNvCnPr/>
+                        <wps:spPr>
+                          <a:xfrm>
+                            <a:off x="0" y="0"/>
+                            <a:ext cx="7772400" cy="0"/>
+                          </a:xfrm>
+                          <a:prstGeom prst="line">
+                            <a:avLst/>
+                          </a:prstGeom>
+                          <a:ln w="38100"/>
+                        </wps:spPr>
+                        <wps:style>
+                          <a:lnRef idx="1">
+                            <a:schemeClr val="dk1"/>
+                          </a:lnRef>
+                          <a:fillRef idx="0">
+                            <a:schemeClr val="dk1"/>
+                          </a:fillRef>
+                          <a:effectRef idx="0">
+                            <a:schemeClr val="dk1"/>
+                          </a:effectRef>
+                          <a:fontRef idx="minor">
+                            <a:schemeClr val="tx1"/>
+                          </a:fontRef>
+                        </wps:style>
+                        <wps:bodyPr/>
+                      </wps:wsp>
+                    </a:graphicData>
+                  </a:graphic>
+                </wp:anchor>
+              </w:drawing>
+            </mc:Choice>
+            <mc:Fallback xmlns:wpsCustomData="http://www.wps.cn/officeDocument/2013/wpsCustomData">
+              <w:pict>
+                <v:line id="_x0000_s1026" o:spid="_x0000_s1026" o:spt="20" style="position:absolute;left:0pt;margin-top:16.1pt;height:0pt;width:612pt;mso-position-horizontal:right;mso-position-horizontal-relative:page;z-index:251663360;mso-width-relative:page;mso-height-relative:page;" filled="f" stroked="t" coordsize="21600,21600" o:gfxdata="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">
+                  <v:fill on="f" focussize="0,0"/>
+                  <v:stroke weight="3pt" color="#000000 [3200]" miterlimit="8" joinstyle="miter"/>
+                  <v:imagedata o:title=""/>
+                  <o:lock v:ext="edit" aspectratio="f"/>
+                </v:line>
+              </w:pict>
+            </mc:Fallback>
+          </mc:AlternateContent>
+        </w:r>
+        <w:r>
+          <w:rPr>
+            <w:rFonts w:ascii="Courier New" w:hAnsi="Courier New" w:cs="Courier New"/>
             <w:sz w:val="20"/>
             <w:szCs w:val="20"/>
           </w:rPr>
@@ -9226,6 +9295,75 @@
             <w:sz w:val="24"/>
           </w:rPr>
         </w:pPr>
+        <w:r>
+          <w:rPr>
+            <w:rFonts w:ascii="Courier New" w:hAnsi="Courier New" w:cs="Courier New"/>
+            <w:noProof/>
+            <w:lang w:eastAsia="en-PH"/>
+          </w:rPr>
+          <mc:AlternateContent>
+            <mc:Choice Requires="wps">
+              <w:drawing>
+                <wp:anchor distT="0" distB="0" distL="114300" distR="114300" simplePos="0" relativeHeight="251643904" behindDoc="0" locked="0" layoutInCell="1" allowOverlap="1">
+                  <wp:simplePos x="0" y="0"/>
+                  <wp:positionH relativeFrom="page">
+                    <wp:align>right</wp:align>
+                  </wp:positionH>
+                  <wp:positionV relativeFrom="paragraph">
+                    <wp:posOffset>204470</wp:posOffset>
+                  </wp:positionV>
+                  <wp:extent cx="7772400" cy="0"/>
+                  <wp:effectExtent l="0" t="19050" r="19050" b="19050"/>
+                  <wp:wrapNone/>
+                  <wp:docPr id="9901" name="Straight Connector 29"/>
+                  <wp:cNvGraphicFramePr/>
+                  <a:graphic xmlns:a="http://schemas.openxmlformats.org/drawingml/2006/main">
+                    <a:graphicData uri="http://schemas.microsoft.com/office/word/2010/wordprocessingShape">
+                      <wps:wsp>
+                        <wps:cNvCnPr/>
+                        <wps:spPr>
+                          <a:xfrm>
+                            <a:off x="0" y="0"/>
+                            <a:ext cx="7772400" cy="0"/>
+                          </a:xfrm>
+                          <a:prstGeom prst="line">
+                            <a:avLst/>
+                          </a:prstGeom>
+                          <a:ln w="38100"/>
+                        </wps:spPr>
+                        <wps:style>
+                          <a:lnRef idx="1">
+                            <a:schemeClr val="dk1"/>
+                          </a:lnRef>
+                          <a:fillRef idx="0">
+                            <a:schemeClr val="dk1"/>
+                          </a:fillRef>
+                          <a:effectRef idx="0">
+                            <a:schemeClr val="dk1"/>
+                          </a:effectRef>
+                          <a:fontRef idx="minor">
+                            <a:schemeClr val="tx1"/>
+                          </a:fontRef>
+                        </wps:style>
+                        <wps:bodyPr/>
+                      </wps:wsp>
+                    </a:graphicData>
+                  </a:graphic>
+                </wp:anchor>
+              </w:drawing>
+            </mc:Choice>
+            <mc:Fallback xmlns:wpsCustomData="http://www.wps.cn/officeDocument/2013/wpsCustomData">
+              <w:pict>
+                <v:line id="_x0000_s1026" o:spid="_x0000_s1026" o:spt="20" style="position:absolute;left:0pt;margin-top:16.1pt;height:0pt;width:612pt;mso-position-horizontal:right;mso-position-horizontal-relative:page;z-index:251663360;mso-width-relative:page;mso-height-relative:page;" filled="f" stroked="t" coordsize="21600,21600" o:gfxdata="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">
+                  <v:fill on="f" focussize="0,0"/>
+                  <v:stroke weight="3pt" color="#000000 [3200]" miterlimit="8" joinstyle="miter"/>
+                  <v:imagedata o:title=""/>
+                  <o:lock v:ext="edit" aspectratio="f"/>
+                </v:line>
+              </w:pict>
+            </mc:Fallback>
+          </mc:AlternateContent>
+        </w:r>
         <w:r>
           <w:rPr>
             <w:rFonts w:ascii="Courier New" w:hAnsi="Courier New" w:cs="Courier New"/>
@@ -10177,6 +10315,75 @@
         <w:r>
           <w:rPr>
             <w:rFonts w:ascii="Courier New" w:hAnsi="Courier New" w:cs="Courier New"/>
+            <w:noProof/>
+            <w:lang w:eastAsia="en-PH"/>
+          </w:rPr>
+          <mc:AlternateContent>
+            <mc:Choice Requires="wps">
+              <w:drawing>
+                <wp:anchor distT="0" distB="0" distL="114300" distR="114300" simplePos="0" relativeHeight="251643904" behindDoc="0" locked="0" layoutInCell="1" allowOverlap="1">
+                  <wp:simplePos x="0" y="0"/>
+                  <wp:positionH relativeFrom="page">
+                    <wp:align>right</wp:align>
+                  </wp:positionH>
+                  <wp:positionV relativeFrom="paragraph">
+                    <wp:posOffset>204470</wp:posOffset>
+                  </wp:positionV>
+                  <wp:extent cx="7772400" cy="0"/>
+                  <wp:effectExtent l="0" t="19050" r="19050" b="19050"/>
+                  <wp:wrapNone/>
+                  <wp:docPr id="9902" name="Straight Connector 29"/>
+                  <wp:cNvGraphicFramePr/>
+                  <a:graphic xmlns:a="http://schemas.openxmlformats.org/drawingml/2006/main">
+                    <a:graphicData uri="http://schemas.microsoft.com/office/word/2010/wordprocessingShape">
+                      <wps:wsp>
+                        <wps:cNvCnPr/>
+                        <wps:spPr>
+                          <a:xfrm>
+                            <a:off x="0" y="0"/>
+                            <a:ext cx="7772400" cy="0"/>
+                          </a:xfrm>
+                          <a:prstGeom prst="line">
+                            <a:avLst/>
+                          </a:prstGeom>
+                          <a:ln w="38100"/>
+                        </wps:spPr>
+                        <wps:style>
+                          <a:lnRef idx="1">
+                            <a:schemeClr val="dk1"/>
+                          </a:lnRef>
+                          <a:fillRef idx="0">
+                            <a:schemeClr val="dk1"/>
+                          </a:fillRef>
+                          <a:effectRef idx="0">
+                            <a:schemeClr val="dk1"/>
+                          </a:effectRef>
+                          <a:fontRef idx="minor">
+                            <a:schemeClr val="tx1"/>
+                          </a:fontRef>
+                        </wps:style>
+                        <wps:bodyPr/>
+                      </wps:wsp>
+                    </a:graphicData>
+                  </a:graphic>
+                </wp:anchor>
+              </w:drawing>
+            </mc:Choice>
+            <mc:Fallback xmlns:wpsCustomData="http://www.wps.cn/officeDocument/2013/wpsCustomData">
+              <w:pict>
+                <v:line id="_x0000_s1026" o:spid="_x0000_s1026" o:spt="20" style="position:absolute;left:0pt;margin-top:16.1pt;height:0pt;width:612pt;mso-position-horizontal:right;mso-position-horizontal-relative:page;z-index:251663360;mso-width-relative:page;mso-height-relative:page;" filled="f" stroked="t" coordsize="21600,21600" o:gfxdata="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">
+                  <v:fill on="f" focussize="0,0"/>
+                  <v:stroke weight="3pt" color="#000000 [3200]" miterlimit="8" joinstyle="miter"/>
+                  <v:imagedata o:title=""/>
+                  <o:lock v:ext="edit" aspectratio="f"/>
+                </v:line>
+              </w:pict>
+            </mc:Fallback>
+          </mc:AlternateContent>
+        </w:r>
+        <w:r>
+          <w:rPr>
+            <w:rFonts w:ascii="Courier New" w:hAnsi="Courier New" w:cs="Courier New"/>
             <w:color w:val="7F7F7F" w:themeColor="background1" w:themeShade="7F"/>
             <w:spacing w:val="60"/>
             <w:sz w:val="20"/>
@@ -10621,6 +10828,75 @@
             <w:rFonts w:ascii="Courier New" w:hAnsi="Courier New" w:cs="Courier New"/>
           </w:rPr>
         </w:pPr>
+        <w:r>
+          <w:rPr>
+            <w:rFonts w:ascii="Courier New" w:hAnsi="Courier New" w:cs="Courier New"/>
+            <w:noProof/>
+            <w:lang w:eastAsia="en-PH"/>
+          </w:rPr>
+          <mc:AlternateContent>
+            <mc:Choice Requires="wps">
+              <w:drawing>
+                <wp:anchor distT="0" distB="0" distL="114300" distR="114300" simplePos="0" relativeHeight="251643904" behindDoc="0" locked="0" layoutInCell="1" allowOverlap="1">
+                  <wp:simplePos x="0" y="0"/>
+                  <wp:positionH relativeFrom="page">
+                    <wp:align>right</wp:align>
+                  </wp:positionH>
+                  <wp:positionV relativeFrom="paragraph">
+                    <wp:posOffset>204470</wp:posOffset>
+                  </wp:positionV>
+                  <wp:extent cx="7772400" cy="0"/>
+                  <wp:effectExtent l="0" t="19050" r="19050" b="19050"/>
+                  <wp:wrapNone/>
+                  <wp:docPr id="9903" name="Straight Connector 29"/>
+                  <wp:cNvGraphicFramePr/>
+                  <a:graphic xmlns:a="http://schemas.openxmlformats.org/drawingml/2006/main">
+                    <a:graphicData uri="http://schemas.microsoft.com/office/word/2010/wordprocessingShape">
+                      <wps:wsp>
+                        <wps:cNvCnPr/>
+                        <wps:spPr>
+                          <a:xfrm>
+                            <a:off x="0" y="0"/>
+                            <a:ext cx="7772400" cy="0"/>
+                          </a:xfrm>
+                          <a:prstGeom prst="line">
+                            <a:avLst/>
+                          </a:prstGeom>
+                          <a:ln w="38100"/>
+                        </wps:spPr>
+                        <wps:style>
+                          <a:lnRef idx="1">
+                            <a:schemeClr val="dk1"/>
+                          </a:lnRef>
+                          <a:fillRef idx="0">
+                            <a:schemeClr val="dk1"/>
+                          </a:fillRef>
+                          <a:effectRef idx="0">
+                            <a:schemeClr val="dk1"/>
+                          </a:effectRef>
+                          <a:fontRef idx="minor">
+                            <a:schemeClr val="tx1"/>
+                          </a:fontRef>
+                        </wps:style>
+                        <wps:bodyPr/>
+                      </wps:wsp>
+                    </a:graphicData>
+                  </a:graphic>
+                </wp:anchor>
+              </w:drawing>
+            </mc:Choice>
+            <mc:Fallback xmlns:wpsCustomData="http://www.wps.cn/officeDocument/2013/wpsCustomData">
+              <w:pict>
+                <v:line id="_x0000_s1026" o:spid="_x0000_s1026" o:spt="20" style="position:absolute;left:0pt;margin-top:16.1pt;height:0pt;width:612pt;mso-position-horizontal:right;mso-position-horizontal-relative:page;z-index:251663360;mso-width-relative:page;mso-height-relative:page;" filled="f" stroked="t" coordsize="21600,21600" o:gfxdata="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">
+                  <v:fill on="f" focussize="0,0"/>
+                  <v:stroke weight="3pt" color="#000000 [3200]" miterlimit="8" joinstyle="miter"/>
+                  <v:imagedata o:title=""/>
+                  <o:lock v:ext="edit" aspectratio="f"/>
+                </v:line>
+              </w:pict>
+            </mc:Fallback>
+          </mc:AlternateContent>
+        </w:r>
       </w:p>
     </w:sdtContent>
   </w:sdt>
@@ -11026,6 +11302,75 @@
         <w:r>
           <w:rPr>
             <w:rFonts w:ascii="Courier New" w:hAnsi="Courier New" w:cs="Courier New"/>
+            <w:noProof/>
+            <w:lang w:eastAsia="en-PH"/>
+          </w:rPr>
+          <mc:AlternateContent>
+            <mc:Choice Requires="wps">
+              <w:drawing>
+                <wp:anchor distT="0" distB="0" distL="114300" distR="114300" simplePos="0" relativeHeight="251643904" behindDoc="0" locked="0" layoutInCell="1" allowOverlap="1">
+                  <wp:simplePos x="0" y="0"/>
+                  <wp:positionH relativeFrom="page">
+                    <wp:align>right</wp:align>
+                  </wp:positionH>
+                  <wp:positionV relativeFrom="paragraph">
+                    <wp:posOffset>204470</wp:posOffset>
+                  </wp:positionV>
+                  <wp:extent cx="7772400" cy="0"/>
+                  <wp:effectExtent l="0" t="19050" r="19050" b="19050"/>
+                  <wp:wrapNone/>
+                  <wp:docPr id="9904" name="Straight Connector 29"/>
+                  <wp:cNvGraphicFramePr/>
+                  <a:graphic xmlns:a="http://schemas.openxmlformats.org/drawingml/2006/main">
+                    <a:graphicData uri="http://schemas.microsoft.com/office/word/2010/wordprocessingShape">
+                      <wps:wsp>
+                        <wps:cNvCnPr/>
+                        <wps:spPr>
+                          <a:xfrm>
+                            <a:off x="0" y="0"/>
+                            <a:ext cx="7772400" cy="0"/>
+                          </a:xfrm>
+                          <a:prstGeom prst="line">
+                            <a:avLst/>
+                          </a:prstGeom>
+                          <a:ln w="38100"/>
+                        </wps:spPr>
+                        <wps:style>
+                          <a:lnRef idx="1">
+                            <a:schemeClr val="dk1"/>
+                          </a:lnRef>
+                          <a:fillRef idx="0">
+                            <a:schemeClr val="dk1"/>
+                          </a:fillRef>
+                          <a:effectRef idx="0">
+                            <a:schemeClr val="dk1"/>
+                          </a:effectRef>
+                          <a:fontRef idx="minor">
+                            <a:schemeClr val="tx1"/>
+                          </a:fontRef>
+                        </wps:style>
+                        <wps:bodyPr/>
+                      </wps:wsp>
+                    </a:graphicData>
+                  </a:graphic>
+                </wp:anchor>
+              </w:drawing>
+            </mc:Choice>
+            <mc:Fallback xmlns:wpsCustomData="http://www.wps.cn/officeDocument/2013/wpsCustomData">
+              <w:pict>
+                <v:line id="_x0000_s1026" o:spid="_x0000_s1026" o:spt="20" style="position:absolute;left:0pt;margin-top:16.1pt;height:0pt;width:612pt;mso-position-horizontal:right;mso-position-horizontal-relative:page;z-index:251663360;mso-width-relative:page;mso-height-relative:page;" filled="f" stroked="t" coordsize="21600,21600" o:gfxdata="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">
+                  <v:fill on="f" focussize="0,0"/>
+                  <v:stroke weight="3pt" color="#000000 [3200]" miterlimit="8" joinstyle="miter"/>
+                  <v:imagedata o:title=""/>
+                  <o:lock v:ext="edit" aspectratio="f"/>
+                </v:line>
+              </w:pict>
+            </mc:Fallback>
+          </mc:AlternateContent>
+        </w:r>
+        <w:r>
+          <w:rPr>
+            <w:rFonts w:ascii="Courier New" w:hAnsi="Courier New" w:cs="Courier New"/>
             <w:sz w:val="20"/>
             <w:szCs w:val="20"/>
           </w:rPr>
@@ -11472,6 +11817,75 @@
         <w:r>
           <w:rPr>
             <w:rFonts w:ascii="Courier New" w:hAnsi="Courier New" w:cs="Courier New"/>
+            <w:noProof/>
+            <w:lang w:eastAsia="en-PH"/>
+          </w:rPr>
+          <mc:AlternateContent>
+            <mc:Choice Requires="wps">
+              <w:drawing>
+                <wp:anchor distT="0" distB="0" distL="114300" distR="114300" simplePos="0" relativeHeight="251643904" behindDoc="0" locked="0" layoutInCell="1" allowOverlap="1">
+                  <wp:simplePos x="0" y="0"/>
+                  <wp:positionH relativeFrom="page">
+                    <wp:align>right</wp:align>
+                  </wp:positionH>
+                  <wp:positionV relativeFrom="paragraph">
+                    <wp:posOffset>204470</wp:posOffset>
+                  </wp:positionV>
+                  <wp:extent cx="7772400" cy="0"/>
+                  <wp:effectExtent l="0" t="19050" r="19050" b="19050"/>
+                  <wp:wrapNone/>
+                  <wp:docPr id="9905" name="Straight Connector 29"/>
+                  <wp:cNvGraphicFramePr/>
+                  <a:graphic xmlns:a="http://schemas.openxmlformats.org/drawingml/2006/main">
+                    <a:graphicData uri="http://schemas.microsoft.com/office/word/2010/wordprocessingShape">
+                      <wps:wsp>
+                        <wps:cNvCnPr/>
+                        <wps:spPr>
+                          <a:xfrm>
+                            <a:off x="0" y="0"/>
+                            <a:ext cx="7772400" cy="0"/>
+                          </a:xfrm>
+                          <a:prstGeom prst="line">
+                            <a:avLst/>
+                          </a:prstGeom>
+                          <a:ln w="38100"/>
+                        </wps:spPr>
+                        <wps:style>
+                          <a:lnRef idx="1">
+                            <a:schemeClr val="dk1"/>
+                          </a:lnRef>
+                          <a:fillRef idx="0">
+                            <a:schemeClr val="dk1"/>
+                          </a:fillRef>
+                          <a:effectRef idx="0">
+                            <a:schemeClr val="dk1"/>
+                          </a:effectRef>
+                          <a:fontRef idx="minor">
+                            <a:schemeClr val="tx1"/>
+                          </a:fontRef>
+                        </wps:style>
+                        <wps:bodyPr/>
+                      </wps:wsp>
+                    </a:graphicData>
+                  </a:graphic>
+                </wp:anchor>
+              </w:drawing>
+            </mc:Choice>
+            <mc:Fallback xmlns:wpsCustomData="http://www.wps.cn/officeDocument/2013/wpsCustomData">
+              <w:pict>
+                <v:line id="_x0000_s1026" o:spid="_x0000_s1026" o:spt="20" style="position:absolute;left:0pt;margin-top:16.1pt;height:0pt;width:612pt;mso-position-horizontal:right;mso-position-horizontal-relative:page;z-index:251663360;mso-width-relative:page;mso-height-relative:page;" filled="f" stroked="t" coordsize="21600,21600" o:gfxdata="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">
+                  <v:fill on="f" focussize="0,0"/>
+                  <v:stroke weight="3pt" color="#000000 [3200]" miterlimit="8" joinstyle="miter"/>
+                  <v:imagedata o:title=""/>
+                  <o:lock v:ext="edit" aspectratio="f"/>
+                </v:line>
+              </w:pict>
+            </mc:Fallback>
+          </mc:AlternateContent>
+        </w:r>
+        <w:r>
+          <w:rPr>
+            <w:rFonts w:ascii="Courier New" w:hAnsi="Courier New" w:cs="Courier New"/>
             <w:sz w:val="24"/>
           </w:rPr>
           <w:tab/>
@@ -11892,6 +12306,75 @@
         <w:r>
           <w:rPr>
             <w:rFonts w:ascii="Courier New" w:hAnsi="Courier New" w:cs="Courier New"/>
+            <w:noProof/>
+            <w:lang w:eastAsia="en-PH"/>
+          </w:rPr>
+          <mc:AlternateContent>
+            <mc:Choice Requires="wps">
+              <w:drawing>
+                <wp:anchor distT="0" distB="0" distL="114300" distR="114300" simplePos="0" relativeHeight="251643904" behindDoc="0" locked="0" layoutInCell="1" allowOverlap="1">
+                  <wp:simplePos x="0" y="0"/>
+                  <wp:positionH relativeFrom="page">
+                    <wp:align>right</wp:align>
+                  </wp:positionH>
+                  <wp:positionV relativeFrom="paragraph">
+                    <wp:posOffset>204470</wp:posOffset>
+                  </wp:positionV>
+                  <wp:extent cx="7772400" cy="0"/>
+                  <wp:effectExtent l="0" t="19050" r="19050" b="19050"/>
+                  <wp:wrapNone/>
+                  <wp:docPr id="9906" name="Straight Connector 29"/>
+                  <wp:cNvGraphicFramePr/>
+                  <a:graphic xmlns:a="http://schemas.openxmlformats.org/drawingml/2006/main">
+                    <a:graphicData uri="http://schemas.microsoft.com/office/word/2010/wordprocessingShape">
+                      <wps:wsp>
+                        <wps:cNvCnPr/>
+                        <wps:spPr>
+                          <a:xfrm>
+                            <a:off x="0" y="0"/>
+                            <a:ext cx="7772400" cy="0"/>
+                          </a:xfrm>
+                          <a:prstGeom prst="line">
+                            <a:avLst/>
+                          </a:prstGeom>
+                          <a:ln w="38100"/>
+                        </wps:spPr>
+                        <wps:style>
+                          <a:lnRef idx="1">
+                            <a:schemeClr val="dk1"/>
+                          </a:lnRef>
+                          <a:fillRef idx="0">
+                            <a:schemeClr val="dk1"/>
+                          </a:fillRef>
+                          <a:effectRef idx="0">
+                            <a:schemeClr val="dk1"/>
+                          </a:effectRef>
+                          <a:fontRef idx="minor">
+                            <a:schemeClr val="tx1"/>
+                          </a:fontRef>
+                        </wps:style>
+                        <wps:bodyPr/>
+                      </wps:wsp>
+                    </a:graphicData>
+                  </a:graphic>
+                </wp:anchor>
+              </w:drawing>
+            </mc:Choice>
+            <mc:Fallback xmlns:wpsCustomData="http://www.wps.cn/officeDocument/2013/wpsCustomData">
+              <w:pict>
+                <v:line id="_x0000_s1026" o:spid="_x0000_s1026" o:spt="20" style="position:absolute;left:0pt;margin-top:16.1pt;height:0pt;width:612pt;mso-position-horizontal:right;mso-position-horizontal-relative:page;z-index:251663360;mso-width-relative:page;mso-height-relative:page;" filled="f" stroked="t" coordsize="21600,21600" o:gfxdata="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">
+                  <v:fill on="f" focussize="0,0"/>
+                  <v:stroke weight="3pt" color="#000000 [3200]" miterlimit="8" joinstyle="miter"/>
+                  <v:imagedata o:title=""/>
+                  <o:lock v:ext="edit" aspectratio="f"/>
+                </v:line>
+              </w:pict>
+            </mc:Fallback>
+          </mc:AlternateContent>
+        </w:r>
+        <w:r>
+          <w:rPr>
+            <w:rFonts w:ascii="Courier New" w:hAnsi="Courier New" w:cs="Courier New"/>
             <w:color w:val="7F7F7F" w:themeColor="background1" w:themeShade="7F"/>
             <w:spacing w:val="60"/>
             <w:sz w:val="20"/>
@@ -12337,6 +12820,75 @@
             <w:sz w:val="24"/>
           </w:rPr>
         </w:pPr>
+        <w:r>
+          <w:rPr>
+            <w:rFonts w:ascii="Courier New" w:hAnsi="Courier New" w:cs="Courier New"/>
+            <w:noProof/>
+            <w:lang w:eastAsia="en-PH"/>
+          </w:rPr>
+          <mc:AlternateContent>
+            <mc:Choice Requires="wps">
+              <w:drawing>
+                <wp:anchor distT="0" distB="0" distL="114300" distR="114300" simplePos="0" relativeHeight="251643904" behindDoc="0" locked="0" layoutInCell="1" allowOverlap="1">
+                  <wp:simplePos x="0" y="0"/>
+                  <wp:positionH relativeFrom="page">
+                    <wp:align>right</wp:align>
+                  </wp:positionH>
+                  <wp:positionV relativeFrom="paragraph">
+                    <wp:posOffset>204470</wp:posOffset>
+                  </wp:positionV>
+                  <wp:extent cx="7772400" cy="0"/>
+                  <wp:effectExtent l="0" t="19050" r="19050" b="19050"/>
+                  <wp:wrapNone/>
+                  <wp:docPr id="9907" name="Straight Connector 29"/>
+                  <wp:cNvGraphicFramePr/>
+                  <a:graphic xmlns:a="http://schemas.openxmlformats.org/drawingml/2006/main">
+                    <a:graphicData uri="http://schemas.microsoft.com/office/word/2010/wordprocessingShape">
+                      <wps:wsp>
+                        <wps:cNvCnPr/>
+                        <wps:spPr>
+                          <a:xfrm>
+                            <a:off x="0" y="0"/>
+                            <a:ext cx="7772400" cy="0"/>
+                          </a:xfrm>
+                          <a:prstGeom prst="line">
+                            <a:avLst/>
+                          </a:prstGeom>
+                          <a:ln w="38100"/>
+                        </wps:spPr>
+                        <wps:style>
+                          <a:lnRef idx="1">
+                            <a:schemeClr val="dk1"/>
+                          </a:lnRef>
+                          <a:fillRef idx="0">
+                            <a:schemeClr val="dk1"/>
+                          </a:fillRef>
+                          <a:effectRef idx="0">
+                            <a:schemeClr val="dk1"/>
+                          </a:effectRef>
+                          <a:fontRef idx="minor">
+                            <a:schemeClr val="tx1"/>
+                          </a:fontRef>
+                        </wps:style>
+                        <wps:bodyPr/>
+                      </wps:wsp>
+                    </a:graphicData>
+                  </a:graphic>
+                </wp:anchor>
+              </w:drawing>
+            </mc:Choice>
+            <mc:Fallback xmlns:wpsCustomData="http://www.wps.cn/officeDocument/2013/wpsCustomData">
+              <w:pict>
+                <v:line id="_x0000_s1026" o:spid="_x0000_s1026" o:spt="20" style="position:absolute;left:0pt;margin-top:16.1pt;height:0pt;width:612pt;mso-position-horizontal:right;mso-position-horizontal-relative:page;z-index:251663360;mso-width-relative:page;mso-height-relative:page;" filled="f" stroked="t" coordsize="21600,21600" o:gfxdata="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">
+                  <v:fill on="f" focussize="0,0"/>
+                  <v:stroke weight="3pt" color="#000000 [3200]" miterlimit="8" joinstyle="miter"/>
+                  <v:imagedata o:title=""/>
+                  <o:lock v:ext="edit" aspectratio="f"/>
+                </v:line>
+              </w:pict>
+            </mc:Fallback>
+          </mc:AlternateContent>
+        </w:r>
         <w:r>
           <w:rPr>
             <w:rFonts w:ascii="Courier New" w:hAnsi="Courier New" w:cs="Courier New"/>

</xml_diff>